<commit_message>
Atualização do doc RAP
</commit_message>
<xml_diff>
--- a/doc/Relatorio de Atividades RAP.docx
+++ b/doc/Relatorio de Atividades RAP.docx
@@ -576,21 +576,7 @@
                               <w:rPr>
                                 <w:rFonts w:ascii="Arial" w:hAnsi="Arial" w:cs="Arial"/>
                               </w:rPr>
-                              <w:t xml:space="preserve">: </w:t>
-                            </w:r>
-                            <w:proofErr w:type="gramStart"/>
-                            <w:r>
-                              <w:rPr>
-                                <w:rFonts w:ascii="Arial" w:hAnsi="Arial" w:cs="Arial"/>
-                              </w:rPr>
-                              <w:t>Pratica</w:t>
-                            </w:r>
-                            <w:proofErr w:type="gramEnd"/>
-                            <w:r>
-                              <w:rPr>
-                                <w:rFonts w:ascii="Arial" w:hAnsi="Arial" w:cs="Arial"/>
-                              </w:rPr>
-                              <w:t xml:space="preserve"> Profissional Supervisionada – Projeto de Sistemas Computacionais Web</w:t>
+                              <w:t>: Pratica Profissional Supervisionada – Projeto de Sistemas Computacionais Web</w:t>
                             </w:r>
                             <w:r>
                               <w:rPr>
@@ -4319,7 +4305,19 @@
         <w:rPr>
           <w:rFonts w:ascii="Arial" w:hAnsi="Arial" w:cs="Arial"/>
         </w:rPr>
-        <w:t>/5.0/&gt;. Acesso em: 17 ago. 2026.</w:t>
+        <w:t>/5.0/&gt;. Acesso em: 1</w:t>
+      </w:r>
+      <w:r>
+        <w:rPr>
+          <w:rFonts w:ascii="Arial" w:hAnsi="Arial" w:cs="Arial"/>
+        </w:rPr>
+        <w:t>0</w:t>
+      </w:r>
+      <w:r>
+        <w:rPr>
+          <w:rFonts w:ascii="Arial" w:hAnsi="Arial" w:cs="Arial"/>
+        </w:rPr>
+        <w:t xml:space="preserve"> ago. 2026.</w:t>
       </w:r>
     </w:p>
     <w:p>
@@ -4381,7 +4379,19 @@
         <w:rPr>
           <w:rFonts w:ascii="Arial" w:hAnsi="Arial" w:cs="Arial"/>
         </w:rPr>
-        <w:t>/&gt;. Acesso em: 17 ago. 2026.</w:t>
+        <w:t>/&gt;. Acesso em: 1</w:t>
+      </w:r>
+      <w:r>
+        <w:rPr>
+          <w:rFonts w:ascii="Arial" w:hAnsi="Arial" w:cs="Arial"/>
+        </w:rPr>
+        <w:t xml:space="preserve">2 </w:t>
+      </w:r>
+      <w:r>
+        <w:rPr>
+          <w:rFonts w:ascii="Arial" w:hAnsi="Arial" w:cs="Arial"/>
+        </w:rPr>
+        <w:t>ago. 2026.</w:t>
       </w:r>
     </w:p>
     <w:p>
@@ -4444,7 +4454,19 @@
         <w:rPr>
           <w:rFonts w:ascii="Arial" w:hAnsi="Arial" w:cs="Arial"/>
         </w:rPr>
-        <w:t>. Acesso em: 17 ago. 2026.</w:t>
+        <w:t>. Acesso em: 1</w:t>
+      </w:r>
+      <w:r>
+        <w:rPr>
+          <w:rFonts w:ascii="Arial" w:hAnsi="Arial" w:cs="Arial"/>
+        </w:rPr>
+        <w:t>3</w:t>
+      </w:r>
+      <w:r>
+        <w:rPr>
+          <w:rFonts w:ascii="Arial" w:hAnsi="Arial" w:cs="Arial"/>
+        </w:rPr>
+        <w:t xml:space="preserve"> ago. 2026.</w:t>
       </w:r>
     </w:p>
     <w:p>
@@ -4525,7 +4547,19 @@
         <w:rPr>
           <w:rFonts w:ascii="Arial" w:hAnsi="Arial" w:cs="Arial"/>
         </w:rPr>
-        <w:t>. Acesso em: 17 ago. 2026.</w:t>
+        <w:t>. Acesso em: 1</w:t>
+      </w:r>
+      <w:r>
+        <w:rPr>
+          <w:rFonts w:ascii="Arial" w:hAnsi="Arial" w:cs="Arial"/>
+        </w:rPr>
+        <w:t>4</w:t>
+      </w:r>
+      <w:r>
+        <w:rPr>
+          <w:rFonts w:ascii="Arial" w:hAnsi="Arial" w:cs="Arial"/>
+        </w:rPr>
+        <w:t xml:space="preserve"> ago. 2026.</w:t>
       </w:r>
     </w:p>
     <w:p>
@@ -4656,7 +4690,19 @@
         <w:rPr>
           <w:rFonts w:ascii="Arial" w:hAnsi="Arial" w:cs="Arial"/>
         </w:rPr>
-        <w:t>. Acesso em: 17 ago. 2026.</w:t>
+        <w:t>. Acesso em: 1</w:t>
+      </w:r>
+      <w:r>
+        <w:rPr>
+          <w:rFonts w:ascii="Arial" w:hAnsi="Arial" w:cs="Arial"/>
+        </w:rPr>
+        <w:t>8</w:t>
+      </w:r>
+      <w:r>
+        <w:rPr>
+          <w:rFonts w:ascii="Arial" w:hAnsi="Arial" w:cs="Arial"/>
+        </w:rPr>
+        <w:t xml:space="preserve"> ago. 2026.</w:t>
       </w:r>
     </w:p>
     <w:p>
@@ -4709,7 +4755,19 @@
         <w:rPr>
           <w:rFonts w:ascii="Arial" w:hAnsi="Arial" w:cs="Arial"/>
         </w:rPr>
-        <w:t>. Acesso em: 17 ago. 2026.</w:t>
+        <w:t>. Acesso em: 1</w:t>
+      </w:r>
+      <w:r>
+        <w:rPr>
+          <w:rFonts w:ascii="Arial" w:hAnsi="Arial" w:cs="Arial"/>
+        </w:rPr>
+        <w:t>9</w:t>
+      </w:r>
+      <w:r>
+        <w:rPr>
+          <w:rFonts w:ascii="Arial" w:hAnsi="Arial" w:cs="Arial"/>
+        </w:rPr>
+        <w:t xml:space="preserve"> ago. 2026.</w:t>
       </w:r>
     </w:p>
     <w:p>
@@ -4790,7 +4848,19 @@
         <w:rPr>
           <w:rFonts w:ascii="Arial" w:hAnsi="Arial" w:cs="Arial"/>
         </w:rPr>
-        <w:t>. Acesso em: 17 ago. 2026.</w:t>
+        <w:t>. Acesso em: 1</w:t>
+      </w:r>
+      <w:r>
+        <w:rPr>
+          <w:rFonts w:ascii="Arial" w:hAnsi="Arial" w:cs="Arial"/>
+        </w:rPr>
+        <w:t>9</w:t>
+      </w:r>
+      <w:r>
+        <w:rPr>
+          <w:rFonts w:ascii="Arial" w:hAnsi="Arial" w:cs="Arial"/>
+        </w:rPr>
+        <w:t xml:space="preserve"> ago. 2026.</w:t>
       </w:r>
     </w:p>
     <w:p>
@@ -8849,6 +8919,7 @@
   <w:style w:type="character" w:default="1" w:styleId="Fontepargpadro">
     <w:name w:val="Default Paragraph Font"/>
     <w:uiPriority w:val="1"/>
+    <w:semiHidden/>
     <w:unhideWhenUsed/>
   </w:style>
   <w:style w:type="table" w:default="1" w:styleId="Tabelanormal">

</xml_diff>

<commit_message>
versao atualizada do RAP
</commit_message>
<xml_diff>
--- a/doc/Relatorio de Atividades RAP.docx
+++ b/doc/Relatorio de Atividades RAP.docx
@@ -653,21 +653,7 @@
                         <w:rPr>
                           <w:rFonts w:ascii="Arial" w:hAnsi="Arial" w:cs="Arial"/>
                         </w:rPr>
-                        <w:t xml:space="preserve">: </w:t>
-                      </w:r>
-                      <w:proofErr w:type="gramStart"/>
-                      <w:r>
-                        <w:rPr>
-                          <w:rFonts w:ascii="Arial" w:hAnsi="Arial" w:cs="Arial"/>
-                        </w:rPr>
-                        <w:t>Pratica</w:t>
-                      </w:r>
-                      <w:proofErr w:type="gramEnd"/>
-                      <w:r>
-                        <w:rPr>
-                          <w:rFonts w:ascii="Arial" w:hAnsi="Arial" w:cs="Arial"/>
-                        </w:rPr>
-                        <w:t xml:space="preserve"> Profissional Supervisionada – Projeto de Sistemas Computacionais Web</w:t>
+                        <w:t>: Pratica Profissional Supervisionada – Projeto de Sistemas Computacionais Web</w:t>
                       </w:r>
                       <w:r>
                         <w:rPr>
@@ -849,57 +835,1720 @@
           <w:rFonts w:ascii="Arial" w:hAnsi="Arial" w:cs="Arial"/>
         </w:rPr>
       </w:pPr>
-      <w:r>
-        <w:rPr>
-          <w:rFonts w:ascii="Arial" w:hAnsi="Arial" w:cs="Arial"/>
-        </w:rPr>
-        <w:br/>
-      </w:r>
-      <w:r>
-        <w:rPr>
-          <w:rFonts w:ascii="Arial" w:hAnsi="Arial" w:cs="Arial"/>
-        </w:rPr>
-        <w:br/>
-      </w:r>
-      <w:r>
-        <w:rPr>
-          <w:rFonts w:ascii="Arial" w:hAnsi="Arial" w:cs="Arial"/>
-        </w:rPr>
-        <w:br/>
-      </w:r>
-    </w:p>
-    <w:p>
-      <w:pPr>
-        <w:rPr>
-          <w:rFonts w:ascii="Arial" w:hAnsi="Arial" w:cs="Arial"/>
-        </w:rPr>
-      </w:pPr>
-    </w:p>
-    <w:p>
-      <w:pPr>
-        <w:rPr>
-          <w:rFonts w:ascii="Arial" w:hAnsi="Arial" w:cs="Arial"/>
-        </w:rPr>
-      </w:pPr>
-    </w:p>
-    <w:p>
-      <w:pPr>
+    </w:p>
+    <w:p>
+      <w:pPr>
+        <w:rPr>
+          <w:rFonts w:ascii="Arial" w:hAnsi="Arial" w:cs="Arial"/>
+        </w:rPr>
+      </w:pPr>
+    </w:p>
+    <w:p>
+      <w:pPr>
+        <w:rPr>
+          <w:rFonts w:ascii="Arial" w:hAnsi="Arial" w:cs="Arial"/>
+        </w:rPr>
+      </w:pPr>
+    </w:p>
+    <w:p>
+      <w:pPr>
+        <w:rPr>
+          <w:rFonts w:ascii="Arial" w:hAnsi="Arial" w:cs="Arial"/>
+        </w:rPr>
+      </w:pPr>
+    </w:p>
+    <w:p>
+      <w:pPr>
+        <w:rPr>
+          <w:rFonts w:ascii="Arial" w:hAnsi="Arial" w:cs="Arial"/>
+        </w:rPr>
+      </w:pPr>
+    </w:p>
+    <w:p>
+      <w:pPr>
+        <w:rPr>
+          <w:rFonts w:ascii="Arial" w:hAnsi="Arial" w:cs="Arial"/>
+        </w:rPr>
+      </w:pPr>
+    </w:p>
+    <w:sdt>
+      <w:sdtPr>
+        <w:id w:val="20058746"/>
+        <w:docPartObj>
+          <w:docPartGallery w:val="Table of Contents"/>
+          <w:docPartUnique/>
+        </w:docPartObj>
+      </w:sdtPr>
+      <w:sdtEndPr>
+        <w:rPr>
+          <w:rFonts w:asciiTheme="minorHAnsi" w:eastAsiaTheme="minorHAnsi" w:hAnsiTheme="minorHAnsi" w:cstheme="minorBidi"/>
+          <w:b/>
+          <w:bCs/>
+          <w:color w:val="auto"/>
+          <w:kern w:val="2"/>
+          <w:sz w:val="24"/>
+          <w:szCs w:val="24"/>
+          <w:lang w:eastAsia="en-US"/>
+          <w14:ligatures w14:val="standardContextual"/>
+        </w:rPr>
+      </w:sdtEndPr>
+      <w:sdtContent>
+        <w:p>
+          <w:pPr>
+            <w:pStyle w:val="CabealhodoSumrio"/>
+            <w:rPr>
+              <w:rFonts w:ascii="Arial" w:hAnsi="Arial" w:cs="Arial"/>
+              <w:b/>
+              <w:bCs/>
+              <w:color w:val="auto"/>
+              <w:sz w:val="24"/>
+              <w:szCs w:val="24"/>
+            </w:rPr>
+          </w:pPr>
+          <w:r>
+            <w:rPr>
+              <w:rFonts w:ascii="Arial" w:hAnsi="Arial" w:cs="Arial"/>
+              <w:b/>
+              <w:bCs/>
+              <w:color w:val="auto"/>
+              <w:sz w:val="24"/>
+              <w:szCs w:val="24"/>
+            </w:rPr>
+            <w:t>SUMÁRIO</w:t>
+          </w:r>
+        </w:p>
+        <w:p>
+          <w:pPr>
+            <w:rPr>
+              <w:lang w:eastAsia="pt-BR"/>
+            </w:rPr>
+          </w:pPr>
+        </w:p>
+        <w:p>
+          <w:pPr>
+            <w:pStyle w:val="Sumrio1"/>
+            <w:tabs>
+              <w:tab w:val="left" w:pos="480"/>
+              <w:tab w:val="right" w:leader="dot" w:pos="9061"/>
+            </w:tabs>
+            <w:rPr>
+              <w:rFonts w:eastAsiaTheme="minorEastAsia"/>
+              <w:noProof/>
+              <w:lang w:eastAsia="pt-BR"/>
+            </w:rPr>
+          </w:pPr>
+          <w:r>
+            <w:fldChar w:fldCharType="begin"/>
+          </w:r>
+          <w:r>
+            <w:instrText xml:space="preserve"> TOC \o "1-3" \h \z \u </w:instrText>
+          </w:r>
+          <w:r>
+            <w:fldChar w:fldCharType="separate"/>
+          </w:r>
+          <w:hyperlink w:anchor="_Toc238133364" w:history="1">
+            <w:r>
+              <w:rPr>
+                <w:rStyle w:val="Hyperlink"/>
+                <w:rFonts w:ascii="Arial" w:hAnsi="Arial" w:cs="Arial"/>
+                <w:b/>
+                <w:bCs/>
+                <w:noProof/>
+              </w:rPr>
+              <w:t>1.</w:t>
+            </w:r>
+            <w:r>
+              <w:rPr>
+                <w:rFonts w:eastAsiaTheme="minorEastAsia"/>
+                <w:noProof/>
+                <w:lang w:eastAsia="pt-BR"/>
+              </w:rPr>
+              <w:tab/>
+            </w:r>
+            <w:r>
+              <w:rPr>
+                <w:rStyle w:val="Hyperlink"/>
+                <w:rFonts w:ascii="Arial" w:hAnsi="Arial" w:cs="Arial"/>
+                <w:b/>
+                <w:bCs/>
+                <w:noProof/>
+              </w:rPr>
+              <w:t>INTRODUÇÃO</w:t>
+            </w:r>
+            <w:r>
+              <w:rPr>
+                <w:noProof/>
+                <w:webHidden/>
+              </w:rPr>
+              <w:tab/>
+            </w:r>
+            <w:r>
+              <w:rPr>
+                <w:noProof/>
+                <w:webHidden/>
+              </w:rPr>
+              <w:fldChar w:fldCharType="begin"/>
+            </w:r>
+            <w:r>
+              <w:rPr>
+                <w:noProof/>
+                <w:webHidden/>
+              </w:rPr>
+              <w:instrText xml:space="preserve"> PAGEREF _Toc238133364 \h </w:instrText>
+            </w:r>
+            <w:r>
+              <w:rPr>
+                <w:noProof/>
+                <w:webHidden/>
+              </w:rPr>
+            </w:r>
+            <w:r>
+              <w:rPr>
+                <w:noProof/>
+                <w:webHidden/>
+              </w:rPr>
+              <w:fldChar w:fldCharType="separate"/>
+            </w:r>
+            <w:r>
+              <w:rPr>
+                <w:noProof/>
+                <w:webHidden/>
+              </w:rPr>
+              <w:t>5</w:t>
+            </w:r>
+            <w:r>
+              <w:rPr>
+                <w:noProof/>
+                <w:webHidden/>
+              </w:rPr>
+              <w:fldChar w:fldCharType="end"/>
+            </w:r>
+          </w:hyperlink>
+        </w:p>
+        <w:p>
+          <w:pPr>
+            <w:pStyle w:val="Sumrio2"/>
+            <w:tabs>
+              <w:tab w:val="right" w:leader="dot" w:pos="9061"/>
+            </w:tabs>
+            <w:rPr>
+              <w:rFonts w:eastAsiaTheme="minorEastAsia"/>
+              <w:noProof/>
+              <w:lang w:eastAsia="pt-BR"/>
+            </w:rPr>
+          </w:pPr>
+          <w:hyperlink w:anchor="_Toc238133365" w:history="1">
+            <w:r>
+              <w:rPr>
+                <w:rStyle w:val="Hyperlink"/>
+                <w:rFonts w:ascii="Arial" w:hAnsi="Arial" w:cs="Arial"/>
+                <w:b/>
+                <w:bCs/>
+                <w:noProof/>
+              </w:rPr>
+              <w:t>1.2 Objetivo Geral</w:t>
+            </w:r>
+            <w:r>
+              <w:rPr>
+                <w:noProof/>
+                <w:webHidden/>
+              </w:rPr>
+              <w:tab/>
+            </w:r>
+            <w:r>
+              <w:rPr>
+                <w:noProof/>
+                <w:webHidden/>
+              </w:rPr>
+              <w:fldChar w:fldCharType="begin"/>
+            </w:r>
+            <w:r>
+              <w:rPr>
+                <w:noProof/>
+                <w:webHidden/>
+              </w:rPr>
+              <w:instrText xml:space="preserve"> PAGEREF _Toc238133365 \h </w:instrText>
+            </w:r>
+            <w:r>
+              <w:rPr>
+                <w:noProof/>
+                <w:webHidden/>
+              </w:rPr>
+            </w:r>
+            <w:r>
+              <w:rPr>
+                <w:noProof/>
+                <w:webHidden/>
+              </w:rPr>
+              <w:fldChar w:fldCharType="separate"/>
+            </w:r>
+            <w:r>
+              <w:rPr>
+                <w:noProof/>
+                <w:webHidden/>
+              </w:rPr>
+              <w:t>5</w:t>
+            </w:r>
+            <w:r>
+              <w:rPr>
+                <w:noProof/>
+                <w:webHidden/>
+              </w:rPr>
+              <w:fldChar w:fldCharType="end"/>
+            </w:r>
+          </w:hyperlink>
+        </w:p>
+        <w:p>
+          <w:pPr>
+            <w:pStyle w:val="Sumrio2"/>
+            <w:tabs>
+              <w:tab w:val="right" w:leader="dot" w:pos="9061"/>
+            </w:tabs>
+            <w:rPr>
+              <w:rFonts w:eastAsiaTheme="minorEastAsia"/>
+              <w:noProof/>
+              <w:lang w:eastAsia="pt-BR"/>
+            </w:rPr>
+          </w:pPr>
+          <w:hyperlink w:anchor="_Toc238133366" w:history="1">
+            <w:r>
+              <w:rPr>
+                <w:rStyle w:val="Hyperlink"/>
+                <w:rFonts w:ascii="Arial" w:hAnsi="Arial" w:cs="Arial"/>
+                <w:b/>
+                <w:bCs/>
+                <w:noProof/>
+              </w:rPr>
+              <w:t>1.3 Objetivos Específicos</w:t>
+            </w:r>
+            <w:r>
+              <w:rPr>
+                <w:noProof/>
+                <w:webHidden/>
+              </w:rPr>
+              <w:tab/>
+            </w:r>
+            <w:r>
+              <w:rPr>
+                <w:noProof/>
+                <w:webHidden/>
+              </w:rPr>
+              <w:fldChar w:fldCharType="begin"/>
+            </w:r>
+            <w:r>
+              <w:rPr>
+                <w:noProof/>
+                <w:webHidden/>
+              </w:rPr>
+              <w:instrText xml:space="preserve"> PAGEREF _Toc238133366 \h </w:instrText>
+            </w:r>
+            <w:r>
+              <w:rPr>
+                <w:noProof/>
+                <w:webHidden/>
+              </w:rPr>
+            </w:r>
+            <w:r>
+              <w:rPr>
+                <w:noProof/>
+                <w:webHidden/>
+              </w:rPr>
+              <w:fldChar w:fldCharType="separate"/>
+            </w:r>
+            <w:r>
+              <w:rPr>
+                <w:noProof/>
+                <w:webHidden/>
+              </w:rPr>
+              <w:t>5</w:t>
+            </w:r>
+            <w:r>
+              <w:rPr>
+                <w:noProof/>
+                <w:webHidden/>
+              </w:rPr>
+              <w:fldChar w:fldCharType="end"/>
+            </w:r>
+          </w:hyperlink>
+        </w:p>
+        <w:p>
+          <w:pPr>
+            <w:pStyle w:val="Sumrio1"/>
+            <w:tabs>
+              <w:tab w:val="right" w:leader="dot" w:pos="9061"/>
+            </w:tabs>
+            <w:rPr>
+              <w:rFonts w:eastAsiaTheme="minorEastAsia"/>
+              <w:noProof/>
+              <w:lang w:eastAsia="pt-BR"/>
+            </w:rPr>
+          </w:pPr>
+          <w:hyperlink w:anchor="_Toc238133367" w:history="1">
+            <w:r>
+              <w:rPr>
+                <w:rStyle w:val="Hyperlink"/>
+                <w:rFonts w:ascii="Arial" w:hAnsi="Arial" w:cs="Arial"/>
+                <w:b/>
+                <w:bCs/>
+                <w:noProof/>
+              </w:rPr>
+              <w:t>2. DESENVOLVIMENTO</w:t>
+            </w:r>
+            <w:r>
+              <w:rPr>
+                <w:noProof/>
+                <w:webHidden/>
+              </w:rPr>
+              <w:tab/>
+            </w:r>
+            <w:r>
+              <w:rPr>
+                <w:noProof/>
+                <w:webHidden/>
+              </w:rPr>
+              <w:fldChar w:fldCharType="begin"/>
+            </w:r>
+            <w:r>
+              <w:rPr>
+                <w:noProof/>
+                <w:webHidden/>
+              </w:rPr>
+              <w:instrText xml:space="preserve"> PAGEREF _Toc238133367 \h </w:instrText>
+            </w:r>
+            <w:r>
+              <w:rPr>
+                <w:noProof/>
+                <w:webHidden/>
+              </w:rPr>
+            </w:r>
+            <w:r>
+              <w:rPr>
+                <w:noProof/>
+                <w:webHidden/>
+              </w:rPr>
+              <w:fldChar w:fldCharType="separate"/>
+            </w:r>
+            <w:r>
+              <w:rPr>
+                <w:noProof/>
+                <w:webHidden/>
+              </w:rPr>
+              <w:t>6</w:t>
+            </w:r>
+            <w:r>
+              <w:rPr>
+                <w:noProof/>
+                <w:webHidden/>
+              </w:rPr>
+              <w:fldChar w:fldCharType="end"/>
+            </w:r>
+          </w:hyperlink>
+        </w:p>
+        <w:p>
+          <w:pPr>
+            <w:pStyle w:val="Sumrio2"/>
+            <w:tabs>
+              <w:tab w:val="right" w:leader="dot" w:pos="9061"/>
+            </w:tabs>
+            <w:rPr>
+              <w:rFonts w:eastAsiaTheme="minorEastAsia"/>
+              <w:noProof/>
+              <w:lang w:eastAsia="pt-BR"/>
+            </w:rPr>
+          </w:pPr>
+          <w:hyperlink w:anchor="_Toc238133368" w:history="1">
+            <w:r>
+              <w:rPr>
+                <w:rStyle w:val="Hyperlink"/>
+                <w:rFonts w:ascii="Arial" w:hAnsi="Arial" w:cs="Arial"/>
+                <w:b/>
+                <w:bCs/>
+                <w:noProof/>
+              </w:rPr>
+              <w:t>2.2 Configuração de Conexão (application.properties)</w:t>
+            </w:r>
+            <w:r>
+              <w:rPr>
+                <w:noProof/>
+                <w:webHidden/>
+              </w:rPr>
+              <w:tab/>
+            </w:r>
+            <w:r>
+              <w:rPr>
+                <w:noProof/>
+                <w:webHidden/>
+              </w:rPr>
+              <w:fldChar w:fldCharType="begin"/>
+            </w:r>
+            <w:r>
+              <w:rPr>
+                <w:noProof/>
+                <w:webHidden/>
+              </w:rPr>
+              <w:instrText xml:space="preserve"> PAGEREF _Toc238133368 \h </w:instrText>
+            </w:r>
+            <w:r>
+              <w:rPr>
+                <w:noProof/>
+                <w:webHidden/>
+              </w:rPr>
+            </w:r>
+            <w:r>
+              <w:rPr>
+                <w:noProof/>
+                <w:webHidden/>
+              </w:rPr>
+              <w:fldChar w:fldCharType="separate"/>
+            </w:r>
+            <w:r>
+              <w:rPr>
+                <w:noProof/>
+                <w:webHidden/>
+              </w:rPr>
+              <w:t>7</w:t>
+            </w:r>
+            <w:r>
+              <w:rPr>
+                <w:noProof/>
+                <w:webHidden/>
+              </w:rPr>
+              <w:fldChar w:fldCharType="end"/>
+            </w:r>
+          </w:hyperlink>
+        </w:p>
+        <w:p>
+          <w:pPr>
+            <w:pStyle w:val="Sumrio2"/>
+            <w:tabs>
+              <w:tab w:val="right" w:leader="dot" w:pos="9061"/>
+            </w:tabs>
+            <w:rPr>
+              <w:rFonts w:eastAsiaTheme="minorEastAsia"/>
+              <w:noProof/>
+              <w:lang w:eastAsia="pt-BR"/>
+            </w:rPr>
+          </w:pPr>
+          <w:hyperlink w:anchor="_Toc238133369" w:history="1">
+            <w:r>
+              <w:rPr>
+                <w:rStyle w:val="Hyperlink"/>
+                <w:rFonts w:ascii="Arial" w:hAnsi="Arial" w:cs="Arial"/>
+                <w:b/>
+                <w:bCs/>
+                <w:noProof/>
+              </w:rPr>
+              <w:t>2.3 Fundamentação e Arquitetura MVC No Spring Boot</w:t>
+            </w:r>
+            <w:r>
+              <w:rPr>
+                <w:noProof/>
+                <w:webHidden/>
+              </w:rPr>
+              <w:tab/>
+            </w:r>
+            <w:r>
+              <w:rPr>
+                <w:noProof/>
+                <w:webHidden/>
+              </w:rPr>
+              <w:fldChar w:fldCharType="begin"/>
+            </w:r>
+            <w:r>
+              <w:rPr>
+                <w:noProof/>
+                <w:webHidden/>
+              </w:rPr>
+              <w:instrText xml:space="preserve"> PAGEREF _Toc238133369 \h </w:instrText>
+            </w:r>
+            <w:r>
+              <w:rPr>
+                <w:noProof/>
+                <w:webHidden/>
+              </w:rPr>
+            </w:r>
+            <w:r>
+              <w:rPr>
+                <w:noProof/>
+                <w:webHidden/>
+              </w:rPr>
+              <w:fldChar w:fldCharType="separate"/>
+            </w:r>
+            <w:r>
+              <w:rPr>
+                <w:noProof/>
+                <w:webHidden/>
+              </w:rPr>
+              <w:t>7</w:t>
+            </w:r>
+            <w:r>
+              <w:rPr>
+                <w:noProof/>
+                <w:webHidden/>
+              </w:rPr>
+              <w:fldChar w:fldCharType="end"/>
+            </w:r>
+          </w:hyperlink>
+        </w:p>
+        <w:p>
+          <w:pPr>
+            <w:pStyle w:val="Sumrio1"/>
+            <w:tabs>
+              <w:tab w:val="right" w:leader="dot" w:pos="9061"/>
+            </w:tabs>
+            <w:rPr>
+              <w:rFonts w:eastAsiaTheme="minorEastAsia"/>
+              <w:noProof/>
+              <w:lang w:eastAsia="pt-BR"/>
+            </w:rPr>
+          </w:pPr>
+          <w:hyperlink w:anchor="_Toc238133370" w:history="1">
+            <w:r>
+              <w:rPr>
+                <w:rStyle w:val="Hyperlink"/>
+                <w:rFonts w:ascii="Arial" w:hAnsi="Arial" w:cs="Arial"/>
+                <w:b/>
+                <w:bCs/>
+                <w:noProof/>
+              </w:rPr>
+              <w:t>3. ATIVIDADES PRÁTICAS EXECUTADAS</w:t>
+            </w:r>
+            <w:r>
+              <w:rPr>
+                <w:noProof/>
+                <w:webHidden/>
+              </w:rPr>
+              <w:tab/>
+            </w:r>
+            <w:r>
+              <w:rPr>
+                <w:noProof/>
+                <w:webHidden/>
+              </w:rPr>
+              <w:fldChar w:fldCharType="begin"/>
+            </w:r>
+            <w:r>
+              <w:rPr>
+                <w:noProof/>
+                <w:webHidden/>
+              </w:rPr>
+              <w:instrText xml:space="preserve"> PAGEREF _Toc238133370 \h </w:instrText>
+            </w:r>
+            <w:r>
+              <w:rPr>
+                <w:noProof/>
+                <w:webHidden/>
+              </w:rPr>
+            </w:r>
+            <w:r>
+              <w:rPr>
+                <w:noProof/>
+                <w:webHidden/>
+              </w:rPr>
+              <w:fldChar w:fldCharType="separate"/>
+            </w:r>
+            <w:r>
+              <w:rPr>
+                <w:noProof/>
+                <w:webHidden/>
+              </w:rPr>
+              <w:t>9</w:t>
+            </w:r>
+            <w:r>
+              <w:rPr>
+                <w:noProof/>
+                <w:webHidden/>
+              </w:rPr>
+              <w:fldChar w:fldCharType="end"/>
+            </w:r>
+          </w:hyperlink>
+        </w:p>
+        <w:p>
+          <w:pPr>
+            <w:pStyle w:val="Sumrio2"/>
+            <w:tabs>
+              <w:tab w:val="right" w:leader="dot" w:pos="9061"/>
+            </w:tabs>
+            <w:rPr>
+              <w:rFonts w:eastAsiaTheme="minorEastAsia"/>
+              <w:noProof/>
+              <w:lang w:eastAsia="pt-BR"/>
+            </w:rPr>
+          </w:pPr>
+          <w:hyperlink w:anchor="_Toc238133371" w:history="1">
+            <w:r>
+              <w:rPr>
+                <w:rStyle w:val="Hyperlink"/>
+                <w:rFonts w:ascii="Arial" w:hAnsi="Arial" w:cs="Arial"/>
+                <w:b/>
+                <w:bCs/>
+                <w:noProof/>
+              </w:rPr>
+              <w:t>3.1 Banco de Dados e Modelagem Relacional</w:t>
+            </w:r>
+            <w:r>
+              <w:rPr>
+                <w:noProof/>
+                <w:webHidden/>
+              </w:rPr>
+              <w:tab/>
+            </w:r>
+            <w:r>
+              <w:rPr>
+                <w:noProof/>
+                <w:webHidden/>
+              </w:rPr>
+              <w:fldChar w:fldCharType="begin"/>
+            </w:r>
+            <w:r>
+              <w:rPr>
+                <w:noProof/>
+                <w:webHidden/>
+              </w:rPr>
+              <w:instrText xml:space="preserve"> PAGEREF _Toc238133371 \h </w:instrText>
+            </w:r>
+            <w:r>
+              <w:rPr>
+                <w:noProof/>
+                <w:webHidden/>
+              </w:rPr>
+            </w:r>
+            <w:r>
+              <w:rPr>
+                <w:noProof/>
+                <w:webHidden/>
+              </w:rPr>
+              <w:fldChar w:fldCharType="separate"/>
+            </w:r>
+            <w:r>
+              <w:rPr>
+                <w:noProof/>
+                <w:webHidden/>
+              </w:rPr>
+              <w:t>9</w:t>
+            </w:r>
+            <w:r>
+              <w:rPr>
+                <w:noProof/>
+                <w:webHidden/>
+              </w:rPr>
+              <w:fldChar w:fldCharType="end"/>
+            </w:r>
+          </w:hyperlink>
+        </w:p>
+        <w:p>
+          <w:pPr>
+            <w:pStyle w:val="Sumrio2"/>
+            <w:tabs>
+              <w:tab w:val="right" w:leader="dot" w:pos="9061"/>
+            </w:tabs>
+            <w:rPr>
+              <w:rFonts w:eastAsiaTheme="minorEastAsia"/>
+              <w:noProof/>
+              <w:lang w:eastAsia="pt-BR"/>
+            </w:rPr>
+          </w:pPr>
+          <w:hyperlink w:anchor="_Toc238133372" w:history="1">
+            <w:r>
+              <w:rPr>
+                <w:rStyle w:val="Hyperlink"/>
+                <w:rFonts w:ascii="Arial" w:hAnsi="Arial" w:cs="Arial"/>
+                <w:b/>
+                <w:bCs/>
+                <w:noProof/>
+              </w:rPr>
+              <w:t>3.2 Mapeamento Objeto-Relacional (Camada Model)</w:t>
+            </w:r>
+            <w:r>
+              <w:rPr>
+                <w:noProof/>
+                <w:webHidden/>
+              </w:rPr>
+              <w:tab/>
+            </w:r>
+            <w:r>
+              <w:rPr>
+                <w:noProof/>
+                <w:webHidden/>
+              </w:rPr>
+              <w:fldChar w:fldCharType="begin"/>
+            </w:r>
+            <w:r>
+              <w:rPr>
+                <w:noProof/>
+                <w:webHidden/>
+              </w:rPr>
+              <w:instrText xml:space="preserve"> PAGEREF _Toc238133372 \h </w:instrText>
+            </w:r>
+            <w:r>
+              <w:rPr>
+                <w:noProof/>
+                <w:webHidden/>
+              </w:rPr>
+            </w:r>
+            <w:r>
+              <w:rPr>
+                <w:noProof/>
+                <w:webHidden/>
+              </w:rPr>
+              <w:fldChar w:fldCharType="separate"/>
+            </w:r>
+            <w:r>
+              <w:rPr>
+                <w:noProof/>
+                <w:webHidden/>
+              </w:rPr>
+              <w:t>10</w:t>
+            </w:r>
+            <w:r>
+              <w:rPr>
+                <w:noProof/>
+                <w:webHidden/>
+              </w:rPr>
+              <w:fldChar w:fldCharType="end"/>
+            </w:r>
+          </w:hyperlink>
+        </w:p>
+        <w:p>
+          <w:pPr>
+            <w:pStyle w:val="Sumrio2"/>
+            <w:tabs>
+              <w:tab w:val="right" w:leader="dot" w:pos="9061"/>
+            </w:tabs>
+            <w:rPr>
+              <w:rFonts w:eastAsiaTheme="minorEastAsia"/>
+              <w:noProof/>
+              <w:lang w:eastAsia="pt-BR"/>
+            </w:rPr>
+          </w:pPr>
+          <w:hyperlink w:anchor="_Toc238133373" w:history="1">
+            <w:r>
+              <w:rPr>
+                <w:rStyle w:val="Hyperlink"/>
+                <w:rFonts w:ascii="Arial" w:hAnsi="Arial" w:cs="Arial"/>
+                <w:b/>
+                <w:bCs/>
+                <w:noProof/>
+              </w:rPr>
+              <w:t>3.3 Camada de Repositório (Repository)</w:t>
+            </w:r>
+            <w:r>
+              <w:rPr>
+                <w:noProof/>
+                <w:webHidden/>
+              </w:rPr>
+              <w:tab/>
+            </w:r>
+            <w:r>
+              <w:rPr>
+                <w:noProof/>
+                <w:webHidden/>
+              </w:rPr>
+              <w:fldChar w:fldCharType="begin"/>
+            </w:r>
+            <w:r>
+              <w:rPr>
+                <w:noProof/>
+                <w:webHidden/>
+              </w:rPr>
+              <w:instrText xml:space="preserve"> PAGEREF _Toc238133373 \h </w:instrText>
+            </w:r>
+            <w:r>
+              <w:rPr>
+                <w:noProof/>
+                <w:webHidden/>
+              </w:rPr>
+            </w:r>
+            <w:r>
+              <w:rPr>
+                <w:noProof/>
+                <w:webHidden/>
+              </w:rPr>
+              <w:fldChar w:fldCharType="separate"/>
+            </w:r>
+            <w:r>
+              <w:rPr>
+                <w:noProof/>
+                <w:webHidden/>
+              </w:rPr>
+              <w:t>10</w:t>
+            </w:r>
+            <w:r>
+              <w:rPr>
+                <w:noProof/>
+                <w:webHidden/>
+              </w:rPr>
+              <w:fldChar w:fldCharType="end"/>
+            </w:r>
+          </w:hyperlink>
+        </w:p>
+        <w:p>
+          <w:pPr>
+            <w:pStyle w:val="Sumrio2"/>
+            <w:tabs>
+              <w:tab w:val="right" w:leader="dot" w:pos="9061"/>
+            </w:tabs>
+            <w:rPr>
+              <w:rFonts w:eastAsiaTheme="minorEastAsia"/>
+              <w:noProof/>
+              <w:lang w:eastAsia="pt-BR"/>
+            </w:rPr>
+          </w:pPr>
+          <w:hyperlink w:anchor="_Toc238133374" w:history="1">
+            <w:r>
+              <w:rPr>
+                <w:rStyle w:val="Hyperlink"/>
+                <w:rFonts w:ascii="Arial" w:hAnsi="Arial" w:cs="Arial"/>
+                <w:b/>
+                <w:bCs/>
+                <w:noProof/>
+              </w:rPr>
+              <w:t>3.4 Camada de Serviço e Regras Transacionais (Service)</w:t>
+            </w:r>
+            <w:r>
+              <w:rPr>
+                <w:noProof/>
+                <w:webHidden/>
+              </w:rPr>
+              <w:tab/>
+            </w:r>
+            <w:r>
+              <w:rPr>
+                <w:noProof/>
+                <w:webHidden/>
+              </w:rPr>
+              <w:fldChar w:fldCharType="begin"/>
+            </w:r>
+            <w:r>
+              <w:rPr>
+                <w:noProof/>
+                <w:webHidden/>
+              </w:rPr>
+              <w:instrText xml:space="preserve"> PAGEREF _Toc238133374 \h </w:instrText>
+            </w:r>
+            <w:r>
+              <w:rPr>
+                <w:noProof/>
+                <w:webHidden/>
+              </w:rPr>
+            </w:r>
+            <w:r>
+              <w:rPr>
+                <w:noProof/>
+                <w:webHidden/>
+              </w:rPr>
+              <w:fldChar w:fldCharType="separate"/>
+            </w:r>
+            <w:r>
+              <w:rPr>
+                <w:noProof/>
+                <w:webHidden/>
+              </w:rPr>
+              <w:t>10</w:t>
+            </w:r>
+            <w:r>
+              <w:rPr>
+                <w:noProof/>
+                <w:webHidden/>
+              </w:rPr>
+              <w:fldChar w:fldCharType="end"/>
+            </w:r>
+          </w:hyperlink>
+        </w:p>
+        <w:p>
+          <w:pPr>
+            <w:pStyle w:val="Sumrio2"/>
+            <w:tabs>
+              <w:tab w:val="right" w:leader="dot" w:pos="9061"/>
+            </w:tabs>
+            <w:rPr>
+              <w:rFonts w:eastAsiaTheme="minorEastAsia"/>
+              <w:noProof/>
+              <w:lang w:eastAsia="pt-BR"/>
+            </w:rPr>
+          </w:pPr>
+          <w:hyperlink w:anchor="_Toc238133375" w:history="1">
+            <w:r>
+              <w:rPr>
+                <w:rStyle w:val="Hyperlink"/>
+                <w:rFonts w:ascii="Arial" w:hAnsi="Arial" w:cs="Arial"/>
+                <w:b/>
+                <w:bCs/>
+                <w:noProof/>
+              </w:rPr>
+              <w:t>3.5 Camada de Controle e Interface (Controller &amp; View)</w:t>
+            </w:r>
+            <w:r>
+              <w:rPr>
+                <w:noProof/>
+                <w:webHidden/>
+              </w:rPr>
+              <w:tab/>
+            </w:r>
+            <w:r>
+              <w:rPr>
+                <w:noProof/>
+                <w:webHidden/>
+              </w:rPr>
+              <w:fldChar w:fldCharType="begin"/>
+            </w:r>
+            <w:r>
+              <w:rPr>
+                <w:noProof/>
+                <w:webHidden/>
+              </w:rPr>
+              <w:instrText xml:space="preserve"> PAGEREF _Toc238133375 \h </w:instrText>
+            </w:r>
+            <w:r>
+              <w:rPr>
+                <w:noProof/>
+                <w:webHidden/>
+              </w:rPr>
+            </w:r>
+            <w:r>
+              <w:rPr>
+                <w:noProof/>
+                <w:webHidden/>
+              </w:rPr>
+              <w:fldChar w:fldCharType="separate"/>
+            </w:r>
+            <w:r>
+              <w:rPr>
+                <w:noProof/>
+                <w:webHidden/>
+              </w:rPr>
+              <w:t>10</w:t>
+            </w:r>
+            <w:r>
+              <w:rPr>
+                <w:noProof/>
+                <w:webHidden/>
+              </w:rPr>
+              <w:fldChar w:fldCharType="end"/>
+            </w:r>
+          </w:hyperlink>
+        </w:p>
+        <w:p>
+          <w:pPr>
+            <w:pStyle w:val="Sumrio2"/>
+            <w:tabs>
+              <w:tab w:val="right" w:leader="dot" w:pos="9061"/>
+            </w:tabs>
+            <w:rPr>
+              <w:rFonts w:eastAsiaTheme="minorEastAsia"/>
+              <w:noProof/>
+              <w:lang w:eastAsia="pt-BR"/>
+            </w:rPr>
+          </w:pPr>
+          <w:hyperlink w:anchor="_Toc238133376" w:history="1">
+            <w:r>
+              <w:rPr>
+                <w:rStyle w:val="Hyperlink"/>
+                <w:rFonts w:ascii="Arial" w:hAnsi="Arial" w:cs="Arial"/>
+                <w:b/>
+                <w:bCs/>
+                <w:noProof/>
+              </w:rPr>
+              <w:t>3.6 Validação, Testes e Implantação</w:t>
+            </w:r>
+            <w:r>
+              <w:rPr>
+                <w:noProof/>
+                <w:webHidden/>
+              </w:rPr>
+              <w:tab/>
+            </w:r>
+            <w:r>
+              <w:rPr>
+                <w:noProof/>
+                <w:webHidden/>
+              </w:rPr>
+              <w:fldChar w:fldCharType="begin"/>
+            </w:r>
+            <w:r>
+              <w:rPr>
+                <w:noProof/>
+                <w:webHidden/>
+              </w:rPr>
+              <w:instrText xml:space="preserve"> PAGEREF _Toc238133376 \h </w:instrText>
+            </w:r>
+            <w:r>
+              <w:rPr>
+                <w:noProof/>
+                <w:webHidden/>
+              </w:rPr>
+            </w:r>
+            <w:r>
+              <w:rPr>
+                <w:noProof/>
+                <w:webHidden/>
+              </w:rPr>
+              <w:fldChar w:fldCharType="separate"/>
+            </w:r>
+            <w:r>
+              <w:rPr>
+                <w:noProof/>
+                <w:webHidden/>
+              </w:rPr>
+              <w:t>11</w:t>
+            </w:r>
+            <w:r>
+              <w:rPr>
+                <w:noProof/>
+                <w:webHidden/>
+              </w:rPr>
+              <w:fldChar w:fldCharType="end"/>
+            </w:r>
+          </w:hyperlink>
+        </w:p>
+        <w:p>
+          <w:pPr>
+            <w:pStyle w:val="Sumrio1"/>
+            <w:tabs>
+              <w:tab w:val="left" w:pos="480"/>
+              <w:tab w:val="right" w:leader="dot" w:pos="9061"/>
+            </w:tabs>
+            <w:rPr>
+              <w:rFonts w:eastAsiaTheme="minorEastAsia"/>
+              <w:noProof/>
+              <w:lang w:eastAsia="pt-BR"/>
+            </w:rPr>
+          </w:pPr>
+          <w:hyperlink w:anchor="_Toc238133377" w:history="1">
+            <w:r>
+              <w:rPr>
+                <w:rStyle w:val="Hyperlink"/>
+                <w:rFonts w:ascii="Arial" w:hAnsi="Arial" w:cs="Arial"/>
+                <w:b/>
+                <w:bCs/>
+                <w:noProof/>
+              </w:rPr>
+              <w:t>4.</w:t>
+            </w:r>
+            <w:r>
+              <w:rPr>
+                <w:rFonts w:eastAsiaTheme="minorEastAsia"/>
+                <w:noProof/>
+                <w:lang w:eastAsia="pt-BR"/>
+              </w:rPr>
+              <w:tab/>
+            </w:r>
+            <w:r>
+              <w:rPr>
+                <w:rStyle w:val="Hyperlink"/>
+                <w:rFonts w:ascii="Arial" w:hAnsi="Arial" w:cs="Arial"/>
+                <w:b/>
+                <w:bCs/>
+                <w:noProof/>
+              </w:rPr>
+              <w:t>CONCLUSÃO</w:t>
+            </w:r>
+            <w:r>
+              <w:rPr>
+                <w:noProof/>
+                <w:webHidden/>
+              </w:rPr>
+              <w:tab/>
+            </w:r>
+            <w:r>
+              <w:rPr>
+                <w:noProof/>
+                <w:webHidden/>
+              </w:rPr>
+              <w:fldChar w:fldCharType="begin"/>
+            </w:r>
+            <w:r>
+              <w:rPr>
+                <w:noProof/>
+                <w:webHidden/>
+              </w:rPr>
+              <w:instrText xml:space="preserve"> PAGEREF _Toc238133377 \h </w:instrText>
+            </w:r>
+            <w:r>
+              <w:rPr>
+                <w:noProof/>
+                <w:webHidden/>
+              </w:rPr>
+            </w:r>
+            <w:r>
+              <w:rPr>
+                <w:noProof/>
+                <w:webHidden/>
+              </w:rPr>
+              <w:fldChar w:fldCharType="separate"/>
+            </w:r>
+            <w:r>
+              <w:rPr>
+                <w:noProof/>
+                <w:webHidden/>
+              </w:rPr>
+              <w:t>11</w:t>
+            </w:r>
+            <w:r>
+              <w:rPr>
+                <w:noProof/>
+                <w:webHidden/>
+              </w:rPr>
+              <w:fldChar w:fldCharType="end"/>
+            </w:r>
+          </w:hyperlink>
+        </w:p>
+        <w:p>
+          <w:pPr>
+            <w:pStyle w:val="Sumrio1"/>
+            <w:tabs>
+              <w:tab w:val="left" w:pos="480"/>
+              <w:tab w:val="right" w:leader="dot" w:pos="9061"/>
+            </w:tabs>
+            <w:rPr>
+              <w:rFonts w:eastAsiaTheme="minorEastAsia"/>
+              <w:noProof/>
+              <w:lang w:eastAsia="pt-BR"/>
+            </w:rPr>
+          </w:pPr>
+          <w:hyperlink w:anchor="_Toc238133378" w:history="1">
+            <w:r>
+              <w:rPr>
+                <w:rStyle w:val="Hyperlink"/>
+                <w:rFonts w:ascii="Arial" w:hAnsi="Arial" w:cs="Arial"/>
+                <w:b/>
+                <w:bCs/>
+                <w:noProof/>
+              </w:rPr>
+              <w:t>5.</w:t>
+            </w:r>
+            <w:r>
+              <w:rPr>
+                <w:rFonts w:eastAsiaTheme="minorEastAsia"/>
+                <w:noProof/>
+                <w:lang w:eastAsia="pt-BR"/>
+              </w:rPr>
+              <w:tab/>
+            </w:r>
+            <w:r>
+              <w:rPr>
+                <w:rStyle w:val="Hyperlink"/>
+                <w:rFonts w:ascii="Arial" w:hAnsi="Arial" w:cs="Arial"/>
+                <w:b/>
+                <w:bCs/>
+                <w:noProof/>
+              </w:rPr>
+              <w:t>REFERÊNCIAS</w:t>
+            </w:r>
+            <w:r>
+              <w:rPr>
+                <w:noProof/>
+                <w:webHidden/>
+              </w:rPr>
+              <w:tab/>
+            </w:r>
+            <w:r>
+              <w:rPr>
+                <w:noProof/>
+                <w:webHidden/>
+              </w:rPr>
+              <w:fldChar w:fldCharType="begin"/>
+            </w:r>
+            <w:r>
+              <w:rPr>
+                <w:noProof/>
+                <w:webHidden/>
+              </w:rPr>
+              <w:instrText xml:space="preserve"> PAGEREF _Toc238133378 \h </w:instrText>
+            </w:r>
+            <w:r>
+              <w:rPr>
+                <w:noProof/>
+                <w:webHidden/>
+              </w:rPr>
+            </w:r>
+            <w:r>
+              <w:rPr>
+                <w:noProof/>
+                <w:webHidden/>
+              </w:rPr>
+              <w:fldChar w:fldCharType="separate"/>
+            </w:r>
+            <w:r>
+              <w:rPr>
+                <w:noProof/>
+                <w:webHidden/>
+              </w:rPr>
+              <w:t>12</w:t>
+            </w:r>
+            <w:r>
+              <w:rPr>
+                <w:noProof/>
+                <w:webHidden/>
+              </w:rPr>
+              <w:fldChar w:fldCharType="end"/>
+            </w:r>
+          </w:hyperlink>
+        </w:p>
+        <w:p>
+          <w:r>
+            <w:rPr>
+              <w:b/>
+              <w:bCs/>
+            </w:rPr>
+            <w:fldChar w:fldCharType="end"/>
+          </w:r>
+        </w:p>
+      </w:sdtContent>
+    </w:sdt>
+    <w:p>
+      <w:pPr>
+        <w:rPr>
+          <w:rFonts w:ascii="Arial" w:hAnsi="Arial" w:cs="Arial"/>
+        </w:rPr>
+      </w:pPr>
+    </w:p>
+    <w:p>
+      <w:pPr>
+        <w:rPr>
+          <w:rFonts w:ascii="Arial" w:hAnsi="Arial" w:cs="Arial"/>
+        </w:rPr>
+      </w:pPr>
+    </w:p>
+    <w:p>
+      <w:pPr>
+        <w:rPr>
+          <w:rFonts w:ascii="Arial" w:hAnsi="Arial" w:cs="Arial"/>
+        </w:rPr>
+      </w:pPr>
+    </w:p>
+    <w:p>
+      <w:pPr>
+        <w:rPr>
+          <w:rFonts w:ascii="Arial" w:hAnsi="Arial" w:cs="Arial"/>
+        </w:rPr>
+        <w:sectPr>
+          <w:headerReference w:type="default" r:id="rId8"/>
+          <w:pgSz w:w="11906" w:h="16838"/>
+          <w:pgMar w:top="1701" w:right="1134" w:bottom="1134" w:left="1701" w:header="709" w:footer="709" w:gutter="0"/>
+          <w:cols w:space="708"/>
+          <w:docGrid w:linePitch="360"/>
+        </w:sectPr>
+      </w:pPr>
+    </w:p>
+    <w:p>
+      <w:pPr>
+        <w:rPr>
+          <w:rFonts w:ascii="Arial" w:hAnsi="Arial" w:cs="Arial"/>
+        </w:rPr>
+      </w:pPr>
+    </w:p>
+    <w:p>
+      <w:pPr>
+        <w:rPr>
+          <w:rFonts w:ascii="Arial" w:hAnsi="Arial" w:cs="Arial"/>
+        </w:rPr>
+      </w:pPr>
+    </w:p>
+    <w:p>
+      <w:pPr>
+        <w:jc w:val="center"/>
+        <w:rPr>
+          <w:rFonts w:ascii="Arial" w:hAnsi="Arial" w:cs="Arial"/>
+          <w:b/>
+          <w:bCs/>
+        </w:rPr>
+      </w:pPr>
+      <w:r>
+        <w:rPr>
+          <w:rFonts w:ascii="Arial" w:hAnsi="Arial" w:cs="Arial"/>
+          <w:b/>
+          <w:bCs/>
+        </w:rPr>
+        <w:t>LISTA DE FIGURAS</w:t>
+      </w:r>
+    </w:p>
+    <w:p>
+      <w:pPr>
+        <w:pStyle w:val="ndicedeilustraes"/>
+        <w:tabs>
+          <w:tab w:val="right" w:leader="dot" w:pos="9061"/>
+        </w:tabs>
+        <w:spacing w:line="360" w:lineRule="auto"/>
+        <w:rPr>
+          <w:noProof/>
+        </w:rPr>
+      </w:pPr>
+      <w:r>
+        <w:rPr>
+          <w:rFonts w:ascii="Arial" w:hAnsi="Arial" w:cs="Arial"/>
+        </w:rPr>
+        <w:fldChar w:fldCharType="begin"/>
+      </w:r>
+      <w:r>
+        <w:rPr>
+          <w:rFonts w:ascii="Arial" w:hAnsi="Arial" w:cs="Arial"/>
+        </w:rPr>
+        <w:instrText xml:space="preserve"> TOC \h \z \c "Figura" </w:instrText>
+      </w:r>
+      <w:r>
+        <w:rPr>
+          <w:rFonts w:ascii="Arial" w:hAnsi="Arial" w:cs="Arial"/>
+        </w:rPr>
+        <w:fldChar w:fldCharType="separate"/>
+      </w:r>
+      <w:hyperlink w:anchor="_Toc238133306" w:history="1">
+        <w:r>
+          <w:rPr>
+            <w:rStyle w:val="Hyperlink"/>
+            <w:rFonts w:ascii="Arial" w:hAnsi="Arial" w:cs="Arial"/>
+            <w:b/>
+            <w:bCs/>
+            <w:noProof/>
+          </w:rPr>
+          <w:t>Figura 1: Properties</w:t>
+        </w:r>
+        <w:r>
+          <w:rPr>
+            <w:noProof/>
+            <w:webHidden/>
+          </w:rPr>
+          <w:tab/>
+        </w:r>
+        <w:r>
+          <w:rPr>
+            <w:noProof/>
+            <w:webHidden/>
+          </w:rPr>
+          <w:fldChar w:fldCharType="begin"/>
+        </w:r>
+        <w:r>
+          <w:rPr>
+            <w:noProof/>
+            <w:webHidden/>
+          </w:rPr>
+          <w:instrText xml:space="preserve"> PAGEREF _Toc238133306 \h </w:instrText>
+        </w:r>
+        <w:r>
+          <w:rPr>
+            <w:noProof/>
+            <w:webHidden/>
+          </w:rPr>
+        </w:r>
+        <w:r>
+          <w:rPr>
+            <w:noProof/>
+            <w:webHidden/>
+          </w:rPr>
+          <w:fldChar w:fldCharType="separate"/>
+        </w:r>
+        <w:r>
+          <w:rPr>
+            <w:noProof/>
+            <w:webHidden/>
+          </w:rPr>
+          <w:t>7</w:t>
+        </w:r>
+        <w:r>
+          <w:rPr>
+            <w:noProof/>
+            <w:webHidden/>
+          </w:rPr>
+          <w:fldChar w:fldCharType="end"/>
+        </w:r>
+      </w:hyperlink>
+    </w:p>
+    <w:p>
+      <w:pPr>
+        <w:pStyle w:val="ndicedeilustraes"/>
+        <w:tabs>
+          <w:tab w:val="right" w:leader="dot" w:pos="9061"/>
+        </w:tabs>
+        <w:spacing w:line="360" w:lineRule="auto"/>
+        <w:rPr>
+          <w:noProof/>
+        </w:rPr>
+      </w:pPr>
+      <w:hyperlink w:anchor="_Toc238133307" w:history="1">
+        <w:r>
+          <w:rPr>
+            <w:rStyle w:val="Hyperlink"/>
+            <w:rFonts w:ascii="Arial" w:hAnsi="Arial" w:cs="Arial"/>
+            <w:b/>
+            <w:bCs/>
+            <w:noProof/>
+          </w:rPr>
+          <w:t>Figura 2: Arquitetura MVC com Spring Boot</w:t>
+        </w:r>
+        <w:r>
+          <w:rPr>
+            <w:noProof/>
+            <w:webHidden/>
+          </w:rPr>
+          <w:tab/>
+        </w:r>
+        <w:r>
+          <w:rPr>
+            <w:noProof/>
+            <w:webHidden/>
+          </w:rPr>
+          <w:fldChar w:fldCharType="begin"/>
+        </w:r>
+        <w:r>
+          <w:rPr>
+            <w:noProof/>
+            <w:webHidden/>
+          </w:rPr>
+          <w:instrText xml:space="preserve"> PAGEREF _Toc238133307 \h </w:instrText>
+        </w:r>
+        <w:r>
+          <w:rPr>
+            <w:noProof/>
+            <w:webHidden/>
+          </w:rPr>
+        </w:r>
+        <w:r>
+          <w:rPr>
+            <w:noProof/>
+            <w:webHidden/>
+          </w:rPr>
+          <w:fldChar w:fldCharType="separate"/>
+        </w:r>
+        <w:r>
+          <w:rPr>
+            <w:noProof/>
+            <w:webHidden/>
+          </w:rPr>
+          <w:t>8</w:t>
+        </w:r>
+        <w:r>
+          <w:rPr>
+            <w:noProof/>
+            <w:webHidden/>
+          </w:rPr>
+          <w:fldChar w:fldCharType="end"/>
+        </w:r>
+      </w:hyperlink>
+    </w:p>
+    <w:p>
+      <w:pPr>
+        <w:pStyle w:val="ndicedeilustraes"/>
+        <w:tabs>
+          <w:tab w:val="right" w:leader="dot" w:pos="9061"/>
+        </w:tabs>
+        <w:spacing w:line="360" w:lineRule="auto"/>
+        <w:rPr>
+          <w:noProof/>
+        </w:rPr>
+      </w:pPr>
+      <w:hyperlink w:anchor="_Toc238133308" w:history="1">
+        <w:r>
+          <w:rPr>
+            <w:rStyle w:val="Hyperlink"/>
+            <w:rFonts w:ascii="Arial" w:hAnsi="Arial" w:cs="Arial"/>
+            <w:b/>
+            <w:bCs/>
+            <w:noProof/>
+          </w:rPr>
+          <w:t>Figura 3: Modelo Lógico - Sistema de Controle de Clientes e Pedidos</w:t>
+        </w:r>
+        <w:r>
+          <w:rPr>
+            <w:noProof/>
+            <w:webHidden/>
+          </w:rPr>
+          <w:tab/>
+        </w:r>
+        <w:r>
+          <w:rPr>
+            <w:noProof/>
+            <w:webHidden/>
+          </w:rPr>
+          <w:fldChar w:fldCharType="begin"/>
+        </w:r>
+        <w:r>
+          <w:rPr>
+            <w:noProof/>
+            <w:webHidden/>
+          </w:rPr>
+          <w:instrText xml:space="preserve"> PAGEREF _Toc238133308 \h </w:instrText>
+        </w:r>
+        <w:r>
+          <w:rPr>
+            <w:noProof/>
+            <w:webHidden/>
+          </w:rPr>
+        </w:r>
+        <w:r>
+          <w:rPr>
+            <w:noProof/>
+            <w:webHidden/>
+          </w:rPr>
+          <w:fldChar w:fldCharType="separate"/>
+        </w:r>
+        <w:r>
+          <w:rPr>
+            <w:noProof/>
+            <w:webHidden/>
+          </w:rPr>
+          <w:t>9</w:t>
+        </w:r>
+        <w:r>
+          <w:rPr>
+            <w:noProof/>
+            <w:webHidden/>
+          </w:rPr>
+          <w:fldChar w:fldCharType="end"/>
+        </w:r>
+      </w:hyperlink>
+    </w:p>
+    <w:p>
+      <w:pPr>
+        <w:spacing w:line="360" w:lineRule="auto"/>
+        <w:rPr>
+          <w:rFonts w:ascii="Arial" w:hAnsi="Arial" w:cs="Arial"/>
+        </w:rPr>
+      </w:pPr>
+      <w:r>
+        <w:rPr>
+          <w:rFonts w:ascii="Arial" w:hAnsi="Arial" w:cs="Arial"/>
+        </w:rPr>
+        <w:fldChar w:fldCharType="end"/>
+      </w:r>
+    </w:p>
+    <w:p>
+      <w:pPr>
+        <w:rPr>
+          <w:rFonts w:ascii="Arial" w:hAnsi="Arial" w:cs="Arial"/>
+        </w:rPr>
+      </w:pPr>
+    </w:p>
+    <w:p>
+      <w:pPr>
+        <w:rPr>
+          <w:rFonts w:ascii="Arial" w:hAnsi="Arial" w:cs="Arial"/>
+        </w:rPr>
+      </w:pPr>
+    </w:p>
+    <w:p>
+      <w:pPr>
+        <w:rPr>
+          <w:rFonts w:ascii="Arial" w:hAnsi="Arial" w:cs="Arial"/>
+        </w:rPr>
+      </w:pPr>
+    </w:p>
+    <w:p>
+      <w:pPr>
+        <w:rPr>
+          <w:rFonts w:ascii="Arial" w:hAnsi="Arial" w:cs="Arial"/>
+        </w:rPr>
+      </w:pPr>
+    </w:p>
+    <w:p>
+      <w:pPr>
+        <w:rPr>
+          <w:rFonts w:ascii="Arial" w:hAnsi="Arial" w:cs="Arial"/>
+        </w:rPr>
+      </w:pPr>
+    </w:p>
+    <w:p>
+      <w:pPr>
+        <w:rPr>
+          <w:rFonts w:ascii="Arial" w:hAnsi="Arial" w:cs="Arial"/>
+        </w:rPr>
+      </w:pPr>
+    </w:p>
+    <w:p>
+      <w:pPr>
+        <w:rPr>
+          <w:rFonts w:ascii="Arial" w:hAnsi="Arial" w:cs="Arial"/>
+        </w:rPr>
+      </w:pPr>
+    </w:p>
+    <w:p>
+      <w:pPr>
+        <w:rPr>
+          <w:rFonts w:ascii="Arial" w:hAnsi="Arial" w:cs="Arial"/>
+        </w:rPr>
+      </w:pPr>
+    </w:p>
+    <w:p>
+      <w:pPr>
+        <w:rPr>
+          <w:rFonts w:ascii="Arial" w:hAnsi="Arial" w:cs="Arial"/>
+        </w:rPr>
+      </w:pPr>
+    </w:p>
+    <w:p>
+      <w:pPr>
+        <w:rPr>
+          <w:rFonts w:ascii="Arial" w:hAnsi="Arial" w:cs="Arial"/>
+        </w:rPr>
+      </w:pPr>
+    </w:p>
+    <w:p>
+      <w:pPr>
+        <w:rPr>
+          <w:rFonts w:ascii="Arial" w:hAnsi="Arial" w:cs="Arial"/>
+        </w:rPr>
+      </w:pPr>
+    </w:p>
+    <w:p>
+      <w:pPr>
+        <w:rPr>
+          <w:rFonts w:ascii="Arial" w:hAnsi="Arial" w:cs="Arial"/>
+        </w:rPr>
+        <w:sectPr>
+          <w:headerReference w:type="default" r:id="rId9"/>
+          <w:pgSz w:w="11906" w:h="16838"/>
+          <w:pgMar w:top="1701" w:right="1134" w:bottom="1134" w:left="1701" w:header="709" w:footer="709" w:gutter="0"/>
+          <w:pgNumType w:start="4"/>
+          <w:cols w:space="708"/>
+          <w:docGrid w:linePitch="360"/>
+        </w:sectPr>
+      </w:pPr>
+    </w:p>
+    <w:p>
+      <w:pPr>
+        <w:rPr>
+          <w:rFonts w:ascii="Arial" w:hAnsi="Arial" w:cs="Arial"/>
+        </w:rPr>
+      </w:pPr>
+    </w:p>
+    <w:p>
+      <w:pPr>
+        <w:pStyle w:val="Ttulo1"/>
         <w:numPr>
           <w:ilvl w:val="0"/>
-          <w:numId w:val="1"/>
+          <w:numId w:val="30"/>
         </w:numPr>
         <w:rPr>
-          <w:b/>
-          <w:bCs/>
-        </w:rPr>
-      </w:pPr>
-      <w:r>
-        <w:rPr>
-          <w:b/>
-          <w:bCs/>
-        </w:rPr>
-        <w:lastRenderedPageBreak/>
+          <w:rFonts w:ascii="Arial" w:hAnsi="Arial" w:cs="Arial"/>
+          <w:b/>
+          <w:bCs/>
+          <w:color w:val="auto"/>
+          <w:sz w:val="24"/>
+          <w:szCs w:val="24"/>
+        </w:rPr>
+      </w:pPr>
+      <w:bookmarkStart w:id="0" w:name="_Toc238133364"/>
+      <w:r>
+        <w:rPr>
+          <w:rFonts w:ascii="Arial" w:hAnsi="Arial" w:cs="Arial"/>
+          <w:b/>
+          <w:bCs/>
+          <w:color w:val="auto"/>
+          <w:sz w:val="24"/>
+          <w:szCs w:val="24"/>
+        </w:rPr>
         <w:t>INTRODUÇÃO</w:t>
+      </w:r>
+      <w:bookmarkEnd w:id="0"/>
+      <w:r>
+        <w:rPr>
+          <w:rFonts w:ascii="Arial" w:hAnsi="Arial" w:cs="Arial"/>
+          <w:b/>
+          <w:bCs/>
+          <w:color w:val="auto"/>
+          <w:sz w:val="24"/>
+          <w:szCs w:val="24"/>
+        </w:rPr>
+        <w:t xml:space="preserve"> </w:t>
       </w:r>
     </w:p>
     <w:p>
@@ -1159,18 +2808,36 @@
     </w:p>
     <w:p>
       <w:pPr>
-        <w:ind w:left="360"/>
-        <w:rPr>
-          <w:rFonts w:ascii="Arial" w:hAnsi="Arial" w:cs="Arial"/>
-          <w:b/>
-          <w:bCs/>
-        </w:rPr>
-      </w:pPr>
-      <w:r>
-        <w:rPr>
-          <w:rFonts w:ascii="Arial" w:hAnsi="Arial" w:cs="Arial"/>
-          <w:b/>
-          <w:bCs/>
+        <w:pStyle w:val="Ttulo2"/>
+        <w:rPr>
+          <w:rFonts w:ascii="Arial" w:hAnsi="Arial" w:cs="Arial"/>
+          <w:b/>
+          <w:bCs/>
+          <w:color w:val="auto"/>
+          <w:sz w:val="24"/>
+          <w:szCs w:val="24"/>
+        </w:rPr>
+      </w:pPr>
+      <w:r>
+        <w:rPr>
+          <w:rFonts w:ascii="Arial" w:hAnsi="Arial" w:cs="Arial"/>
+          <w:b/>
+          <w:bCs/>
+          <w:color w:val="auto"/>
+          <w:sz w:val="24"/>
+          <w:szCs w:val="24"/>
+        </w:rPr>
+        <w:t xml:space="preserve">     </w:t>
+      </w:r>
+      <w:bookmarkStart w:id="1" w:name="_Toc238133365"/>
+      <w:r>
+        <w:rPr>
+          <w:rFonts w:ascii="Arial" w:hAnsi="Arial" w:cs="Arial"/>
+          <w:b/>
+          <w:bCs/>
+          <w:color w:val="auto"/>
+          <w:sz w:val="24"/>
+          <w:szCs w:val="24"/>
         </w:rPr>
         <w:t xml:space="preserve">1.2 </w:t>
       </w:r>
@@ -1179,9 +2846,13 @@
           <w:rFonts w:ascii="Arial" w:hAnsi="Arial" w:cs="Arial"/>
           <w:b/>
           <w:bCs/>
+          <w:color w:val="auto"/>
+          <w:sz w:val="24"/>
+          <w:szCs w:val="24"/>
         </w:rPr>
         <w:t>Objetivo Geral</w:t>
       </w:r>
+      <w:bookmarkEnd w:id="1"/>
     </w:p>
     <w:p>
       <w:pPr>
@@ -1243,21 +2914,40 @@
     </w:p>
     <w:p>
       <w:pPr>
-        <w:ind w:left="360"/>
-        <w:rPr>
-          <w:rFonts w:ascii="Arial" w:hAnsi="Arial" w:cs="Arial"/>
-          <w:b/>
-          <w:bCs/>
-        </w:rPr>
-      </w:pPr>
-      <w:r>
-        <w:rPr>
-          <w:rFonts w:ascii="Arial" w:hAnsi="Arial" w:cs="Arial"/>
-          <w:b/>
-          <w:bCs/>
+        <w:pStyle w:val="Ttulo2"/>
+        <w:rPr>
+          <w:rFonts w:ascii="Arial" w:hAnsi="Arial" w:cs="Arial"/>
+          <w:b/>
+          <w:bCs/>
+          <w:color w:val="auto"/>
+          <w:sz w:val="24"/>
+          <w:szCs w:val="24"/>
+        </w:rPr>
+      </w:pPr>
+      <w:r>
+        <w:rPr>
+          <w:rFonts w:ascii="Arial" w:hAnsi="Arial" w:cs="Arial"/>
+          <w:b/>
+          <w:bCs/>
+          <w:color w:val="auto"/>
+          <w:sz w:val="24"/>
+          <w:szCs w:val="24"/>
+        </w:rPr>
+        <w:t xml:space="preserve">    </w:t>
+      </w:r>
+      <w:bookmarkStart w:id="2" w:name="_Toc238133366"/>
+      <w:r>
+        <w:rPr>
+          <w:rFonts w:ascii="Arial" w:hAnsi="Arial" w:cs="Arial"/>
+          <w:b/>
+          <w:bCs/>
+          <w:color w:val="auto"/>
+          <w:sz w:val="24"/>
+          <w:szCs w:val="24"/>
         </w:rPr>
         <w:t>1.3 Objetivos Específicos</w:t>
       </w:r>
+      <w:bookmarkEnd w:id="2"/>
     </w:p>
     <w:p>
       <w:pPr>
@@ -1535,30 +3225,62 @@
     </w:p>
     <w:p>
       <w:pPr>
-        <w:pStyle w:val="PargrafodaLista"/>
-        <w:numPr>
-          <w:ilvl w:val="0"/>
-          <w:numId w:val="1"/>
-        </w:numPr>
-        <w:rPr>
-          <w:b/>
-          <w:bCs/>
-        </w:rPr>
-      </w:pPr>
-      <w:r>
-        <w:rPr>
-          <w:b/>
-          <w:bCs/>
+        <w:pStyle w:val="Ttulo1"/>
+        <w:rPr>
+          <w:rFonts w:ascii="Arial" w:hAnsi="Arial" w:cs="Arial"/>
+          <w:b/>
+          <w:bCs/>
+          <w:color w:val="auto"/>
+          <w:sz w:val="24"/>
+          <w:szCs w:val="24"/>
+        </w:rPr>
+      </w:pPr>
+      <w:r>
+        <w:rPr>
+          <w:rFonts w:ascii="Arial" w:hAnsi="Arial" w:cs="Arial"/>
+          <w:b/>
+          <w:bCs/>
+          <w:color w:val="auto"/>
+          <w:sz w:val="24"/>
+          <w:szCs w:val="24"/>
+        </w:rPr>
+        <w:t xml:space="preserve">     </w:t>
+      </w:r>
+      <w:bookmarkStart w:id="3" w:name="_Toc238133367"/>
+      <w:r>
+        <w:rPr>
+          <w:rFonts w:ascii="Arial" w:hAnsi="Arial" w:cs="Arial"/>
+          <w:b/>
+          <w:bCs/>
+          <w:color w:val="auto"/>
+          <w:sz w:val="24"/>
+          <w:szCs w:val="24"/>
+        </w:rPr>
+        <w:t>2.</w:t>
+      </w:r>
+      <w:r>
+        <w:rPr>
+          <w:rFonts w:ascii="Arial" w:hAnsi="Arial" w:cs="Arial"/>
+          <w:b/>
+          <w:bCs/>
+          <w:color w:val="auto"/>
+          <w:sz w:val="24"/>
+          <w:szCs w:val="24"/>
         </w:rPr>
         <w:t xml:space="preserve"> </w:t>
       </w:r>
       <w:r>
         <w:rPr>
-          <w:b/>
-          <w:bCs/>
+          <w:rFonts w:ascii="Arial" w:hAnsi="Arial" w:cs="Arial"/>
+          <w:b/>
+          <w:bCs/>
+          <w:color w:val="auto"/>
+          <w:sz w:val="24"/>
+          <w:szCs w:val="24"/>
         </w:rPr>
         <w:t>DESENVOLVIMENTO</w:t>
       </w:r>
+      <w:bookmarkEnd w:id="3"/>
     </w:p>
     <w:p>
       <w:pPr>
@@ -1965,6 +3687,7 @@
           <w:b/>
           <w:bCs/>
         </w:rPr>
+        <w:lastRenderedPageBreak/>
         <w:t xml:space="preserve">- </w:t>
       </w:r>
       <w:r>
@@ -2011,7 +3734,6 @@
           <w:b/>
           <w:bCs/>
         </w:rPr>
-        <w:lastRenderedPageBreak/>
         <w:t xml:space="preserve">- </w:t>
       </w:r>
       <w:r>
@@ -2105,19 +3827,25 @@
     </w:p>
     <w:p>
       <w:pPr>
-        <w:spacing w:line="360" w:lineRule="auto"/>
-        <w:jc w:val="both"/>
-        <w:rPr>
-          <w:rFonts w:ascii="Arial" w:hAnsi="Arial" w:cs="Arial"/>
-          <w:b/>
-          <w:bCs/>
-        </w:rPr>
-      </w:pPr>
-      <w:r>
-        <w:rPr>
-          <w:rFonts w:ascii="Arial" w:hAnsi="Arial" w:cs="Arial"/>
-          <w:b/>
-          <w:bCs/>
+        <w:pStyle w:val="Ttulo2"/>
+        <w:rPr>
+          <w:rFonts w:ascii="Arial" w:hAnsi="Arial" w:cs="Arial"/>
+          <w:b/>
+          <w:bCs/>
+          <w:color w:val="auto"/>
+          <w:sz w:val="24"/>
+          <w:szCs w:val="24"/>
+        </w:rPr>
+      </w:pPr>
+      <w:bookmarkStart w:id="4" w:name="_Toc238133368"/>
+      <w:r>
+        <w:rPr>
+          <w:rFonts w:ascii="Arial" w:hAnsi="Arial" w:cs="Arial"/>
+          <w:b/>
+          <w:bCs/>
+          <w:color w:val="auto"/>
+          <w:sz w:val="24"/>
+          <w:szCs w:val="24"/>
         </w:rPr>
         <w:t>2.2 Configuração de Conexão (</w:t>
       </w:r>
@@ -2128,6 +3856,9 @@
           <w:rFonts w:ascii="Arial" w:hAnsi="Arial" w:cs="Arial"/>
           <w:b/>
           <w:bCs/>
+          <w:color w:val="auto"/>
+          <w:sz w:val="24"/>
+          <w:szCs w:val="24"/>
         </w:rPr>
         <w:t>application.properties</w:t>
       </w:r>
@@ -2138,9 +3869,13 @@
           <w:rFonts w:ascii="Arial" w:hAnsi="Arial" w:cs="Arial"/>
           <w:b/>
           <w:bCs/>
+          <w:color w:val="auto"/>
+          <w:sz w:val="24"/>
+          <w:szCs w:val="24"/>
         </w:rPr>
         <w:t>)</w:t>
       </w:r>
+      <w:bookmarkEnd w:id="4"/>
     </w:p>
     <w:p>
       <w:pPr>
@@ -2187,7 +3922,7 @@
                     <pic:cNvPicPr/>
                   </pic:nvPicPr>
                   <pic:blipFill>
-                    <a:blip r:embed="rId7" cstate="print">
+                    <a:blip r:embed="rId10" cstate="print">
                       <a:extLst>
                         <a:ext uri="{28A0092B-C50C-407E-A947-70E740481C1C}">
                           <a14:useLocalDpi xmlns:a14="http://schemas.microsoft.com/office/drawing/2010/main" val="0"/>
@@ -2229,6 +3964,7 @@
           <w:szCs w:val="20"/>
         </w:rPr>
       </w:pPr>
+      <w:bookmarkStart w:id="5" w:name="_Toc238133306"/>
       <w:r>
         <w:rPr>
           <w:rFonts w:ascii="Arial" w:hAnsi="Arial" w:cs="Arial"/>
@@ -2321,6 +4057,7 @@
         </w:rPr>
         <w:t>: Properties</w:t>
       </w:r>
+      <w:bookmarkEnd w:id="5"/>
     </w:p>
     <w:p>
       <w:pPr>
@@ -2335,22 +4072,29 @@
     </w:p>
     <w:p>
       <w:pPr>
-        <w:spacing w:line="360" w:lineRule="auto"/>
-        <w:jc w:val="both"/>
-        <w:rPr>
-          <w:rFonts w:ascii="Arial" w:hAnsi="Arial" w:cs="Arial"/>
-          <w:b/>
-          <w:bCs/>
-        </w:rPr>
-      </w:pPr>
-      <w:r>
-        <w:rPr>
-          <w:rFonts w:ascii="Arial" w:hAnsi="Arial" w:cs="Arial"/>
-          <w:b/>
-          <w:bCs/>
-        </w:rPr>
-        <w:t>3. FUNDAMENTAÇÃO E ARQUITETURA MVC NO SPRING BOOT</w:t>
-      </w:r>
+        <w:pStyle w:val="Ttulo2"/>
+        <w:rPr>
+          <w:rFonts w:ascii="Arial" w:hAnsi="Arial" w:cs="Arial"/>
+          <w:b/>
+          <w:bCs/>
+          <w:color w:val="auto"/>
+          <w:sz w:val="24"/>
+          <w:szCs w:val="24"/>
+        </w:rPr>
+      </w:pPr>
+      <w:bookmarkStart w:id="6" w:name="_Toc238133369"/>
+      <w:r>
+        <w:rPr>
+          <w:rFonts w:ascii="Arial" w:hAnsi="Arial" w:cs="Arial"/>
+          <w:b/>
+          <w:bCs/>
+          <w:color w:val="auto"/>
+          <w:sz w:val="24"/>
+          <w:szCs w:val="24"/>
+        </w:rPr>
+        <w:t>2.3 Fundamentação e Arquitetura MVC No Spring Boot</w:t>
+      </w:r>
+      <w:bookmarkEnd w:id="6"/>
     </w:p>
     <w:p>
       <w:pPr>
@@ -2409,7 +4153,7 @@
                     <pic:cNvPicPr/>
                   </pic:nvPicPr>
                   <pic:blipFill rotWithShape="1">
-                    <a:blip r:embed="rId8" cstate="print">
+                    <a:blip r:embed="rId11" cstate="print">
                       <a:extLst>
                         <a:ext uri="{28A0092B-C50C-407E-A947-70E740481C1C}">
                           <a14:useLocalDpi xmlns:a14="http://schemas.microsoft.com/office/drawing/2010/main" val="0"/>
@@ -2476,6 +4220,7 @@
         </w:rPr>
         <w:t xml:space="preserve">              </w:t>
       </w:r>
+      <w:bookmarkStart w:id="7" w:name="_Toc238133307"/>
       <w:r>
         <w:rPr>
           <w:rFonts w:ascii="Arial" w:hAnsi="Arial" w:cs="Arial"/>
@@ -2568,6 +4313,7 @@
         </w:rPr>
         <w:t>: Arquitetura MVC com Spring Boot</w:t>
       </w:r>
+      <w:bookmarkEnd w:id="7"/>
     </w:p>
     <w:p>
       <w:pPr>
@@ -2948,23 +4694,41 @@
     </w:p>
     <w:p>
       <w:pPr>
-        <w:spacing w:line="360" w:lineRule="auto"/>
-        <w:jc w:val="both"/>
-        <w:rPr>
-          <w:rFonts w:ascii="Arial" w:hAnsi="Arial" w:cs="Arial"/>
-          <w:b/>
-          <w:bCs/>
-        </w:rPr>
-      </w:pPr>
-      <w:r>
-        <w:rPr>
-          <w:rFonts w:ascii="Arial" w:hAnsi="Arial" w:cs="Arial"/>
-          <w:b/>
-          <w:bCs/>
+        <w:pStyle w:val="Ttulo1"/>
+        <w:rPr>
+          <w:rFonts w:ascii="Arial" w:hAnsi="Arial" w:cs="Arial"/>
+          <w:b/>
+          <w:bCs/>
+          <w:color w:val="auto"/>
+          <w:sz w:val="24"/>
+          <w:szCs w:val="24"/>
+        </w:rPr>
+      </w:pPr>
+      <w:bookmarkStart w:id="8" w:name="_Toc238133370"/>
+      <w:r>
+        <w:rPr>
+          <w:rFonts w:ascii="Arial" w:hAnsi="Arial" w:cs="Arial"/>
+          <w:b/>
+          <w:bCs/>
+          <w:color w:val="auto"/>
+          <w:sz w:val="24"/>
+          <w:szCs w:val="24"/>
         </w:rPr>
         <w:lastRenderedPageBreak/>
-        <w:t>4. ATIVIDADES PRÁTICAS EXECUTADAS</w:t>
-      </w:r>
+        <w:t>3</w:t>
+      </w:r>
+      <w:r>
+        <w:rPr>
+          <w:rFonts w:ascii="Arial" w:hAnsi="Arial" w:cs="Arial"/>
+          <w:b/>
+          <w:bCs/>
+          <w:color w:val="auto"/>
+          <w:sz w:val="24"/>
+          <w:szCs w:val="24"/>
+        </w:rPr>
+        <w:t>. ATIVIDADES PRÁTICAS EXECUTADAS</w:t>
+      </w:r>
+      <w:bookmarkEnd w:id="8"/>
     </w:p>
     <w:p>
       <w:pPr>
@@ -3064,22 +4828,40 @@
     </w:p>
     <w:p>
       <w:pPr>
-        <w:spacing w:line="360" w:lineRule="auto"/>
-        <w:jc w:val="both"/>
-        <w:rPr>
-          <w:rFonts w:ascii="Arial" w:hAnsi="Arial" w:cs="Arial"/>
-          <w:b/>
-          <w:bCs/>
-        </w:rPr>
-      </w:pPr>
-      <w:r>
-        <w:rPr>
-          <w:rFonts w:ascii="Arial" w:hAnsi="Arial" w:cs="Arial"/>
-          <w:b/>
-          <w:bCs/>
-        </w:rPr>
-        <w:t>4.1 Banco de Dados e Modelagem Relacional</w:t>
-      </w:r>
+        <w:pStyle w:val="Ttulo2"/>
+        <w:rPr>
+          <w:rFonts w:ascii="Arial" w:hAnsi="Arial" w:cs="Arial"/>
+          <w:b/>
+          <w:bCs/>
+          <w:color w:val="auto"/>
+          <w:sz w:val="24"/>
+          <w:szCs w:val="24"/>
+        </w:rPr>
+      </w:pPr>
+      <w:bookmarkStart w:id="9" w:name="_Toc238133371"/>
+      <w:r>
+        <w:rPr>
+          <w:rFonts w:ascii="Arial" w:hAnsi="Arial" w:cs="Arial"/>
+          <w:b/>
+          <w:bCs/>
+          <w:color w:val="auto"/>
+          <w:sz w:val="24"/>
+          <w:szCs w:val="24"/>
+        </w:rPr>
+        <w:t>3</w:t>
+      </w:r>
+      <w:r>
+        <w:rPr>
+          <w:rFonts w:ascii="Arial" w:hAnsi="Arial" w:cs="Arial"/>
+          <w:b/>
+          <w:bCs/>
+          <w:color w:val="auto"/>
+          <w:sz w:val="24"/>
+          <w:szCs w:val="24"/>
+        </w:rPr>
+        <w:t>.1 Banco de Dados e Modelagem Relacional</w:t>
+      </w:r>
+      <w:bookmarkEnd w:id="9"/>
     </w:p>
     <w:p>
       <w:pPr>
@@ -3194,7 +4976,7 @@
                     <pic:cNvPicPr/>
                   </pic:nvPicPr>
                   <pic:blipFill>
-                    <a:blip r:embed="rId9">
+                    <a:blip r:embed="rId12">
                       <a:extLst>
                         <a:ext uri="{28A0092B-C50C-407E-A947-70E740481C1C}">
                           <a14:useLocalDpi xmlns:a14="http://schemas.microsoft.com/office/drawing/2010/main" val="0"/>
@@ -3236,6 +5018,7 @@
           <w:szCs w:val="20"/>
         </w:rPr>
       </w:pPr>
+      <w:bookmarkStart w:id="10" w:name="_Toc238133308"/>
       <w:r>
         <w:rPr>
           <w:rFonts w:ascii="Arial" w:hAnsi="Arial" w:cs="Arial"/>
@@ -3354,26 +5137,45 @@
         </w:rPr>
         <w:t>Sistema de Controle de Clientes e Pedidos</w:t>
       </w:r>
-    </w:p>
-    <w:p>
-      <w:pPr>
-        <w:spacing w:line="360" w:lineRule="auto"/>
-        <w:jc w:val="both"/>
-        <w:rPr>
-          <w:rFonts w:ascii="Arial" w:hAnsi="Arial" w:cs="Arial"/>
-          <w:b/>
-          <w:bCs/>
-        </w:rPr>
-      </w:pPr>
-      <w:r>
-        <w:rPr>
-          <w:rFonts w:ascii="Arial" w:hAnsi="Arial" w:cs="Arial"/>
-          <w:b/>
-          <w:bCs/>
+      <w:bookmarkEnd w:id="10"/>
+    </w:p>
+    <w:p>
+      <w:pPr>
+        <w:pStyle w:val="Ttulo2"/>
+        <w:rPr>
+          <w:rFonts w:ascii="Arial" w:hAnsi="Arial" w:cs="Arial"/>
+          <w:b/>
+          <w:bCs/>
+          <w:color w:val="auto"/>
+          <w:sz w:val="24"/>
+          <w:szCs w:val="24"/>
+        </w:rPr>
+      </w:pPr>
+      <w:bookmarkStart w:id="11" w:name="_Toc238133372"/>
+      <w:r>
+        <w:rPr>
+          <w:rFonts w:ascii="Arial" w:hAnsi="Arial" w:cs="Arial"/>
+          <w:b/>
+          <w:bCs/>
+          <w:color w:val="auto"/>
+          <w:sz w:val="24"/>
+          <w:szCs w:val="24"/>
         </w:rPr>
         <w:lastRenderedPageBreak/>
-        <w:t>4.2 Mapeamento Objeto-Relacional (Camada Model)</w:t>
-      </w:r>
+        <w:t>3</w:t>
+      </w:r>
+      <w:r>
+        <w:rPr>
+          <w:rFonts w:ascii="Arial" w:hAnsi="Arial" w:cs="Arial"/>
+          <w:b/>
+          <w:bCs/>
+          <w:color w:val="auto"/>
+          <w:sz w:val="24"/>
+          <w:szCs w:val="24"/>
+        </w:rPr>
+        <w:t>.2 Mapeamento Objeto-Relacional (Camada Model)</w:t>
+      </w:r>
+      <w:bookmarkEnd w:id="11"/>
     </w:p>
     <w:p>
       <w:pPr>
@@ -3476,21 +5278,38 @@
     </w:p>
     <w:p>
       <w:pPr>
-        <w:spacing w:line="360" w:lineRule="auto"/>
-        <w:jc w:val="both"/>
-        <w:rPr>
-          <w:rFonts w:ascii="Arial" w:hAnsi="Arial" w:cs="Arial"/>
-          <w:b/>
-          <w:bCs/>
-        </w:rPr>
-      </w:pPr>
-      <w:r>
-        <w:rPr>
-          <w:rFonts w:ascii="Arial" w:hAnsi="Arial" w:cs="Arial"/>
-          <w:b/>
-          <w:bCs/>
-        </w:rPr>
-        <w:t>4.3 Camada de Repositório (</w:t>
+        <w:pStyle w:val="Ttulo2"/>
+        <w:rPr>
+          <w:rFonts w:ascii="Arial" w:hAnsi="Arial" w:cs="Arial"/>
+          <w:b/>
+          <w:bCs/>
+          <w:color w:val="auto"/>
+          <w:sz w:val="24"/>
+          <w:szCs w:val="24"/>
+        </w:rPr>
+      </w:pPr>
+      <w:bookmarkStart w:id="12" w:name="_Toc238133373"/>
+      <w:r>
+        <w:rPr>
+          <w:rFonts w:ascii="Arial" w:hAnsi="Arial" w:cs="Arial"/>
+          <w:b/>
+          <w:bCs/>
+          <w:color w:val="auto"/>
+          <w:sz w:val="24"/>
+          <w:szCs w:val="24"/>
+        </w:rPr>
+        <w:t>3</w:t>
+      </w:r>
+      <w:r>
+        <w:rPr>
+          <w:rFonts w:ascii="Arial" w:hAnsi="Arial" w:cs="Arial"/>
+          <w:b/>
+          <w:bCs/>
+          <w:color w:val="auto"/>
+          <w:sz w:val="24"/>
+          <w:szCs w:val="24"/>
+        </w:rPr>
+        <w:t>.3 Camada de Repositório (</w:t>
       </w:r>
       <w:proofErr w:type="spellStart"/>
       <w:r>
@@ -3498,6 +5317,9 @@
           <w:rFonts w:ascii="Arial" w:hAnsi="Arial" w:cs="Arial"/>
           <w:b/>
           <w:bCs/>
+          <w:color w:val="auto"/>
+          <w:sz w:val="24"/>
+          <w:szCs w:val="24"/>
         </w:rPr>
         <w:t>Repository</w:t>
       </w:r>
@@ -3507,9 +5329,13 @@
           <w:rFonts w:ascii="Arial" w:hAnsi="Arial" w:cs="Arial"/>
           <w:b/>
           <w:bCs/>
+          <w:color w:val="auto"/>
+          <w:sz w:val="24"/>
+          <w:szCs w:val="24"/>
         </w:rPr>
         <w:t>)</w:t>
       </w:r>
+      <w:bookmarkEnd w:id="12"/>
     </w:p>
     <w:p>
       <w:pPr>
@@ -3584,22 +5410,40 @@
     </w:p>
     <w:p>
       <w:pPr>
-        <w:spacing w:line="360" w:lineRule="auto"/>
-        <w:jc w:val="both"/>
-        <w:rPr>
-          <w:rFonts w:ascii="Arial" w:hAnsi="Arial" w:cs="Arial"/>
-          <w:b/>
-          <w:bCs/>
-        </w:rPr>
-      </w:pPr>
-      <w:r>
-        <w:rPr>
-          <w:rFonts w:ascii="Arial" w:hAnsi="Arial" w:cs="Arial"/>
-          <w:b/>
-          <w:bCs/>
-        </w:rPr>
-        <w:t>4.4 Camada de Serviço e Regras Transacionais (Service)</w:t>
-      </w:r>
+        <w:pStyle w:val="Ttulo2"/>
+        <w:rPr>
+          <w:rFonts w:ascii="Arial" w:hAnsi="Arial" w:cs="Arial"/>
+          <w:b/>
+          <w:bCs/>
+          <w:color w:val="auto"/>
+          <w:sz w:val="24"/>
+          <w:szCs w:val="24"/>
+        </w:rPr>
+      </w:pPr>
+      <w:bookmarkStart w:id="13" w:name="_Toc238133374"/>
+      <w:r>
+        <w:rPr>
+          <w:rFonts w:ascii="Arial" w:hAnsi="Arial" w:cs="Arial"/>
+          <w:b/>
+          <w:bCs/>
+          <w:color w:val="auto"/>
+          <w:sz w:val="24"/>
+          <w:szCs w:val="24"/>
+        </w:rPr>
+        <w:t>3</w:t>
+      </w:r>
+      <w:r>
+        <w:rPr>
+          <w:rFonts w:ascii="Arial" w:hAnsi="Arial" w:cs="Arial"/>
+          <w:b/>
+          <w:bCs/>
+          <w:color w:val="auto"/>
+          <w:sz w:val="24"/>
+          <w:szCs w:val="24"/>
+        </w:rPr>
+        <w:t>.4 Camada de Serviço e Regras Transacionais (Service)</w:t>
+      </w:r>
+      <w:bookmarkEnd w:id="13"/>
     </w:p>
     <w:p>
       <w:pPr>
@@ -3696,21 +5540,38 @@
     </w:p>
     <w:p>
       <w:pPr>
-        <w:spacing w:line="360" w:lineRule="auto"/>
-        <w:jc w:val="both"/>
-        <w:rPr>
-          <w:rFonts w:ascii="Arial" w:hAnsi="Arial" w:cs="Arial"/>
-          <w:b/>
-          <w:bCs/>
-        </w:rPr>
-      </w:pPr>
-      <w:r>
-        <w:rPr>
-          <w:rFonts w:ascii="Arial" w:hAnsi="Arial" w:cs="Arial"/>
-          <w:b/>
-          <w:bCs/>
-        </w:rPr>
-        <w:t>4.5 Camada de Controle e Interface (</w:t>
+        <w:pStyle w:val="Ttulo2"/>
+        <w:rPr>
+          <w:rFonts w:ascii="Arial" w:hAnsi="Arial" w:cs="Arial"/>
+          <w:b/>
+          <w:bCs/>
+          <w:color w:val="auto"/>
+          <w:sz w:val="24"/>
+          <w:szCs w:val="24"/>
+        </w:rPr>
+      </w:pPr>
+      <w:bookmarkStart w:id="14" w:name="_Toc238133375"/>
+      <w:r>
+        <w:rPr>
+          <w:rFonts w:ascii="Arial" w:hAnsi="Arial" w:cs="Arial"/>
+          <w:b/>
+          <w:bCs/>
+          <w:color w:val="auto"/>
+          <w:sz w:val="24"/>
+          <w:szCs w:val="24"/>
+        </w:rPr>
+        <w:t>3</w:t>
+      </w:r>
+      <w:r>
+        <w:rPr>
+          <w:rFonts w:ascii="Arial" w:hAnsi="Arial" w:cs="Arial"/>
+          <w:b/>
+          <w:bCs/>
+          <w:color w:val="auto"/>
+          <w:sz w:val="24"/>
+          <w:szCs w:val="24"/>
+        </w:rPr>
+        <w:t>.5 Camada de Controle e Interface (</w:t>
       </w:r>
       <w:proofErr w:type="spellStart"/>
       <w:r>
@@ -3718,6 +5579,9 @@
           <w:rFonts w:ascii="Arial" w:hAnsi="Arial" w:cs="Arial"/>
           <w:b/>
           <w:bCs/>
+          <w:color w:val="auto"/>
+          <w:sz w:val="24"/>
+          <w:szCs w:val="24"/>
         </w:rPr>
         <w:t>Controller</w:t>
       </w:r>
@@ -3727,6 +5591,9 @@
           <w:rFonts w:ascii="Arial" w:hAnsi="Arial" w:cs="Arial"/>
           <w:b/>
           <w:bCs/>
+          <w:color w:val="auto"/>
+          <w:sz w:val="24"/>
+          <w:szCs w:val="24"/>
         </w:rPr>
         <w:t xml:space="preserve"> &amp; </w:t>
       </w:r>
@@ -3736,6 +5603,9 @@
           <w:rFonts w:ascii="Arial" w:hAnsi="Arial" w:cs="Arial"/>
           <w:b/>
           <w:bCs/>
+          <w:color w:val="auto"/>
+          <w:sz w:val="24"/>
+          <w:szCs w:val="24"/>
         </w:rPr>
         <w:t>View</w:t>
       </w:r>
@@ -3745,9 +5615,13 @@
           <w:rFonts w:ascii="Arial" w:hAnsi="Arial" w:cs="Arial"/>
           <w:b/>
           <w:bCs/>
+          <w:color w:val="auto"/>
+          <w:sz w:val="24"/>
+          <w:szCs w:val="24"/>
         </w:rPr>
         <w:t>)</w:t>
       </w:r>
+      <w:bookmarkEnd w:id="14"/>
     </w:p>
     <w:p>
       <w:pPr>
@@ -3915,42 +5789,60 @@
         <w:rPr>
           <w:rFonts w:ascii="Arial" w:hAnsi="Arial" w:cs="Arial"/>
         </w:rPr>
+        <w:t xml:space="preserve">Implementação de </w:t>
+      </w:r>
+      <w:proofErr w:type="spellStart"/>
+      <w:r>
+        <w:rPr>
+          <w:rFonts w:ascii="Arial" w:hAnsi="Arial" w:cs="Arial"/>
+        </w:rPr>
+        <w:t>fragments</w:t>
+      </w:r>
+      <w:proofErr w:type="spellEnd"/>
+      <w:r>
+        <w:rPr>
+          <w:rFonts w:ascii="Arial" w:hAnsi="Arial" w:cs="Arial"/>
+        </w:rPr>
+        <w:t xml:space="preserve"> reutilizáveis para o menu lateral e barra superior, garantindo consistência visual e modularidade.</w:t>
+      </w:r>
+    </w:p>
+    <w:p>
+      <w:pPr>
+        <w:pStyle w:val="Ttulo2"/>
+        <w:rPr>
+          <w:rFonts w:ascii="Arial" w:hAnsi="Arial" w:cs="Arial"/>
+          <w:b/>
+          <w:bCs/>
+          <w:color w:val="auto"/>
+          <w:sz w:val="24"/>
+          <w:szCs w:val="24"/>
+        </w:rPr>
+      </w:pPr>
+      <w:bookmarkStart w:id="15" w:name="_Toc238133376"/>
+      <w:r>
+        <w:rPr>
+          <w:rFonts w:ascii="Arial" w:hAnsi="Arial" w:cs="Arial"/>
+          <w:b/>
+          <w:bCs/>
+          <w:color w:val="auto"/>
+          <w:sz w:val="24"/>
+          <w:szCs w:val="24"/>
+        </w:rPr>
         <w:lastRenderedPageBreak/>
-        <w:t xml:space="preserve">Implementação de </w:t>
-      </w:r>
-      <w:proofErr w:type="spellStart"/>
-      <w:r>
-        <w:rPr>
-          <w:rFonts w:ascii="Arial" w:hAnsi="Arial" w:cs="Arial"/>
-        </w:rPr>
-        <w:t>fragments</w:t>
-      </w:r>
-      <w:proofErr w:type="spellEnd"/>
-      <w:r>
-        <w:rPr>
-          <w:rFonts w:ascii="Arial" w:hAnsi="Arial" w:cs="Arial"/>
-        </w:rPr>
-        <w:t xml:space="preserve"> reutilizáveis para o menu lateral e barra superior, garantindo consistência visual e modularidade.</w:t>
-      </w:r>
-    </w:p>
-    <w:p>
-      <w:pPr>
-        <w:spacing w:line="360" w:lineRule="auto"/>
-        <w:jc w:val="both"/>
-        <w:rPr>
-          <w:rFonts w:ascii="Arial" w:hAnsi="Arial" w:cs="Arial"/>
-          <w:b/>
-          <w:bCs/>
-        </w:rPr>
-      </w:pPr>
-      <w:r>
-        <w:rPr>
-          <w:rFonts w:ascii="Arial" w:hAnsi="Arial" w:cs="Arial"/>
-          <w:b/>
-          <w:bCs/>
-        </w:rPr>
-        <w:t>4.6 Validação, Testes e Implantação</w:t>
-      </w:r>
+        <w:t>3</w:t>
+      </w:r>
+      <w:r>
+        <w:rPr>
+          <w:rFonts w:ascii="Arial" w:hAnsi="Arial" w:cs="Arial"/>
+          <w:b/>
+          <w:bCs/>
+          <w:color w:val="auto"/>
+          <w:sz w:val="24"/>
+          <w:szCs w:val="24"/>
+        </w:rPr>
+        <w:t>.6 Validação, Testes e Implantação</w:t>
+      </w:r>
+      <w:bookmarkEnd w:id="15"/>
     </w:p>
     <w:p>
       <w:pPr>
@@ -4025,43 +5917,34 @@
     </w:p>
     <w:p>
       <w:pPr>
-        <w:spacing w:line="360" w:lineRule="auto"/>
-        <w:ind w:left="720"/>
-        <w:jc w:val="both"/>
-        <w:rPr>
-          <w:rFonts w:ascii="Arial" w:hAnsi="Arial" w:cs="Arial"/>
-        </w:rPr>
-      </w:pPr>
-    </w:p>
-    <w:p>
-      <w:pPr>
-        <w:ind w:left="360"/>
-        <w:rPr>
-          <w:b/>
-          <w:bCs/>
-        </w:rPr>
-      </w:pPr>
-    </w:p>
-    <w:p>
-      <w:pPr>
-        <w:pStyle w:val="PargrafodaLista"/>
+        <w:pStyle w:val="Ttulo1"/>
         <w:numPr>
           <w:ilvl w:val="1"/>
-          <w:numId w:val="20"/>
+          <w:numId w:val="28"/>
         </w:numPr>
         <w:ind w:left="284" w:hanging="284"/>
         <w:rPr>
-          <w:b/>
-          <w:bCs/>
-        </w:rPr>
-      </w:pPr>
-      <w:r>
-        <w:rPr>
-          <w:b/>
-          <w:bCs/>
+          <w:rFonts w:ascii="Arial" w:hAnsi="Arial" w:cs="Arial"/>
+          <w:b/>
+          <w:bCs/>
+          <w:color w:val="auto"/>
+          <w:sz w:val="24"/>
+          <w:szCs w:val="24"/>
+        </w:rPr>
+      </w:pPr>
+      <w:bookmarkStart w:id="16" w:name="_Toc238133377"/>
+      <w:r>
+        <w:rPr>
+          <w:rFonts w:ascii="Arial" w:hAnsi="Arial" w:cs="Arial"/>
+          <w:b/>
+          <w:bCs/>
+          <w:color w:val="auto"/>
+          <w:sz w:val="24"/>
+          <w:szCs w:val="24"/>
         </w:rPr>
         <w:t>CONCLUSÃO</w:t>
       </w:r>
+      <w:bookmarkEnd w:id="16"/>
     </w:p>
     <w:p>
       <w:pPr>
@@ -4206,6 +6089,42 @@
     </w:p>
     <w:p>
       <w:pPr>
+        <w:spacing w:line="360" w:lineRule="auto"/>
+        <w:jc w:val="both"/>
+        <w:rPr>
+          <w:rFonts w:ascii="Arial" w:hAnsi="Arial" w:cs="Arial"/>
+        </w:rPr>
+      </w:pPr>
+    </w:p>
+    <w:p>
+      <w:pPr>
+        <w:spacing w:line="360" w:lineRule="auto"/>
+        <w:jc w:val="both"/>
+        <w:rPr>
+          <w:rFonts w:ascii="Arial" w:hAnsi="Arial" w:cs="Arial"/>
+        </w:rPr>
+      </w:pPr>
+    </w:p>
+    <w:p>
+      <w:pPr>
+        <w:spacing w:line="360" w:lineRule="auto"/>
+        <w:jc w:val="both"/>
+        <w:rPr>
+          <w:rFonts w:ascii="Arial" w:hAnsi="Arial" w:cs="Arial"/>
+        </w:rPr>
+      </w:pPr>
+    </w:p>
+    <w:p>
+      <w:pPr>
+        <w:spacing w:line="360" w:lineRule="auto"/>
+        <w:jc w:val="both"/>
+        <w:rPr>
+          <w:rFonts w:ascii="Arial" w:hAnsi="Arial" w:cs="Arial"/>
+        </w:rPr>
+      </w:pPr>
+    </w:p>
+    <w:p>
+      <w:pPr>
         <w:pStyle w:val="PargrafodaLista"/>
         <w:ind w:left="284"/>
         <w:jc w:val="both"/>
@@ -4217,24 +6136,34 @@
     </w:p>
     <w:p>
       <w:pPr>
-        <w:pStyle w:val="PargrafodaLista"/>
+        <w:pStyle w:val="Ttulo1"/>
         <w:numPr>
           <w:ilvl w:val="1"/>
-          <w:numId w:val="20"/>
+          <w:numId w:val="28"/>
         </w:numPr>
         <w:ind w:left="284" w:hanging="284"/>
         <w:rPr>
-          <w:b/>
-          <w:bCs/>
-        </w:rPr>
-      </w:pPr>
-      <w:r>
-        <w:rPr>
-          <w:b/>
-          <w:bCs/>
+          <w:rFonts w:ascii="Arial" w:hAnsi="Arial" w:cs="Arial"/>
+          <w:b/>
+          <w:bCs/>
+          <w:color w:val="auto"/>
+          <w:sz w:val="24"/>
+          <w:szCs w:val="24"/>
+        </w:rPr>
+      </w:pPr>
+      <w:bookmarkStart w:id="17" w:name="_Toc238133378"/>
+      <w:r>
+        <w:rPr>
+          <w:rFonts w:ascii="Arial" w:hAnsi="Arial" w:cs="Arial"/>
+          <w:b/>
+          <w:bCs/>
+          <w:color w:val="auto"/>
+          <w:sz w:val="24"/>
+          <w:szCs w:val="24"/>
         </w:rPr>
         <w:t>REFERÊNCIAS</w:t>
       </w:r>
+      <w:bookmarkEnd w:id="17"/>
     </w:p>
     <w:p>
       <w:pPr>
@@ -4441,7 +6370,7 @@
         </w:rPr>
         <w:t xml:space="preserve">. Disponível em: https://hibernate.org/orm/documentation/ </w:t>
       </w:r>
-      <w:hyperlink r:id="rId10" w:history="1">
+      <w:hyperlink r:id="rId13" w:history="1">
         <w:r>
           <w:rPr>
             <w:rStyle w:val="Hyperlink"/>
@@ -4534,7 +6463,7 @@
         </w:rPr>
         <w:t xml:space="preserve">. Disponível em: https://www.jetbrains.com/idea/documentation/ </w:t>
       </w:r>
-      <w:hyperlink r:id="rId11" w:history="1">
+      <w:hyperlink r:id="rId14" w:history="1">
         <w:r>
           <w:rPr>
             <w:rStyle w:val="Hyperlink"/>
@@ -4677,7 +6606,7 @@
         </w:rPr>
         <w:t xml:space="preserve">. Disponível em: https://spring.io/projects/spring-boot </w:t>
       </w:r>
-      <w:hyperlink r:id="rId12" w:history="1">
+      <w:hyperlink r:id="rId15" w:history="1">
         <w:r>
           <w:rPr>
             <w:rStyle w:val="Hyperlink"/>
@@ -4742,7 +6671,7 @@
         </w:rPr>
         <w:t xml:space="preserve">. Disponível em: https://spring.io/projects/spring-data-jpa </w:t>
       </w:r>
-      <w:hyperlink r:id="rId13" w:history="1">
+      <w:hyperlink r:id="rId16" w:history="1">
         <w:r>
           <w:rPr>
             <w:rStyle w:val="Hyperlink"/>
@@ -4835,7 +6764,7 @@
         </w:rPr>
         <w:t xml:space="preserve">. Disponível em: https://www.thymeleaf.org/documentation.html </w:t>
       </w:r>
-      <w:hyperlink r:id="rId14" w:history="1">
+      <w:hyperlink r:id="rId17" w:history="1">
         <w:r>
           <w:rPr>
             <w:rStyle w:val="Hyperlink"/>
@@ -4873,9 +6802,10 @@
     <w:p/>
     <w:p/>
     <w:sectPr>
-      <w:headerReference w:type="default" r:id="rId15"/>
+      <w:headerReference w:type="default" r:id="rId18"/>
       <w:pgSz w:w="11906" w:h="16838"/>
       <w:pgMar w:top="1701" w:right="1134" w:bottom="1134" w:left="1701" w:header="709" w:footer="709" w:gutter="0"/>
+      <w:pgNumType w:start="5"/>
       <w:cols w:space="708"/>
       <w:docGrid w:linePitch="360"/>
     </w:sectPr>
@@ -4948,7 +6878,7 @@
         <wp:inline distT="0" distB="0" distL="0" distR="0" wp14:anchorId="7E252C9B" wp14:editId="5813517E">
           <wp:extent cx="2328824" cy="787948"/>
           <wp:effectExtent l="0" t="0" r="0" b="0"/>
-          <wp:docPr id="827477167" name="Imagem 1"/>
+          <wp:docPr id="72713196" name="Imagem 1"/>
           <wp:cNvGraphicFramePr>
             <a:graphicFrameLocks xmlns:a="http://schemas.openxmlformats.org/drawingml/2006/main" noChangeAspect="1"/>
           </wp:cNvGraphicFramePr>
@@ -4995,6 +6925,158 @@
 </w:hdr>
 </file>
 
+<file path=word/header2.xml><?xml version="1.0" encoding="utf-8"?>
+<w:hdr xmlns:wpc="http://schemas.microsoft.com/office/word/2010/wordprocessingCanvas" xmlns:cx="http://schemas.microsoft.com/office/drawing/2014/chartex" xmlns:cx1="http://schemas.microsoft.com/office/drawing/2015/9/8/chartex" xmlns:cx2="http://schemas.microsoft.com/office/drawing/2015/10/21/chartex" xmlns:cx3="http://schemas.microsoft.com/office/drawing/2016/5/9/chartex" xmlns:cx4="http://schemas.microsoft.com/office/drawing/2016/5/10/chartex" xmlns:cx5="http://schemas.microsoft.com/office/drawing/2016/5/11/chartex" xmlns:cx6="http://schemas.microsoft.com/office/drawing/2016/5/12/chartex" xmlns:cx7="http://schemas.microsoft.com/office/drawing/2016/5/13/chartex" xmlns:cx8="http://schemas.microsoft.com/office/drawing/2016/5/14/chartex" xmlns:mc="http://schemas.openxmlformats.org/markup-compatibility/2006" xmlns:aink="http://schemas.microsoft.com/office/drawing/2016/ink" xmlns:am3d="http://schemas.microsoft.com/office/drawing/2017/model3d" xmlns:o="urn:schemas-microsoft-com:office:office" xmlns:oel="http://schemas.microsoft.com/office/2019/extlst" xmlns:r="http://schemas.openxmlformats.org/officeDocument/2006/relationships" xmlns:m="http://schemas.openxmlformats.org/officeDocument/2006/math" xmlns:v="urn:schemas-microsoft-com:vml" xmlns:wp14="http://schemas.microsoft.com/office/word/2010/wordprocessingDrawing" xmlns:wp="http://schemas.openxmlformats.org/drawingml/2006/wordprocessingDrawing" xmlns:w10="urn:schemas-microsoft-com:office:word" xmlns:w="http://schemas.openxmlformats.org/wordprocessingml/2006/main" xmlns:w14="http://schemas.microsoft.com/office/word/2010/wordml" xmlns:w15="http://schemas.microsoft.com/office/word/2012/wordml" xmlns:w16cei="http://schemas.microsoft.com/office/word/2026/wordml/cei" xmlns:w16cex="http://schemas.microsoft.com/office/word/2018/wordml/cex" xmlns:w16cid="http://schemas.microsoft.com/office/word/2016/wordml/cid" xmlns:w16="http://schemas.microsoft.com/office/word/2018/wordml" xmlns:w16du="http://schemas.microsoft.com/office/word/2023/wordml/word16du" xmlns:w16sdtdh="http://schemas.microsoft.com/office/word/2020/wordml/sdtdatahash" xmlns:w16sdtfl="http://schemas.microsoft.com/office/word/2024/wordml/sdtformatlock" xmlns:w16se="http://schemas.microsoft.com/office/word/2015/wordml/symex" xmlns:wpg="http://schemas.microsoft.com/office/word/2010/wordprocessingGroup" xmlns:wpi="http://schemas.microsoft.com/office/word/2010/wordprocessingInk" xmlns:wne="http://schemas.microsoft.com/office/word/2006/wordml" xmlns:wps="http://schemas.microsoft.com/office/word/2010/wordprocessingShape" mc:Ignorable="w14 w15 w16se w16cid w16 w16cex w16sdtdh w16sdtfl w16du wp14">
+  <w:p>
+    <w:pPr>
+      <w:pStyle w:val="Cabealho"/>
+      <w:jc w:val="right"/>
+    </w:pPr>
+  </w:p>
+  <w:p>
+    <w:pPr>
+      <w:pStyle w:val="Cabealho"/>
+      <w:jc w:val="center"/>
+    </w:pPr>
+    <w:r>
+      <w:rPr>
+        <w:noProof/>
+      </w:rPr>
+      <w:drawing>
+        <wp:inline distT="0" distB="0" distL="0" distR="0" wp14:anchorId="46E220B6" wp14:editId="6C0DC6FF">
+          <wp:extent cx="2328824" cy="787948"/>
+          <wp:effectExtent l="0" t="0" r="0" b="0"/>
+          <wp:docPr id="743620229" name="Imagem 1"/>
+          <wp:cNvGraphicFramePr>
+            <a:graphicFrameLocks xmlns:a="http://schemas.openxmlformats.org/drawingml/2006/main" noChangeAspect="1"/>
+          </wp:cNvGraphicFramePr>
+          <a:graphic xmlns:a="http://schemas.openxmlformats.org/drawingml/2006/main">
+            <a:graphicData uri="http://schemas.openxmlformats.org/drawingml/2006/picture">
+              <pic:pic xmlns:pic="http://schemas.openxmlformats.org/drawingml/2006/picture">
+                <pic:nvPicPr>
+                  <pic:cNvPr id="795029229" name="Imagem 795029229"/>
+                  <pic:cNvPicPr/>
+                </pic:nvPicPr>
+                <pic:blipFill>
+                  <a:blip r:embed="rId1">
+                    <a:extLst>
+                      <a:ext uri="{28A0092B-C50C-407E-A947-70E740481C1C}">
+                        <a14:useLocalDpi xmlns:a14="http://schemas.microsoft.com/office/drawing/2010/main" val="0"/>
+                      </a:ext>
+                    </a:extLst>
+                  </a:blip>
+                  <a:stretch>
+                    <a:fillRect/>
+                  </a:stretch>
+                </pic:blipFill>
+                <pic:spPr>
+                  <a:xfrm>
+                    <a:off x="0" y="0"/>
+                    <a:ext cx="2398792" cy="811621"/>
+                  </a:xfrm>
+                  <a:prstGeom prst="rect">
+                    <a:avLst/>
+                  </a:prstGeom>
+                </pic:spPr>
+              </pic:pic>
+            </a:graphicData>
+          </a:graphic>
+        </wp:inline>
+      </w:drawing>
+    </w:r>
+  </w:p>
+</w:hdr>
+</file>
+
+<file path=word/header3.xml><?xml version="1.0" encoding="utf-8"?>
+<w:hdr xmlns:wpc="http://schemas.microsoft.com/office/word/2010/wordprocessingCanvas" xmlns:cx="http://schemas.microsoft.com/office/drawing/2014/chartex" xmlns:cx1="http://schemas.microsoft.com/office/drawing/2015/9/8/chartex" xmlns:cx2="http://schemas.microsoft.com/office/drawing/2015/10/21/chartex" xmlns:cx3="http://schemas.microsoft.com/office/drawing/2016/5/9/chartex" xmlns:cx4="http://schemas.microsoft.com/office/drawing/2016/5/10/chartex" xmlns:cx5="http://schemas.microsoft.com/office/drawing/2016/5/11/chartex" xmlns:cx6="http://schemas.microsoft.com/office/drawing/2016/5/12/chartex" xmlns:cx7="http://schemas.microsoft.com/office/drawing/2016/5/13/chartex" xmlns:cx8="http://schemas.microsoft.com/office/drawing/2016/5/14/chartex" xmlns:mc="http://schemas.openxmlformats.org/markup-compatibility/2006" xmlns:aink="http://schemas.microsoft.com/office/drawing/2016/ink" xmlns:am3d="http://schemas.microsoft.com/office/drawing/2017/model3d" xmlns:o="urn:schemas-microsoft-com:office:office" xmlns:oel="http://schemas.microsoft.com/office/2019/extlst" xmlns:r="http://schemas.openxmlformats.org/officeDocument/2006/relationships" xmlns:m="http://schemas.openxmlformats.org/officeDocument/2006/math" xmlns:v="urn:schemas-microsoft-com:vml" xmlns:wp14="http://schemas.microsoft.com/office/word/2010/wordprocessingDrawing" xmlns:wp="http://schemas.openxmlformats.org/drawingml/2006/wordprocessingDrawing" xmlns:w10="urn:schemas-microsoft-com:office:word" xmlns:w="http://schemas.openxmlformats.org/wordprocessingml/2006/main" xmlns:w14="http://schemas.microsoft.com/office/word/2010/wordml" xmlns:w15="http://schemas.microsoft.com/office/word/2012/wordml" xmlns:w16cei="http://schemas.microsoft.com/office/word/2026/wordml/cei" xmlns:w16cex="http://schemas.microsoft.com/office/word/2018/wordml/cex" xmlns:w16cid="http://schemas.microsoft.com/office/word/2016/wordml/cid" xmlns:w16="http://schemas.microsoft.com/office/word/2018/wordml" xmlns:w16du="http://schemas.microsoft.com/office/word/2023/wordml/word16du" xmlns:w16sdtdh="http://schemas.microsoft.com/office/word/2020/wordml/sdtdatahash" xmlns:w16sdtfl="http://schemas.microsoft.com/office/word/2024/wordml/sdtformatlock" xmlns:w16se="http://schemas.microsoft.com/office/word/2015/wordml/symex" xmlns:wpg="http://schemas.microsoft.com/office/word/2010/wordprocessingGroup" xmlns:wpi="http://schemas.microsoft.com/office/word/2010/wordprocessingInk" xmlns:wne="http://schemas.microsoft.com/office/word/2006/wordml" xmlns:wps="http://schemas.microsoft.com/office/word/2010/wordprocessingShape" mc:Ignorable="w14 w15 w16se w16cid w16 w16cex w16sdtdh w16sdtfl w16du wp14">
+  <w:sdt>
+    <w:sdtPr>
+      <w:id w:val="877209390"/>
+      <w:docPartObj>
+        <w:docPartGallery w:val="Page Numbers (Top of Page)"/>
+        <w:docPartUnique/>
+      </w:docPartObj>
+    </w:sdtPr>
+    <w:sdtContent>
+      <w:p>
+        <w:pPr>
+          <w:pStyle w:val="Cabealho"/>
+          <w:jc w:val="right"/>
+        </w:pPr>
+        <w:r>
+          <w:fldChar w:fldCharType="begin"/>
+        </w:r>
+        <w:r>
+          <w:instrText>PAGE   \* MERGEFORMAT</w:instrText>
+        </w:r>
+        <w:r>
+          <w:fldChar w:fldCharType="separate"/>
+        </w:r>
+        <w:r>
+          <w:t>2</w:t>
+        </w:r>
+        <w:r>
+          <w:fldChar w:fldCharType="end"/>
+        </w:r>
+      </w:p>
+    </w:sdtContent>
+  </w:sdt>
+  <w:p>
+    <w:pPr>
+      <w:pStyle w:val="Cabealho"/>
+      <w:jc w:val="center"/>
+    </w:pPr>
+    <w:r>
+      <w:rPr>
+        <w:noProof/>
+      </w:rPr>
+      <w:drawing>
+        <wp:inline distT="0" distB="0" distL="0" distR="0" wp14:anchorId="42EA62E0" wp14:editId="34E00849">
+          <wp:extent cx="2328824" cy="787948"/>
+          <wp:effectExtent l="0" t="0" r="0" b="0"/>
+          <wp:docPr id="1364563804" name="Imagem 1"/>
+          <wp:cNvGraphicFramePr>
+            <a:graphicFrameLocks xmlns:a="http://schemas.openxmlformats.org/drawingml/2006/main" noChangeAspect="1"/>
+          </wp:cNvGraphicFramePr>
+          <a:graphic xmlns:a="http://schemas.openxmlformats.org/drawingml/2006/main">
+            <a:graphicData uri="http://schemas.openxmlformats.org/drawingml/2006/picture">
+              <pic:pic xmlns:pic="http://schemas.openxmlformats.org/drawingml/2006/picture">
+                <pic:nvPicPr>
+                  <pic:cNvPr id="795029229" name="Imagem 795029229"/>
+                  <pic:cNvPicPr/>
+                </pic:nvPicPr>
+                <pic:blipFill>
+                  <a:blip r:embed="rId1">
+                    <a:extLst>
+                      <a:ext uri="{28A0092B-C50C-407E-A947-70E740481C1C}">
+                        <a14:useLocalDpi xmlns:a14="http://schemas.microsoft.com/office/drawing/2010/main" val="0"/>
+                      </a:ext>
+                    </a:extLst>
+                  </a:blip>
+                  <a:stretch>
+                    <a:fillRect/>
+                  </a:stretch>
+                </pic:blipFill>
+                <pic:spPr>
+                  <a:xfrm>
+                    <a:off x="0" y="0"/>
+                    <a:ext cx="2398792" cy="811621"/>
+                  </a:xfrm>
+                  <a:prstGeom prst="rect">
+                    <a:avLst/>
+                  </a:prstGeom>
+                </pic:spPr>
+              </pic:pic>
+            </a:graphicData>
+          </a:graphic>
+        </wp:inline>
+      </w:drawing>
+    </w:r>
+  </w:p>
+</w:hdr>
+</file>
+
 <file path=word/numbering.xml><?xml version="1.0" encoding="utf-8"?>
 <w:numbering xmlns:wpc="http://schemas.microsoft.com/office/word/2010/wordprocessingCanvas" xmlns:cx="http://schemas.microsoft.com/office/drawing/2014/chartex" xmlns:cx1="http://schemas.microsoft.com/office/drawing/2015/9/8/chartex" xmlns:cx2="http://schemas.microsoft.com/office/drawing/2015/10/21/chartex" xmlns:cx3="http://schemas.microsoft.com/office/drawing/2016/5/9/chartex" xmlns:cx4="http://schemas.microsoft.com/office/drawing/2016/5/10/chartex" xmlns:cx5="http://schemas.microsoft.com/office/drawing/2016/5/11/chartex" xmlns:cx6="http://schemas.microsoft.com/office/drawing/2016/5/12/chartex" xmlns:cx7="http://schemas.microsoft.com/office/drawing/2016/5/13/chartex" xmlns:cx8="http://schemas.microsoft.com/office/drawing/2016/5/14/chartex" xmlns:mc="http://schemas.openxmlformats.org/markup-compatibility/2006" xmlns:aink="http://schemas.microsoft.com/office/drawing/2016/ink" xmlns:am3d="http://schemas.microsoft.com/office/drawing/2017/model3d" xmlns:o="urn:schemas-microsoft-com:office:office" xmlns:oel="http://schemas.microsoft.com/office/2019/extlst" xmlns:r="http://schemas.openxmlformats.org/officeDocument/2006/relationships" xmlns:m="http://schemas.openxmlformats.org/officeDocument/2006/math" xmlns:v="urn:schemas-microsoft-com:vml" xmlns:wp14="http://schemas.microsoft.com/office/word/2010/wordprocessingDrawing" xmlns:wp="http://schemas.openxmlformats.org/drawingml/2006/wordprocessingDrawing" xmlns:w10="urn:schemas-microsoft-com:office:word" xmlns:w="http://schemas.openxmlformats.org/wordprocessingml/2006/main" xmlns:w14="http://schemas.microsoft.com/office/word/2010/wordml" xmlns:w15="http://schemas.microsoft.com/office/word/2012/wordml" xmlns:w16cei="http://schemas.microsoft.com/office/word/2026/wordml/cei" xmlns:w16cex="http://schemas.microsoft.com/office/word/2018/wordml/cex" xmlns:w16cid="http://schemas.microsoft.com/office/word/2016/wordml/cid" xmlns:w16="http://schemas.microsoft.com/office/word/2018/wordml" xmlns:w16du="http://schemas.microsoft.com/office/word/2023/wordml/word16du" xmlns:w16sdtdh="http://schemas.microsoft.com/office/word/2020/wordml/sdtdatahash" xmlns:w16sdtfl="http://schemas.microsoft.com/office/word/2024/wordml/sdtformatlock" xmlns:w16se="http://schemas.microsoft.com/office/word/2015/wordml/symex" xmlns:wpg="http://schemas.microsoft.com/office/word/2010/wordprocessingGroup" xmlns:wpi="http://schemas.microsoft.com/office/word/2010/wordprocessingInk" xmlns:wne="http://schemas.microsoft.com/office/word/2006/wordml" xmlns:wps="http://schemas.microsoft.com/office/word/2010/wordprocessingShape" mc:Ignorable="w14 w15 w16se w16cid w16 w16cex w16sdtdh w16sdtfl w16du wp14">
   <w:abstractNum w:abstractNumId="0" w15:restartNumberingAfterBreak="0">
@@ -5639,6 +7721,95 @@
     </w:lvl>
   </w:abstractNum>
   <w:abstractNum w:abstractNumId="5" w15:restartNumberingAfterBreak="0">
+    <w:nsid w:val="1E596B49"/>
+    <w:multiLevelType w:val="hybridMultilevel"/>
+    <w:tmpl w:val="CCCEAF1A"/>
+    <w:lvl w:ilvl="0" w:tplc="0416000F">
+      <w:start w:val="1"/>
+      <w:numFmt w:val="decimal"/>
+      <w:lvlText w:val="%1."/>
+      <w:lvlJc w:val="left"/>
+      <w:pPr>
+        <w:ind w:left="720" w:hanging="360"/>
+      </w:pPr>
+      <w:rPr>
+        <w:rFonts w:hint="default"/>
+      </w:rPr>
+    </w:lvl>
+    <w:lvl w:ilvl="1" w:tplc="04160019" w:tentative="1">
+      <w:start w:val="1"/>
+      <w:numFmt w:val="lowerLetter"/>
+      <w:lvlText w:val="%2."/>
+      <w:lvlJc w:val="left"/>
+      <w:pPr>
+        <w:ind w:left="1440" w:hanging="360"/>
+      </w:pPr>
+    </w:lvl>
+    <w:lvl w:ilvl="2" w:tplc="0416001B" w:tentative="1">
+      <w:start w:val="1"/>
+      <w:numFmt w:val="lowerRoman"/>
+      <w:lvlText w:val="%3."/>
+      <w:lvlJc w:val="right"/>
+      <w:pPr>
+        <w:ind w:left="2160" w:hanging="180"/>
+      </w:pPr>
+    </w:lvl>
+    <w:lvl w:ilvl="3" w:tplc="0416000F" w:tentative="1">
+      <w:start w:val="1"/>
+      <w:numFmt w:val="decimal"/>
+      <w:lvlText w:val="%4."/>
+      <w:lvlJc w:val="left"/>
+      <w:pPr>
+        <w:ind w:left="2880" w:hanging="360"/>
+      </w:pPr>
+    </w:lvl>
+    <w:lvl w:ilvl="4" w:tplc="04160019" w:tentative="1">
+      <w:start w:val="1"/>
+      <w:numFmt w:val="lowerLetter"/>
+      <w:lvlText w:val="%5."/>
+      <w:lvlJc w:val="left"/>
+      <w:pPr>
+        <w:ind w:left="3600" w:hanging="360"/>
+      </w:pPr>
+    </w:lvl>
+    <w:lvl w:ilvl="5" w:tplc="0416001B" w:tentative="1">
+      <w:start w:val="1"/>
+      <w:numFmt w:val="lowerRoman"/>
+      <w:lvlText w:val="%6."/>
+      <w:lvlJc w:val="right"/>
+      <w:pPr>
+        <w:ind w:left="4320" w:hanging="180"/>
+      </w:pPr>
+    </w:lvl>
+    <w:lvl w:ilvl="6" w:tplc="0416000F" w:tentative="1">
+      <w:start w:val="1"/>
+      <w:numFmt w:val="decimal"/>
+      <w:lvlText w:val="%7."/>
+      <w:lvlJc w:val="left"/>
+      <w:pPr>
+        <w:ind w:left="5040" w:hanging="360"/>
+      </w:pPr>
+    </w:lvl>
+    <w:lvl w:ilvl="7" w:tplc="04160019" w:tentative="1">
+      <w:start w:val="1"/>
+      <w:numFmt w:val="lowerLetter"/>
+      <w:lvlText w:val="%8."/>
+      <w:lvlJc w:val="left"/>
+      <w:pPr>
+        <w:ind w:left="5760" w:hanging="360"/>
+      </w:pPr>
+    </w:lvl>
+    <w:lvl w:ilvl="8" w:tplc="0416001B" w:tentative="1">
+      <w:start w:val="1"/>
+      <w:numFmt w:val="lowerRoman"/>
+      <w:lvlText w:val="%9."/>
+      <w:lvlJc w:val="right"/>
+      <w:pPr>
+        <w:ind w:left="6480" w:hanging="180"/>
+      </w:pPr>
+    </w:lvl>
+  </w:abstractNum>
+  <w:abstractNum w:abstractNumId="6" w15:restartNumberingAfterBreak="0">
     <w:nsid w:val="21F31F05"/>
     <w:multiLevelType w:val="multilevel"/>
     <w:tmpl w:val="7304FAF0"/>
@@ -5787,7 +7958,7 @@
       </w:rPr>
     </w:lvl>
   </w:abstractNum>
-  <w:abstractNum w:abstractNumId="6" w15:restartNumberingAfterBreak="0">
+  <w:abstractNum w:abstractNumId="7" w15:restartNumberingAfterBreak="0">
     <w:nsid w:val="282427B2"/>
     <w:multiLevelType w:val="multilevel"/>
     <w:tmpl w:val="1EAC207E"/>
@@ -5900,7 +8071,7 @@
       </w:pPr>
     </w:lvl>
   </w:abstractNum>
-  <w:abstractNum w:abstractNumId="7" w15:restartNumberingAfterBreak="0">
+  <w:abstractNum w:abstractNumId="8" w15:restartNumberingAfterBreak="0">
     <w:nsid w:val="2CA0339E"/>
     <w:multiLevelType w:val="hybridMultilevel"/>
     <w:tmpl w:val="069CEF46"/>
@@ -6013,7 +8184,7 @@
       </w:rPr>
     </w:lvl>
   </w:abstractNum>
-  <w:abstractNum w:abstractNumId="8" w15:restartNumberingAfterBreak="0">
+  <w:abstractNum w:abstractNumId="9" w15:restartNumberingAfterBreak="0">
     <w:nsid w:val="31792F63"/>
     <w:multiLevelType w:val="multilevel"/>
     <w:tmpl w:val="36DE663C"/>
@@ -6126,7 +8297,7 @@
       </w:pPr>
     </w:lvl>
   </w:abstractNum>
-  <w:abstractNum w:abstractNumId="9" w15:restartNumberingAfterBreak="0">
+  <w:abstractNum w:abstractNumId="10" w15:restartNumberingAfterBreak="0">
     <w:nsid w:val="3F5730EC"/>
     <w:multiLevelType w:val="multilevel"/>
     <w:tmpl w:val="30802FBA"/>
@@ -6275,10 +8446,10 @@
       </w:rPr>
     </w:lvl>
   </w:abstractNum>
-  <w:abstractNum w:abstractNumId="10" w15:restartNumberingAfterBreak="0">
+  <w:abstractNum w:abstractNumId="11" w15:restartNumberingAfterBreak="0">
     <w:nsid w:val="40455AF4"/>
     <w:multiLevelType w:val="multilevel"/>
-    <w:tmpl w:val="03145B52"/>
+    <w:tmpl w:val="72FEE604"/>
     <w:lvl w:ilvl="0">
       <w:start w:val="1"/>
       <w:numFmt w:val="bullet"/>
@@ -6295,20 +8466,16 @@
         <w:sz w:val="20"/>
       </w:rPr>
     </w:lvl>
-    <w:lvl w:ilvl="1" w:tentative="1">
-      <w:start w:val="1"/>
-      <w:numFmt w:val="bullet"/>
-      <w:lvlText w:val="o"/>
-      <w:lvlJc w:val="left"/>
-      <w:pPr>
-        <w:tabs>
-          <w:tab w:val="num" w:pos="1440"/>
-        </w:tabs>
+    <w:lvl w:ilvl="1">
+      <w:start w:val="4"/>
+      <w:numFmt w:val="decimal"/>
+      <w:lvlText w:val="%2."/>
+      <w:lvlJc w:val="left"/>
+      <w:pPr>
         <w:ind w:left="1440" w:hanging="360"/>
       </w:pPr>
       <w:rPr>
-        <w:rFonts w:ascii="Courier New" w:hAnsi="Courier New" w:hint="default"/>
-        <w:sz w:val="20"/>
+        <w:rFonts w:hint="default"/>
       </w:rPr>
     </w:lvl>
     <w:lvl w:ilvl="2" w:tentative="1">
@@ -6424,7 +8591,7 @@
       </w:rPr>
     </w:lvl>
   </w:abstractNum>
-  <w:abstractNum w:abstractNumId="11" w15:restartNumberingAfterBreak="0">
+  <w:abstractNum w:abstractNumId="12" w15:restartNumberingAfterBreak="0">
     <w:nsid w:val="42DF35CA"/>
     <w:multiLevelType w:val="multilevel"/>
     <w:tmpl w:val="A7863998"/>
@@ -6573,7 +8740,7 @@
       </w:rPr>
     </w:lvl>
   </w:abstractNum>
-  <w:abstractNum w:abstractNumId="12" w15:restartNumberingAfterBreak="0">
+  <w:abstractNum w:abstractNumId="13" w15:restartNumberingAfterBreak="0">
     <w:nsid w:val="4473221F"/>
     <w:multiLevelType w:val="multilevel"/>
     <w:tmpl w:val="782A5B36"/>
@@ -6722,7 +8889,7 @@
       </w:rPr>
     </w:lvl>
   </w:abstractNum>
-  <w:abstractNum w:abstractNumId="13" w15:restartNumberingAfterBreak="0">
+  <w:abstractNum w:abstractNumId="14" w15:restartNumberingAfterBreak="0">
     <w:nsid w:val="45841F74"/>
     <w:multiLevelType w:val="multilevel"/>
     <w:tmpl w:val="9B92B342"/>
@@ -6835,7 +9002,7 @@
       </w:pPr>
     </w:lvl>
   </w:abstractNum>
-  <w:abstractNum w:abstractNumId="14" w15:restartNumberingAfterBreak="0">
+  <w:abstractNum w:abstractNumId="15" w15:restartNumberingAfterBreak="0">
     <w:nsid w:val="463C3275"/>
     <w:multiLevelType w:val="multilevel"/>
     <w:tmpl w:val="D0609498"/>
@@ -6984,7 +9151,7 @@
       </w:rPr>
     </w:lvl>
   </w:abstractNum>
-  <w:abstractNum w:abstractNumId="15" w15:restartNumberingAfterBreak="0">
+  <w:abstractNum w:abstractNumId="16" w15:restartNumberingAfterBreak="0">
     <w:nsid w:val="47C34EA7"/>
     <w:multiLevelType w:val="multilevel"/>
     <w:tmpl w:val="367224A4"/>
@@ -7133,7 +9300,7 @@
       </w:rPr>
     </w:lvl>
   </w:abstractNum>
-  <w:abstractNum w:abstractNumId="16" w15:restartNumberingAfterBreak="0">
+  <w:abstractNum w:abstractNumId="17" w15:restartNumberingAfterBreak="0">
     <w:nsid w:val="48605981"/>
     <w:multiLevelType w:val="hybridMultilevel"/>
     <w:tmpl w:val="B30A1F4A"/>
@@ -7223,7 +9390,7 @@
       </w:pPr>
     </w:lvl>
   </w:abstractNum>
-  <w:abstractNum w:abstractNumId="17" w15:restartNumberingAfterBreak="0">
+  <w:abstractNum w:abstractNumId="18" w15:restartNumberingAfterBreak="0">
     <w:nsid w:val="598804C2"/>
     <w:multiLevelType w:val="hybridMultilevel"/>
     <w:tmpl w:val="10981A90"/>
@@ -7336,7 +9503,96 @@
       </w:rPr>
     </w:lvl>
   </w:abstractNum>
-  <w:abstractNum w:abstractNumId="18" w15:restartNumberingAfterBreak="0">
+  <w:abstractNum w:abstractNumId="19" w15:restartNumberingAfterBreak="0">
+    <w:nsid w:val="699376E0"/>
+    <w:multiLevelType w:val="hybridMultilevel"/>
+    <w:tmpl w:val="CEC87FAE"/>
+    <w:lvl w:ilvl="0" w:tplc="0416000F">
+      <w:start w:val="1"/>
+      <w:numFmt w:val="decimal"/>
+      <w:lvlText w:val="%1."/>
+      <w:lvlJc w:val="left"/>
+      <w:pPr>
+        <w:ind w:left="720" w:hanging="360"/>
+      </w:pPr>
+      <w:rPr>
+        <w:rFonts w:hint="default"/>
+      </w:rPr>
+    </w:lvl>
+    <w:lvl w:ilvl="1" w:tplc="04160019" w:tentative="1">
+      <w:start w:val="1"/>
+      <w:numFmt w:val="lowerLetter"/>
+      <w:lvlText w:val="%2."/>
+      <w:lvlJc w:val="left"/>
+      <w:pPr>
+        <w:ind w:left="1440" w:hanging="360"/>
+      </w:pPr>
+    </w:lvl>
+    <w:lvl w:ilvl="2" w:tplc="0416001B" w:tentative="1">
+      <w:start w:val="1"/>
+      <w:numFmt w:val="lowerRoman"/>
+      <w:lvlText w:val="%3."/>
+      <w:lvlJc w:val="right"/>
+      <w:pPr>
+        <w:ind w:left="2160" w:hanging="180"/>
+      </w:pPr>
+    </w:lvl>
+    <w:lvl w:ilvl="3" w:tplc="0416000F" w:tentative="1">
+      <w:start w:val="1"/>
+      <w:numFmt w:val="decimal"/>
+      <w:lvlText w:val="%4."/>
+      <w:lvlJc w:val="left"/>
+      <w:pPr>
+        <w:ind w:left="2880" w:hanging="360"/>
+      </w:pPr>
+    </w:lvl>
+    <w:lvl w:ilvl="4" w:tplc="04160019" w:tentative="1">
+      <w:start w:val="1"/>
+      <w:numFmt w:val="lowerLetter"/>
+      <w:lvlText w:val="%5."/>
+      <w:lvlJc w:val="left"/>
+      <w:pPr>
+        <w:ind w:left="3600" w:hanging="360"/>
+      </w:pPr>
+    </w:lvl>
+    <w:lvl w:ilvl="5" w:tplc="0416001B" w:tentative="1">
+      <w:start w:val="1"/>
+      <w:numFmt w:val="lowerRoman"/>
+      <w:lvlText w:val="%6."/>
+      <w:lvlJc w:val="right"/>
+      <w:pPr>
+        <w:ind w:left="4320" w:hanging="180"/>
+      </w:pPr>
+    </w:lvl>
+    <w:lvl w:ilvl="6" w:tplc="0416000F" w:tentative="1">
+      <w:start w:val="1"/>
+      <w:numFmt w:val="decimal"/>
+      <w:lvlText w:val="%7."/>
+      <w:lvlJc w:val="left"/>
+      <w:pPr>
+        <w:ind w:left="5040" w:hanging="360"/>
+      </w:pPr>
+    </w:lvl>
+    <w:lvl w:ilvl="7" w:tplc="04160019" w:tentative="1">
+      <w:start w:val="1"/>
+      <w:numFmt w:val="lowerLetter"/>
+      <w:lvlText w:val="%8."/>
+      <w:lvlJc w:val="left"/>
+      <w:pPr>
+        <w:ind w:left="5760" w:hanging="360"/>
+      </w:pPr>
+    </w:lvl>
+    <w:lvl w:ilvl="8" w:tplc="0416001B" w:tentative="1">
+      <w:start w:val="1"/>
+      <w:numFmt w:val="lowerRoman"/>
+      <w:lvlText w:val="%9."/>
+      <w:lvlJc w:val="right"/>
+      <w:pPr>
+        <w:ind w:left="6480" w:hanging="180"/>
+      </w:pPr>
+    </w:lvl>
+  </w:abstractNum>
+  <w:abstractNum w:abstractNumId="20" w15:restartNumberingAfterBreak="0">
     <w:nsid w:val="6DAF25DF"/>
     <w:multiLevelType w:val="multilevel"/>
     <w:tmpl w:val="1D1C0096"/>
@@ -7485,7 +9741,7 @@
       </w:rPr>
     </w:lvl>
   </w:abstractNum>
-  <w:abstractNum w:abstractNumId="19" w15:restartNumberingAfterBreak="0">
+  <w:abstractNum w:abstractNumId="21" w15:restartNumberingAfterBreak="0">
     <w:nsid w:val="6F0D077F"/>
     <w:multiLevelType w:val="multilevel"/>
     <w:tmpl w:val="5E0EB716"/>
@@ -7630,7 +9886,7 @@
       </w:rPr>
     </w:lvl>
   </w:abstractNum>
-  <w:abstractNum w:abstractNumId="20" w15:restartNumberingAfterBreak="0">
+  <w:abstractNum w:abstractNumId="22" w15:restartNumberingAfterBreak="0">
     <w:nsid w:val="74CE5D63"/>
     <w:multiLevelType w:val="multilevel"/>
     <w:tmpl w:val="E5023D48"/>
@@ -7779,7 +10035,7 @@
       </w:rPr>
     </w:lvl>
   </w:abstractNum>
-  <w:abstractNum w:abstractNumId="21" w15:restartNumberingAfterBreak="0">
+  <w:abstractNum w:abstractNumId="23" w15:restartNumberingAfterBreak="0">
     <w:nsid w:val="7BFB17D0"/>
     <w:multiLevelType w:val="hybridMultilevel"/>
     <w:tmpl w:val="99806EDE"/>
@@ -7892,7 +10148,7 @@
       </w:rPr>
     </w:lvl>
   </w:abstractNum>
-  <w:abstractNum w:abstractNumId="22" w15:restartNumberingAfterBreak="0">
+  <w:abstractNum w:abstractNumId="24" w15:restartNumberingAfterBreak="0">
     <w:nsid w:val="7E752C3C"/>
     <w:multiLevelType w:val="multilevel"/>
     <w:tmpl w:val="656658D0"/>
@@ -8005,7 +10261,7 @@
       </w:pPr>
     </w:lvl>
   </w:abstractNum>
-  <w:abstractNum w:abstractNumId="23" w15:restartNumberingAfterBreak="0">
+  <w:abstractNum w:abstractNumId="25" w15:restartNumberingAfterBreak="0">
     <w:nsid w:val="7E961EC0"/>
     <w:multiLevelType w:val="multilevel"/>
     <w:tmpl w:val="EB022F80"/>
@@ -8158,7 +10414,7 @@
     <w:abstractNumId w:val="2"/>
   </w:num>
   <w:num w:numId="2" w16cid:durableId="1146707384">
-    <w:abstractNumId w:val="8"/>
+    <w:abstractNumId w:val="9"/>
     <w:lvlOverride w:ilvl="0">
       <w:lvl w:ilvl="0">
         <w:numFmt w:val="decimal"/>
@@ -8171,7 +10427,7 @@
     <w:abstractNumId w:val="1"/>
   </w:num>
   <w:num w:numId="4" w16cid:durableId="446507846">
-    <w:abstractNumId w:val="22"/>
+    <w:abstractNumId w:val="24"/>
     <w:lvlOverride w:ilvl="0">
       <w:lvl w:ilvl="0">
         <w:numFmt w:val="decimal"/>
@@ -8191,10 +10447,10 @@
     </w:lvlOverride>
   </w:num>
   <w:num w:numId="6" w16cid:durableId="1107194383">
-    <w:abstractNumId w:val="13"/>
+    <w:abstractNumId w:val="14"/>
   </w:num>
   <w:num w:numId="7" w16cid:durableId="926882524">
-    <w:abstractNumId w:val="20"/>
+    <w:abstractNumId w:val="22"/>
   </w:num>
   <w:num w:numId="8" w16cid:durableId="1227381372">
     <w:abstractNumId w:val="4"/>
@@ -8267,52 +10523,58 @@
     </w:lvlOverride>
   </w:num>
   <w:num w:numId="13" w16cid:durableId="105462992">
-    <w:abstractNumId w:val="14"/>
+    <w:abstractNumId w:val="15"/>
   </w:num>
   <w:num w:numId="14" w16cid:durableId="1411384324">
-    <w:abstractNumId w:val="16"/>
+    <w:abstractNumId w:val="17"/>
   </w:num>
   <w:num w:numId="15" w16cid:durableId="1399400353">
+    <w:abstractNumId w:val="25"/>
+  </w:num>
+  <w:num w:numId="16" w16cid:durableId="1358195784">
+    <w:abstractNumId w:val="13"/>
+  </w:num>
+  <w:num w:numId="17" w16cid:durableId="1928079564">
+    <w:abstractNumId w:val="18"/>
+  </w:num>
+  <w:num w:numId="18" w16cid:durableId="1952206637">
+    <w:abstractNumId w:val="8"/>
+  </w:num>
+  <w:num w:numId="19" w16cid:durableId="1051542969">
     <w:abstractNumId w:val="23"/>
   </w:num>
-  <w:num w:numId="16" w16cid:durableId="1358195784">
-    <w:abstractNumId w:val="12"/>
-  </w:num>
-  <w:num w:numId="17" w16cid:durableId="1928079564">
-    <w:abstractNumId w:val="17"/>
-  </w:num>
-  <w:num w:numId="18" w16cid:durableId="1952206637">
-    <w:abstractNumId w:val="7"/>
-  </w:num>
-  <w:num w:numId="19" w16cid:durableId="1051542969">
+  <w:num w:numId="20" w16cid:durableId="1313828451">
     <w:abstractNumId w:val="21"/>
-  </w:num>
-  <w:num w:numId="20" w16cid:durableId="1313828451">
-    <w:abstractNumId w:val="19"/>
   </w:num>
   <w:num w:numId="21" w16cid:durableId="692995573">
     <w:abstractNumId w:val="0"/>
   </w:num>
   <w:num w:numId="22" w16cid:durableId="2010597990">
+    <w:abstractNumId w:val="7"/>
+  </w:num>
+  <w:num w:numId="23" w16cid:durableId="2049258130">
+    <w:abstractNumId w:val="20"/>
+  </w:num>
+  <w:num w:numId="24" w16cid:durableId="1729912182">
+    <w:abstractNumId w:val="12"/>
+  </w:num>
+  <w:num w:numId="25" w16cid:durableId="498085007">
+    <w:abstractNumId w:val="10"/>
+  </w:num>
+  <w:num w:numId="26" w16cid:durableId="1095596648">
     <w:abstractNumId w:val="6"/>
   </w:num>
-  <w:num w:numId="23" w16cid:durableId="2049258130">
-    <w:abstractNumId w:val="18"/>
+  <w:num w:numId="27" w16cid:durableId="250286622">
+    <w:abstractNumId w:val="16"/>
   </w:num>
-  <w:num w:numId="24" w16cid:durableId="1729912182">
+  <w:num w:numId="28" w16cid:durableId="1965963853">
     <w:abstractNumId w:val="11"/>
   </w:num>
-  <w:num w:numId="25" w16cid:durableId="498085007">
-    <w:abstractNumId w:val="9"/>
-  </w:num>
-  <w:num w:numId="26" w16cid:durableId="1095596648">
+  <w:num w:numId="29" w16cid:durableId="1815945347">
     <w:abstractNumId w:val="5"/>
   </w:num>
-  <w:num w:numId="27" w16cid:durableId="250286622">
-    <w:abstractNumId w:val="15"/>
-  </w:num>
-  <w:num w:numId="28" w16cid:durableId="1965963853">
-    <w:abstractNumId w:val="10"/>
+  <w:num w:numId="30" w16cid:durableId="854270576">
+    <w:abstractNumId w:val="19"/>
   </w:num>
 </w:numbering>
 </file>
@@ -9345,6 +11607,62 @@
       <w:shd w:val="clear" w:color="auto" w:fill="E1DFDD"/>
     </w:rPr>
   </w:style>
+  <w:style w:type="paragraph" w:styleId="CabealhodoSumrio">
+    <w:name w:val="TOC Heading"/>
+    <w:basedOn w:val="Ttulo1"/>
+    <w:next w:val="Normal"/>
+    <w:uiPriority w:val="39"/>
+    <w:unhideWhenUsed/>
+    <w:qFormat/>
+    <w:rsid w:val="007678F3"/>
+    <w:pPr>
+      <w:spacing w:before="240" w:after="0" w:line="259" w:lineRule="auto"/>
+      <w:outlineLvl w:val="9"/>
+    </w:pPr>
+    <w:rPr>
+      <w:kern w:val="0"/>
+      <w:sz w:val="32"/>
+      <w:szCs w:val="32"/>
+      <w:lang w:eastAsia="pt-BR"/>
+      <w14:ligatures w14:val="none"/>
+    </w:rPr>
+  </w:style>
+  <w:style w:type="paragraph" w:styleId="Sumrio1">
+    <w:name w:val="toc 1"/>
+    <w:basedOn w:val="Normal"/>
+    <w:next w:val="Normal"/>
+    <w:autoRedefine/>
+    <w:uiPriority w:val="39"/>
+    <w:unhideWhenUsed/>
+    <w:rsid w:val="007678F3"/>
+    <w:pPr>
+      <w:spacing w:after="100"/>
+    </w:pPr>
+  </w:style>
+  <w:style w:type="paragraph" w:styleId="Sumrio2">
+    <w:name w:val="toc 2"/>
+    <w:basedOn w:val="Normal"/>
+    <w:next w:val="Normal"/>
+    <w:autoRedefine/>
+    <w:uiPriority w:val="39"/>
+    <w:unhideWhenUsed/>
+    <w:rsid w:val="007678F3"/>
+    <w:pPr>
+      <w:spacing w:after="100"/>
+      <w:ind w:left="240"/>
+    </w:pPr>
+  </w:style>
+  <w:style w:type="paragraph" w:styleId="ndicedeilustraes">
+    <w:name w:val="table of figures"/>
+    <w:basedOn w:val="Normal"/>
+    <w:next w:val="Normal"/>
+    <w:uiPriority w:val="99"/>
+    <w:unhideWhenUsed/>
+    <w:rsid w:val="00B516CA"/>
+    <w:pPr>
+      <w:spacing w:after="0"/>
+    </w:pPr>
+  </w:style>
 </w:styles>
 </file>
 
@@ -9661,4 +11979,16 @@
     </a:ext>
   </a:extLst>
 </a:theme>
+</file>
+
+<file path=customXml/item1.xml><?xml version="1.0" encoding="utf-8"?>
+<b:Sources xmlns:b="http://schemas.openxmlformats.org/officeDocument/2006/bibliography" xmlns="http://schemas.openxmlformats.org/officeDocument/2006/bibliography" SelectedStyle="\APASixthEditionOfficeOnline.xsl" StyleName="APA" Version="6"/>
+</file>
+
+<file path=customXml/itemProps1.xml><?xml version="1.0" encoding="utf-8"?>
+<ds:datastoreItem xmlns:ds="http://schemas.openxmlformats.org/officeDocument/2006/customXml" ds:itemID="{30C1B1B9-F0CF-4019-8762-E9FD9A105951}">
+  <ds:schemaRefs>
+    <ds:schemaRef ds:uri="http://schemas.openxmlformats.org/officeDocument/2006/bibliography"/>
+  </ds:schemaRefs>
+</ds:datastoreItem>
 </file>
</xml_diff>

<commit_message>
Exclusao do arquivo duplicado
</commit_message>
<xml_diff>
--- a/doc/Relatorio de Atividades RAP.docx
+++ b/doc/Relatorio de Atividades RAP.docx
@@ -1,6 +1,6 @@
 
 <file path=word/document.xml><?xml version="1.0" encoding="utf-8"?>
-<w:document xmlns:wpc="http://schemas.microsoft.com/office/word/2010/wordprocessingCanvas" xmlns:cx="http://schemas.microsoft.com/office/drawing/2014/chartex" xmlns:cx1="http://schemas.microsoft.com/office/drawing/2015/9/8/chartex" xmlns:cx2="http://schemas.microsoft.com/office/drawing/2015/10/21/chartex" xmlns:cx3="http://schemas.microsoft.com/office/drawing/2016/5/9/chartex" xmlns:cx4="http://schemas.microsoft.com/office/drawing/2016/5/10/chartex" xmlns:cx5="http://schemas.microsoft.com/office/drawing/2016/5/11/chartex" xmlns:cx6="http://schemas.microsoft.com/office/drawing/2016/5/12/chartex" xmlns:cx7="http://schemas.microsoft.com/office/drawing/2016/5/13/chartex" xmlns:cx8="http://schemas.microsoft.com/office/drawing/2016/5/14/chartex" xmlns:mc="http://schemas.openxmlformats.org/markup-compatibility/2006" xmlns:aink="http://schemas.microsoft.com/office/drawing/2016/ink" xmlns:am3d="http://schemas.microsoft.com/office/drawing/2017/model3d" xmlns:o="urn:schemas-microsoft-com:office:office" xmlns:oel="http://schemas.microsoft.com/office/2019/extlst" xmlns:r="http://schemas.openxmlformats.org/officeDocument/2006/relationships" xmlns:m="http://schemas.openxmlformats.org/officeDocument/2006/math" xmlns:v="urn:schemas-microsoft-com:vml" xmlns:wp14="http://schemas.microsoft.com/office/word/2010/wordprocessingDrawing" xmlns:wp="http://schemas.openxmlformats.org/drawingml/2006/wordprocessingDrawing" xmlns:w10="urn:schemas-microsoft-com:office:word" xmlns:w="http://schemas.openxmlformats.org/wordprocessingml/2006/main" xmlns:w14="http://schemas.microsoft.com/office/word/2010/wordml" xmlns:w15="http://schemas.microsoft.com/office/word/2012/wordml" xmlns:w16cei="http://schemas.microsoft.com/office/word/2026/wordml/cei" xmlns:w16cex="http://schemas.microsoft.com/office/word/2018/wordml/cex" xmlns:w16cid="http://schemas.microsoft.com/office/word/2016/wordml/cid" xmlns:w16="http://schemas.microsoft.com/office/word/2018/wordml" xmlns:w16du="http://schemas.microsoft.com/office/word/2023/wordml/word16du" xmlns:w16sdtdh="http://schemas.microsoft.com/office/word/2020/wordml/sdtdatahash" xmlns:w16sdtfl="http://schemas.microsoft.com/office/word/2024/wordml/sdtformatlock" xmlns:w16se="http://schemas.microsoft.com/office/word/2015/wordml/symex" xmlns:wpg="http://schemas.microsoft.com/office/word/2010/wordprocessingGroup" xmlns:wpi="http://schemas.microsoft.com/office/word/2010/wordprocessingInk" xmlns:wne="http://schemas.microsoft.com/office/word/2006/wordml" xmlns:wps="http://schemas.microsoft.com/office/word/2010/wordprocessingShape" mc:Ignorable="w14 w15 w16se w16cid w16 w16cex w16sdtdh w16sdtfl w16du wp14">
+<w:document xmlns:wpc="http://schemas.microsoft.com/office/word/2010/wordprocessingCanvas" xmlns:cx="http://schemas.microsoft.com/office/drawing/2014/chartex" xmlns:cx1="http://schemas.microsoft.com/office/drawing/2015/9/8/chartex" xmlns:cx2="http://schemas.microsoft.com/office/drawing/2015/10/21/chartex" xmlns:cx3="http://schemas.microsoft.com/office/drawing/2016/5/9/chartex" xmlns:cx4="http://schemas.microsoft.com/office/drawing/2016/5/10/chartex" xmlns:cx5="http://schemas.microsoft.com/office/drawing/2016/5/11/chartex" xmlns:cx6="http://schemas.microsoft.com/office/drawing/2016/5/12/chartex" xmlns:cx7="http://schemas.microsoft.com/office/drawing/2016/5/13/chartex" xmlns:cx8="http://schemas.microsoft.com/office/drawing/2016/5/14/chartex" xmlns:mc="http://schemas.openxmlformats.org/markup-compatibility/2006" xmlns:aink="http://schemas.microsoft.com/office/drawing/2016/ink" xmlns:am3d="http://schemas.microsoft.com/office/drawing/2017/model3d" xmlns:o="urn:schemas-microsoft-com:office:office" xmlns:oel="http://schemas.microsoft.com/office/2019/extlst" xmlns:r="http://schemas.openxmlformats.org/officeDocument/2006/relationships" xmlns:m="http://schemas.openxmlformats.org/officeDocument/2006/math" xmlns:v="urn:schemas-microsoft-com:vml" xmlns:wp14="http://schemas.microsoft.com/office/word/2010/wordprocessingDrawing" xmlns:wp="http://schemas.openxmlformats.org/drawingml/2006/wordprocessingDrawing" xmlns:w10="urn:schemas-microsoft-com:office:word" xmlns:w="http://schemas.openxmlformats.org/wordprocessingml/2006/main" xmlns:w14="http://schemas.microsoft.com/office/word/2010/wordml" xmlns:w15="http://schemas.microsoft.com/office/word/2012/wordml" xmlns:w16cex="http://schemas.microsoft.com/office/word/2018/wordml/cex" xmlns:w16cid="http://schemas.microsoft.com/office/word/2016/wordml/cid" xmlns:w16="http://schemas.microsoft.com/office/word/2018/wordml" xmlns:w16du="http://schemas.microsoft.com/office/word/2023/wordml/word16du" xmlns:w16sdtdh="http://schemas.microsoft.com/office/word/2020/wordml/sdtdatahash" xmlns:w16sdtfl="http://schemas.microsoft.com/office/word/2024/wordml/sdtformatlock" xmlns:w16se="http://schemas.microsoft.com/office/word/2015/wordml/symex" xmlns:wpg="http://schemas.microsoft.com/office/word/2010/wordprocessingGroup" xmlns:wpi="http://schemas.microsoft.com/office/word/2010/wordprocessingInk" xmlns:wne="http://schemas.microsoft.com/office/word/2006/wordml" xmlns:wps="http://schemas.microsoft.com/office/word/2010/wordprocessingShape" mc:Ignorable="w14 w15 w16se w16cid w16 w16cex w16sdtdh w16sdtfl w16du wp14">
   <w:body>
     <w:p>
       <w:pPr>
@@ -629,7 +629,7 @@
               </wp:anchor>
             </w:drawing>
           </mc:Choice>
-          <mc:Fallback>
+          <mc:Fallback xmlns:w16cei="http://schemas.microsoft.com/office/word/2026/wordml/cei">
             <w:pict>
               <v:shapetype w14:anchorId="34511DD5" id="_x0000_t202" coordsize="21600,21600" o:spt="202" path="m,l,21600r21600,l21600,xe">
                 <v:stroke joinstyle="miter"/>
@@ -1334,7 +1334,27 @@
                 <w:bCs/>
                 <w:noProof/>
               </w:rPr>
-              <w:t>2.2 Configuração de Conexão (application.properties)</w:t>
+              <w:t>2.</w:t>
+            </w:r>
+            <w:r>
+              <w:rPr>
+                <w:rStyle w:val="Hyperlink"/>
+                <w:rFonts w:ascii="Arial" w:hAnsi="Arial" w:cs="Arial"/>
+                <w:b/>
+                <w:bCs/>
+                <w:noProof/>
+              </w:rPr>
+              <w:t>1</w:t>
+            </w:r>
+            <w:r>
+              <w:rPr>
+                <w:rStyle w:val="Hyperlink"/>
+                <w:rFonts w:ascii="Arial" w:hAnsi="Arial" w:cs="Arial"/>
+                <w:b/>
+                <w:bCs/>
+                <w:noProof/>
+              </w:rPr>
+              <w:t xml:space="preserve"> Configuração de Conexão (application.properties)</w:t>
             </w:r>
             <w:r>
               <w:rPr>
@@ -1414,7 +1434,27 @@
                 <w:bCs/>
                 <w:noProof/>
               </w:rPr>
-              <w:t>2.3 Fundamentação e Arquitetura MVC No Spring Boot</w:t>
+              <w:t>2.</w:t>
+            </w:r>
+            <w:r>
+              <w:rPr>
+                <w:rStyle w:val="Hyperlink"/>
+                <w:rFonts w:ascii="Arial" w:hAnsi="Arial" w:cs="Arial"/>
+                <w:b/>
+                <w:bCs/>
+                <w:noProof/>
+              </w:rPr>
+              <w:t>2</w:t>
+            </w:r>
+            <w:r>
+              <w:rPr>
+                <w:rStyle w:val="Hyperlink"/>
+                <w:rFonts w:ascii="Arial" w:hAnsi="Arial" w:cs="Arial"/>
+                <w:b/>
+                <w:bCs/>
+                <w:noProof/>
+              </w:rPr>
+              <w:t xml:space="preserve"> Fundamentação e Arquitetura MVC No Spring Boot</w:t>
             </w:r>
             <w:r>
               <w:rPr>
@@ -1668,15 +1708,7 @@
               <w:b/>
               <w:bCs/>
             </w:rPr>
-            <w:t>Mapeamento Objeto-Relacional (Camada Model)</w:t>
-          </w:r>
-          <w:r>
-            <w:rPr>
-              <w:rFonts w:ascii="Arial" w:hAnsi="Arial" w:cs="Arial"/>
-              <w:b/>
-              <w:bCs/>
-            </w:rPr>
-            <w:t xml:space="preserve"> </w:t>
+            <w:t xml:space="preserve">Mapeamento Objeto-Relacional (Camada Model) </w:t>
           </w:r>
           <w:r>
             <w:rPr>
@@ -1738,31 +1770,7 @@
               <w:sz w:val="24"/>
               <w:szCs w:val="24"/>
             </w:rPr>
-            <w:t>Camada de Repositório e Queries Especializadas (</w:t>
-          </w:r>
-          <w:proofErr w:type="spellStart"/>
-          <w:r>
-            <w:rPr>
-              <w:rFonts w:ascii="Arial" w:hAnsi="Arial" w:cs="Arial"/>
-              <w:b/>
-              <w:bCs/>
-              <w:color w:val="auto"/>
-              <w:sz w:val="24"/>
-              <w:szCs w:val="24"/>
-            </w:rPr>
-            <w:t>Repository</w:t>
-          </w:r>
-          <w:proofErr w:type="spellEnd"/>
-          <w:r>
-            <w:rPr>
-              <w:rFonts w:ascii="Arial" w:hAnsi="Arial" w:cs="Arial"/>
-              <w:b/>
-              <w:bCs/>
-              <w:color w:val="auto"/>
-              <w:sz w:val="24"/>
-              <w:szCs w:val="24"/>
-            </w:rPr>
-            <w:t>)</w:t>
+            <w:t>Camada de Repositório e Queries Especializadas (Repository)</w:t>
           </w:r>
           <w:r>
             <w:rPr>
@@ -4518,7 +4526,29 @@
           <w:szCs w:val="24"/>
         </w:rPr>
         <w:lastRenderedPageBreak/>
-        <w:t>2.2 Configuração de Conexão (</w:t>
+        <w:t>2.</w:t>
+      </w:r>
+      <w:r>
+        <w:rPr>
+          <w:rFonts w:ascii="Arial" w:hAnsi="Arial" w:cs="Arial"/>
+          <w:b/>
+          <w:bCs/>
+          <w:color w:val="auto"/>
+          <w:sz w:val="24"/>
+          <w:szCs w:val="24"/>
+        </w:rPr>
+        <w:t>1</w:t>
+      </w:r>
+      <w:r>
+        <w:rPr>
+          <w:rFonts w:ascii="Arial" w:hAnsi="Arial" w:cs="Arial"/>
+          <w:b/>
+          <w:bCs/>
+          <w:color w:val="auto"/>
+          <w:sz w:val="24"/>
+          <w:szCs w:val="24"/>
+        </w:rPr>
+        <w:t xml:space="preserve"> Configuração de Conexão (</w:t>
       </w:r>
       <w:proofErr w:type="spellStart"/>
       <w:proofErr w:type="gramStart"/>
@@ -4775,7 +4805,29 @@
           <w:sz w:val="24"/>
           <w:szCs w:val="24"/>
         </w:rPr>
-        <w:t>2.3 Fundamentação e Arquitetura MVC No Spring Boot</w:t>
+        <w:t>2.</w:t>
+      </w:r>
+      <w:r>
+        <w:rPr>
+          <w:rFonts w:ascii="Arial" w:hAnsi="Arial" w:cs="Arial"/>
+          <w:b/>
+          <w:bCs/>
+          <w:color w:val="auto"/>
+          <w:sz w:val="24"/>
+          <w:szCs w:val="24"/>
+        </w:rPr>
+        <w:t>2</w:t>
+      </w:r>
+      <w:r>
+        <w:rPr>
+          <w:rFonts w:ascii="Arial" w:hAnsi="Arial" w:cs="Arial"/>
+          <w:b/>
+          <w:bCs/>
+          <w:color w:val="auto"/>
+          <w:sz w:val="24"/>
+          <w:szCs w:val="24"/>
+        </w:rPr>
+        <w:t xml:space="preserve"> Fundamentação e Arquitetura MVC No Spring Boot</w:t>
       </w:r>
       <w:bookmarkEnd w:id="5"/>
     </w:p>
@@ -5105,7 +5157,7 @@
               </wp:anchor>
             </w:drawing>
           </mc:Choice>
-          <mc:Fallback>
+          <mc:Fallback xmlns:w16cei="http://schemas.microsoft.com/office/word/2026/wordml/cei">
             <w:pict>
               <v:rect w14:anchorId="69A15EA8" id="Retângulo 3" o:spid="_x0000_s1026" style="position:absolute;margin-left:318.65pt;margin-top:1.25pt;width:62.1pt;height:13.75pt;z-index:251660288;visibility:visible;mso-wrap-style:square;mso-wrap-distance-left:9pt;mso-wrap-distance-top:0;mso-wrap-distance-right:9pt;mso-wrap-distance-bottom:0;mso-position-horizontal:absolute;mso-position-horizontal-relative:text;mso-position-vertical:absolute;mso-position-vertical-relative:text;v-text-anchor:middle" o:gfxdata="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" fillcolor="#f2f2f2 [3052]" strokecolor="white [3212]" strokeweight=".25pt"/>
             </w:pict>
@@ -7968,16 +8020,7 @@
           <w:sz w:val="24"/>
           <w:szCs w:val="24"/>
         </w:rPr>
-        <w:t xml:space="preserve"> </w:t>
-      </w:r>
-      <w:r>
-        <w:rPr>
-          <w:rFonts w:ascii="Arial" w:hAnsi="Arial" w:cs="Arial"/>
-          <w:color w:val="auto"/>
-          <w:sz w:val="24"/>
-          <w:szCs w:val="24"/>
-        </w:rPr>
-        <w:t xml:space="preserve">Simulação de pedidos com quantidade superior ao estoque para comprovar a execução do </w:t>
+        <w:t xml:space="preserve"> Simulação de pedidos com quantidade superior ao estoque para comprovar a execução do </w:t>
       </w:r>
       <w:proofErr w:type="spellStart"/>
       <w:r>
@@ -9165,7 +9208,7 @@
 </file>
 
 <file path=word/endnotes.xml><?xml version="1.0" encoding="utf-8"?>
-<w:endnotes xmlns:wpc="http://schemas.microsoft.com/office/word/2010/wordprocessingCanvas" xmlns:cx="http://schemas.microsoft.com/office/drawing/2014/chartex" xmlns:cx1="http://schemas.microsoft.com/office/drawing/2015/9/8/chartex" xmlns:cx2="http://schemas.microsoft.com/office/drawing/2015/10/21/chartex" xmlns:cx3="http://schemas.microsoft.com/office/drawing/2016/5/9/chartex" xmlns:cx4="http://schemas.microsoft.com/office/drawing/2016/5/10/chartex" xmlns:cx5="http://schemas.microsoft.com/office/drawing/2016/5/11/chartex" xmlns:cx6="http://schemas.microsoft.com/office/drawing/2016/5/12/chartex" xmlns:cx7="http://schemas.microsoft.com/office/drawing/2016/5/13/chartex" xmlns:cx8="http://schemas.microsoft.com/office/drawing/2016/5/14/chartex" xmlns:mc="http://schemas.openxmlformats.org/markup-compatibility/2006" xmlns:aink="http://schemas.microsoft.com/office/drawing/2016/ink" xmlns:am3d="http://schemas.microsoft.com/office/drawing/2017/model3d" xmlns:o="urn:schemas-microsoft-com:office:office" xmlns:oel="http://schemas.microsoft.com/office/2019/extlst" xmlns:r="http://schemas.openxmlformats.org/officeDocument/2006/relationships" xmlns:m="http://schemas.openxmlformats.org/officeDocument/2006/math" xmlns:v="urn:schemas-microsoft-com:vml" xmlns:wp14="http://schemas.microsoft.com/office/word/2010/wordprocessingDrawing" xmlns:wp="http://schemas.openxmlformats.org/drawingml/2006/wordprocessingDrawing" xmlns:w10="urn:schemas-microsoft-com:office:word" xmlns:w="http://schemas.openxmlformats.org/wordprocessingml/2006/main" xmlns:w14="http://schemas.microsoft.com/office/word/2010/wordml" xmlns:w15="http://schemas.microsoft.com/office/word/2012/wordml" xmlns:w16cei="http://schemas.microsoft.com/office/word/2026/wordml/cei" xmlns:w16cex="http://schemas.microsoft.com/office/word/2018/wordml/cex" xmlns:w16cid="http://schemas.microsoft.com/office/word/2016/wordml/cid" xmlns:w16="http://schemas.microsoft.com/office/word/2018/wordml" xmlns:w16du="http://schemas.microsoft.com/office/word/2023/wordml/word16du" xmlns:w16sdtdh="http://schemas.microsoft.com/office/word/2020/wordml/sdtdatahash" xmlns:w16sdtfl="http://schemas.microsoft.com/office/word/2024/wordml/sdtformatlock" xmlns:w16se="http://schemas.microsoft.com/office/word/2015/wordml/symex" xmlns:wpg="http://schemas.microsoft.com/office/word/2010/wordprocessingGroup" xmlns:wpi="http://schemas.microsoft.com/office/word/2010/wordprocessingInk" xmlns:wne="http://schemas.microsoft.com/office/word/2006/wordml" xmlns:wps="http://schemas.microsoft.com/office/word/2010/wordprocessingShape" mc:Ignorable="w14 w15 w16se w16cid w16 w16cex w16sdtdh w16sdtfl w16du wp14">
+<w:endnotes xmlns:wpc="http://schemas.microsoft.com/office/word/2010/wordprocessingCanvas" xmlns:cx="http://schemas.microsoft.com/office/drawing/2014/chartex" xmlns:cx1="http://schemas.microsoft.com/office/drawing/2015/9/8/chartex" xmlns:cx2="http://schemas.microsoft.com/office/drawing/2015/10/21/chartex" xmlns:cx3="http://schemas.microsoft.com/office/drawing/2016/5/9/chartex" xmlns:cx4="http://schemas.microsoft.com/office/drawing/2016/5/10/chartex" xmlns:cx5="http://schemas.microsoft.com/office/drawing/2016/5/11/chartex" xmlns:cx6="http://schemas.microsoft.com/office/drawing/2016/5/12/chartex" xmlns:cx7="http://schemas.microsoft.com/office/drawing/2016/5/13/chartex" xmlns:cx8="http://schemas.microsoft.com/office/drawing/2016/5/14/chartex" xmlns:mc="http://schemas.openxmlformats.org/markup-compatibility/2006" xmlns:aink="http://schemas.microsoft.com/office/drawing/2016/ink" xmlns:am3d="http://schemas.microsoft.com/office/drawing/2017/model3d" xmlns:o="urn:schemas-microsoft-com:office:office" xmlns:oel="http://schemas.microsoft.com/office/2019/extlst" xmlns:r="http://schemas.openxmlformats.org/officeDocument/2006/relationships" xmlns:m="http://schemas.openxmlformats.org/officeDocument/2006/math" xmlns:v="urn:schemas-microsoft-com:vml" xmlns:wp14="http://schemas.microsoft.com/office/word/2010/wordprocessingDrawing" xmlns:wp="http://schemas.openxmlformats.org/drawingml/2006/wordprocessingDrawing" xmlns:w10="urn:schemas-microsoft-com:office:word" xmlns:w="http://schemas.openxmlformats.org/wordprocessingml/2006/main" xmlns:w14="http://schemas.microsoft.com/office/word/2010/wordml" xmlns:w15="http://schemas.microsoft.com/office/word/2012/wordml" xmlns:w16cex="http://schemas.microsoft.com/office/word/2018/wordml/cex" xmlns:w16cid="http://schemas.microsoft.com/office/word/2016/wordml/cid" xmlns:w16="http://schemas.microsoft.com/office/word/2018/wordml" xmlns:w16du="http://schemas.microsoft.com/office/word/2023/wordml/word16du" xmlns:w16sdtdh="http://schemas.microsoft.com/office/word/2020/wordml/sdtdatahash" xmlns:w16sdtfl="http://schemas.microsoft.com/office/word/2024/wordml/sdtformatlock" xmlns:w16se="http://schemas.microsoft.com/office/word/2015/wordml/symex" xmlns:wpg="http://schemas.microsoft.com/office/word/2010/wordprocessingGroup" xmlns:wpi="http://schemas.microsoft.com/office/word/2010/wordprocessingInk" xmlns:wne="http://schemas.microsoft.com/office/word/2006/wordml" xmlns:wps="http://schemas.microsoft.com/office/word/2010/wordprocessingShape" mc:Ignorable="w14 w15 w16se w16cid w16 w16cex w16sdtdh w16sdtfl w16du wp14">
   <w:endnote w:type="separator" w:id="-1">
     <w:p>
       <w:pPr>
@@ -9190,7 +9233,7 @@
 </file>
 
 <file path=word/footnotes.xml><?xml version="1.0" encoding="utf-8"?>
-<w:footnotes xmlns:wpc="http://schemas.microsoft.com/office/word/2010/wordprocessingCanvas" xmlns:cx="http://schemas.microsoft.com/office/drawing/2014/chartex" xmlns:cx1="http://schemas.microsoft.com/office/drawing/2015/9/8/chartex" xmlns:cx2="http://schemas.microsoft.com/office/drawing/2015/10/21/chartex" xmlns:cx3="http://schemas.microsoft.com/office/drawing/2016/5/9/chartex" xmlns:cx4="http://schemas.microsoft.com/office/drawing/2016/5/10/chartex" xmlns:cx5="http://schemas.microsoft.com/office/drawing/2016/5/11/chartex" xmlns:cx6="http://schemas.microsoft.com/office/drawing/2016/5/12/chartex" xmlns:cx7="http://schemas.microsoft.com/office/drawing/2016/5/13/chartex" xmlns:cx8="http://schemas.microsoft.com/office/drawing/2016/5/14/chartex" xmlns:mc="http://schemas.openxmlformats.org/markup-compatibility/2006" xmlns:aink="http://schemas.microsoft.com/office/drawing/2016/ink" xmlns:am3d="http://schemas.microsoft.com/office/drawing/2017/model3d" xmlns:o="urn:schemas-microsoft-com:office:office" xmlns:oel="http://schemas.microsoft.com/office/2019/extlst" xmlns:r="http://schemas.openxmlformats.org/officeDocument/2006/relationships" xmlns:m="http://schemas.openxmlformats.org/officeDocument/2006/math" xmlns:v="urn:schemas-microsoft-com:vml" xmlns:wp14="http://schemas.microsoft.com/office/word/2010/wordprocessingDrawing" xmlns:wp="http://schemas.openxmlformats.org/drawingml/2006/wordprocessingDrawing" xmlns:w10="urn:schemas-microsoft-com:office:word" xmlns:w="http://schemas.openxmlformats.org/wordprocessingml/2006/main" xmlns:w14="http://schemas.microsoft.com/office/word/2010/wordml" xmlns:w15="http://schemas.microsoft.com/office/word/2012/wordml" xmlns:w16cei="http://schemas.microsoft.com/office/word/2026/wordml/cei" xmlns:w16cex="http://schemas.microsoft.com/office/word/2018/wordml/cex" xmlns:w16cid="http://schemas.microsoft.com/office/word/2016/wordml/cid" xmlns:w16="http://schemas.microsoft.com/office/word/2018/wordml" xmlns:w16du="http://schemas.microsoft.com/office/word/2023/wordml/word16du" xmlns:w16sdtdh="http://schemas.microsoft.com/office/word/2020/wordml/sdtdatahash" xmlns:w16sdtfl="http://schemas.microsoft.com/office/word/2024/wordml/sdtformatlock" xmlns:w16se="http://schemas.microsoft.com/office/word/2015/wordml/symex" xmlns:wpg="http://schemas.microsoft.com/office/word/2010/wordprocessingGroup" xmlns:wpi="http://schemas.microsoft.com/office/word/2010/wordprocessingInk" xmlns:wne="http://schemas.microsoft.com/office/word/2006/wordml" xmlns:wps="http://schemas.microsoft.com/office/word/2010/wordprocessingShape" mc:Ignorable="w14 w15 w16se w16cid w16 w16cex w16sdtdh w16sdtfl w16du wp14">
+<w:footnotes xmlns:wpc="http://schemas.microsoft.com/office/word/2010/wordprocessingCanvas" xmlns:cx="http://schemas.microsoft.com/office/drawing/2014/chartex" xmlns:cx1="http://schemas.microsoft.com/office/drawing/2015/9/8/chartex" xmlns:cx2="http://schemas.microsoft.com/office/drawing/2015/10/21/chartex" xmlns:cx3="http://schemas.microsoft.com/office/drawing/2016/5/9/chartex" xmlns:cx4="http://schemas.microsoft.com/office/drawing/2016/5/10/chartex" xmlns:cx5="http://schemas.microsoft.com/office/drawing/2016/5/11/chartex" xmlns:cx6="http://schemas.microsoft.com/office/drawing/2016/5/12/chartex" xmlns:cx7="http://schemas.microsoft.com/office/drawing/2016/5/13/chartex" xmlns:cx8="http://schemas.microsoft.com/office/drawing/2016/5/14/chartex" xmlns:mc="http://schemas.openxmlformats.org/markup-compatibility/2006" xmlns:aink="http://schemas.microsoft.com/office/drawing/2016/ink" xmlns:am3d="http://schemas.microsoft.com/office/drawing/2017/model3d" xmlns:o="urn:schemas-microsoft-com:office:office" xmlns:oel="http://schemas.microsoft.com/office/2019/extlst" xmlns:r="http://schemas.openxmlformats.org/officeDocument/2006/relationships" xmlns:m="http://schemas.openxmlformats.org/officeDocument/2006/math" xmlns:v="urn:schemas-microsoft-com:vml" xmlns:wp14="http://schemas.microsoft.com/office/word/2010/wordprocessingDrawing" xmlns:wp="http://schemas.openxmlformats.org/drawingml/2006/wordprocessingDrawing" xmlns:w10="urn:schemas-microsoft-com:office:word" xmlns:w="http://schemas.openxmlformats.org/wordprocessingml/2006/main" xmlns:w14="http://schemas.microsoft.com/office/word/2010/wordml" xmlns:w15="http://schemas.microsoft.com/office/word/2012/wordml" xmlns:w16cex="http://schemas.microsoft.com/office/word/2018/wordml/cex" xmlns:w16cid="http://schemas.microsoft.com/office/word/2016/wordml/cid" xmlns:w16="http://schemas.microsoft.com/office/word/2018/wordml" xmlns:w16du="http://schemas.microsoft.com/office/word/2023/wordml/word16du" xmlns:w16sdtdh="http://schemas.microsoft.com/office/word/2020/wordml/sdtdatahash" xmlns:w16sdtfl="http://schemas.microsoft.com/office/word/2024/wordml/sdtformatlock" xmlns:w16se="http://schemas.microsoft.com/office/word/2015/wordml/symex" xmlns:wpg="http://schemas.microsoft.com/office/word/2010/wordprocessingGroup" xmlns:wpi="http://schemas.microsoft.com/office/word/2010/wordprocessingInk" xmlns:wne="http://schemas.microsoft.com/office/word/2006/wordml" xmlns:wps="http://schemas.microsoft.com/office/word/2010/wordprocessingShape" mc:Ignorable="w14 w15 w16se w16cid w16 w16cex w16sdtdh w16sdtfl w16du wp14">
   <w:footnote w:type="separator" w:id="-1">
     <w:p>
       <w:pPr>
@@ -9215,7 +9258,7 @@
 </file>
 
 <file path=word/header1.xml><?xml version="1.0" encoding="utf-8"?>
-<w:hdr xmlns:wpc="http://schemas.microsoft.com/office/word/2010/wordprocessingCanvas" xmlns:cx="http://schemas.microsoft.com/office/drawing/2014/chartex" xmlns:cx1="http://schemas.microsoft.com/office/drawing/2015/9/8/chartex" xmlns:cx2="http://schemas.microsoft.com/office/drawing/2015/10/21/chartex" xmlns:cx3="http://schemas.microsoft.com/office/drawing/2016/5/9/chartex" xmlns:cx4="http://schemas.microsoft.com/office/drawing/2016/5/10/chartex" xmlns:cx5="http://schemas.microsoft.com/office/drawing/2016/5/11/chartex" xmlns:cx6="http://schemas.microsoft.com/office/drawing/2016/5/12/chartex" xmlns:cx7="http://schemas.microsoft.com/office/drawing/2016/5/13/chartex" xmlns:cx8="http://schemas.microsoft.com/office/drawing/2016/5/14/chartex" xmlns:mc="http://schemas.openxmlformats.org/markup-compatibility/2006" xmlns:aink="http://schemas.microsoft.com/office/drawing/2016/ink" xmlns:am3d="http://schemas.microsoft.com/office/drawing/2017/model3d" xmlns:o="urn:schemas-microsoft-com:office:office" xmlns:oel="http://schemas.microsoft.com/office/2019/extlst" xmlns:r="http://schemas.openxmlformats.org/officeDocument/2006/relationships" xmlns:m="http://schemas.openxmlformats.org/officeDocument/2006/math" xmlns:v="urn:schemas-microsoft-com:vml" xmlns:wp14="http://schemas.microsoft.com/office/word/2010/wordprocessingDrawing" xmlns:wp="http://schemas.openxmlformats.org/drawingml/2006/wordprocessingDrawing" xmlns:w10="urn:schemas-microsoft-com:office:word" xmlns:w="http://schemas.openxmlformats.org/wordprocessingml/2006/main" xmlns:w14="http://schemas.microsoft.com/office/word/2010/wordml" xmlns:w15="http://schemas.microsoft.com/office/word/2012/wordml" xmlns:w16cei="http://schemas.microsoft.com/office/word/2026/wordml/cei" xmlns:w16cex="http://schemas.microsoft.com/office/word/2018/wordml/cex" xmlns:w16cid="http://schemas.microsoft.com/office/word/2016/wordml/cid" xmlns:w16="http://schemas.microsoft.com/office/word/2018/wordml" xmlns:w16du="http://schemas.microsoft.com/office/word/2023/wordml/word16du" xmlns:w16sdtdh="http://schemas.microsoft.com/office/word/2020/wordml/sdtdatahash" xmlns:w16sdtfl="http://schemas.microsoft.com/office/word/2024/wordml/sdtformatlock" xmlns:w16se="http://schemas.microsoft.com/office/word/2015/wordml/symex" xmlns:wpg="http://schemas.microsoft.com/office/word/2010/wordprocessingGroup" xmlns:wpi="http://schemas.microsoft.com/office/word/2010/wordprocessingInk" xmlns:wne="http://schemas.microsoft.com/office/word/2006/wordml" xmlns:wps="http://schemas.microsoft.com/office/word/2010/wordprocessingShape" mc:Ignorable="w14 w15 w16se w16cid w16 w16cex w16sdtdh w16sdtfl w16du wp14">
+<w:hdr xmlns:wpc="http://schemas.microsoft.com/office/word/2010/wordprocessingCanvas" xmlns:cx="http://schemas.microsoft.com/office/drawing/2014/chartex" xmlns:cx1="http://schemas.microsoft.com/office/drawing/2015/9/8/chartex" xmlns:cx2="http://schemas.microsoft.com/office/drawing/2015/10/21/chartex" xmlns:cx3="http://schemas.microsoft.com/office/drawing/2016/5/9/chartex" xmlns:cx4="http://schemas.microsoft.com/office/drawing/2016/5/10/chartex" xmlns:cx5="http://schemas.microsoft.com/office/drawing/2016/5/11/chartex" xmlns:cx6="http://schemas.microsoft.com/office/drawing/2016/5/12/chartex" xmlns:cx7="http://schemas.microsoft.com/office/drawing/2016/5/13/chartex" xmlns:cx8="http://schemas.microsoft.com/office/drawing/2016/5/14/chartex" xmlns:mc="http://schemas.openxmlformats.org/markup-compatibility/2006" xmlns:aink="http://schemas.microsoft.com/office/drawing/2016/ink" xmlns:am3d="http://schemas.microsoft.com/office/drawing/2017/model3d" xmlns:o="urn:schemas-microsoft-com:office:office" xmlns:oel="http://schemas.microsoft.com/office/2019/extlst" xmlns:r="http://schemas.openxmlformats.org/officeDocument/2006/relationships" xmlns:m="http://schemas.openxmlformats.org/officeDocument/2006/math" xmlns:v="urn:schemas-microsoft-com:vml" xmlns:wp14="http://schemas.microsoft.com/office/word/2010/wordprocessingDrawing" xmlns:wp="http://schemas.openxmlformats.org/drawingml/2006/wordprocessingDrawing" xmlns:w10="urn:schemas-microsoft-com:office:word" xmlns:w="http://schemas.openxmlformats.org/wordprocessingml/2006/main" xmlns:w14="http://schemas.microsoft.com/office/word/2010/wordml" xmlns:w15="http://schemas.microsoft.com/office/word/2012/wordml" xmlns:w16cex="http://schemas.microsoft.com/office/word/2018/wordml/cex" xmlns:w16cid="http://schemas.microsoft.com/office/word/2016/wordml/cid" xmlns:w16="http://schemas.microsoft.com/office/word/2018/wordml" xmlns:w16du="http://schemas.microsoft.com/office/word/2023/wordml/word16du" xmlns:w16sdtdh="http://schemas.microsoft.com/office/word/2020/wordml/sdtdatahash" xmlns:w16sdtfl="http://schemas.microsoft.com/office/word/2024/wordml/sdtformatlock" xmlns:w16se="http://schemas.microsoft.com/office/word/2015/wordml/symex" xmlns:wpg="http://schemas.microsoft.com/office/word/2010/wordprocessingGroup" xmlns:wpi="http://schemas.microsoft.com/office/word/2010/wordprocessingInk" xmlns:wne="http://schemas.microsoft.com/office/word/2006/wordml" xmlns:wps="http://schemas.microsoft.com/office/word/2010/wordprocessingShape" mc:Ignorable="w14 w15 w16se w16cid w16 w16cex w16sdtdh w16sdtfl w16du wp14">
   <w:p>
     <w:pPr>
       <w:pStyle w:val="Cabealho"/>
@@ -9277,7 +9320,7 @@
 </file>
 
 <file path=word/header2.xml><?xml version="1.0" encoding="utf-8"?>
-<w:hdr xmlns:wpc="http://schemas.microsoft.com/office/word/2010/wordprocessingCanvas" xmlns:cx="http://schemas.microsoft.com/office/drawing/2014/chartex" xmlns:cx1="http://schemas.microsoft.com/office/drawing/2015/9/8/chartex" xmlns:cx2="http://schemas.microsoft.com/office/drawing/2015/10/21/chartex" xmlns:cx3="http://schemas.microsoft.com/office/drawing/2016/5/9/chartex" xmlns:cx4="http://schemas.microsoft.com/office/drawing/2016/5/10/chartex" xmlns:cx5="http://schemas.microsoft.com/office/drawing/2016/5/11/chartex" xmlns:cx6="http://schemas.microsoft.com/office/drawing/2016/5/12/chartex" xmlns:cx7="http://schemas.microsoft.com/office/drawing/2016/5/13/chartex" xmlns:cx8="http://schemas.microsoft.com/office/drawing/2016/5/14/chartex" xmlns:mc="http://schemas.openxmlformats.org/markup-compatibility/2006" xmlns:aink="http://schemas.microsoft.com/office/drawing/2016/ink" xmlns:am3d="http://schemas.microsoft.com/office/drawing/2017/model3d" xmlns:o="urn:schemas-microsoft-com:office:office" xmlns:oel="http://schemas.microsoft.com/office/2019/extlst" xmlns:r="http://schemas.openxmlformats.org/officeDocument/2006/relationships" xmlns:m="http://schemas.openxmlformats.org/officeDocument/2006/math" xmlns:v="urn:schemas-microsoft-com:vml" xmlns:wp14="http://schemas.microsoft.com/office/word/2010/wordprocessingDrawing" xmlns:wp="http://schemas.openxmlformats.org/drawingml/2006/wordprocessingDrawing" xmlns:w10="urn:schemas-microsoft-com:office:word" xmlns:w="http://schemas.openxmlformats.org/wordprocessingml/2006/main" xmlns:w14="http://schemas.microsoft.com/office/word/2010/wordml" xmlns:w15="http://schemas.microsoft.com/office/word/2012/wordml" xmlns:w16cei="http://schemas.microsoft.com/office/word/2026/wordml/cei" xmlns:w16cex="http://schemas.microsoft.com/office/word/2018/wordml/cex" xmlns:w16cid="http://schemas.microsoft.com/office/word/2016/wordml/cid" xmlns:w16="http://schemas.microsoft.com/office/word/2018/wordml" xmlns:w16du="http://schemas.microsoft.com/office/word/2023/wordml/word16du" xmlns:w16sdtdh="http://schemas.microsoft.com/office/word/2020/wordml/sdtdatahash" xmlns:w16sdtfl="http://schemas.microsoft.com/office/word/2024/wordml/sdtformatlock" xmlns:w16se="http://schemas.microsoft.com/office/word/2015/wordml/symex" xmlns:wpg="http://schemas.microsoft.com/office/word/2010/wordprocessingGroup" xmlns:wpi="http://schemas.microsoft.com/office/word/2010/wordprocessingInk" xmlns:wne="http://schemas.microsoft.com/office/word/2006/wordml" xmlns:wps="http://schemas.microsoft.com/office/word/2010/wordprocessingShape" mc:Ignorable="w14 w15 w16se w16cid w16 w16cex w16sdtdh w16sdtfl w16du wp14">
+<w:hdr xmlns:wpc="http://schemas.microsoft.com/office/word/2010/wordprocessingCanvas" xmlns:cx="http://schemas.microsoft.com/office/drawing/2014/chartex" xmlns:cx1="http://schemas.microsoft.com/office/drawing/2015/9/8/chartex" xmlns:cx2="http://schemas.microsoft.com/office/drawing/2015/10/21/chartex" xmlns:cx3="http://schemas.microsoft.com/office/drawing/2016/5/9/chartex" xmlns:cx4="http://schemas.microsoft.com/office/drawing/2016/5/10/chartex" xmlns:cx5="http://schemas.microsoft.com/office/drawing/2016/5/11/chartex" xmlns:cx6="http://schemas.microsoft.com/office/drawing/2016/5/12/chartex" xmlns:cx7="http://schemas.microsoft.com/office/drawing/2016/5/13/chartex" xmlns:cx8="http://schemas.microsoft.com/office/drawing/2016/5/14/chartex" xmlns:mc="http://schemas.openxmlformats.org/markup-compatibility/2006" xmlns:aink="http://schemas.microsoft.com/office/drawing/2016/ink" xmlns:am3d="http://schemas.microsoft.com/office/drawing/2017/model3d" xmlns:o="urn:schemas-microsoft-com:office:office" xmlns:oel="http://schemas.microsoft.com/office/2019/extlst" xmlns:r="http://schemas.openxmlformats.org/officeDocument/2006/relationships" xmlns:m="http://schemas.openxmlformats.org/officeDocument/2006/math" xmlns:v="urn:schemas-microsoft-com:vml" xmlns:wp14="http://schemas.microsoft.com/office/word/2010/wordprocessingDrawing" xmlns:wp="http://schemas.openxmlformats.org/drawingml/2006/wordprocessingDrawing" xmlns:w10="urn:schemas-microsoft-com:office:word" xmlns:w="http://schemas.openxmlformats.org/wordprocessingml/2006/main" xmlns:w14="http://schemas.microsoft.com/office/word/2010/wordml" xmlns:w15="http://schemas.microsoft.com/office/word/2012/wordml" xmlns:w16cex="http://schemas.microsoft.com/office/word/2018/wordml/cex" xmlns:w16cid="http://schemas.microsoft.com/office/word/2016/wordml/cid" xmlns:w16="http://schemas.microsoft.com/office/word/2018/wordml" xmlns:w16du="http://schemas.microsoft.com/office/word/2023/wordml/word16du" xmlns:w16sdtdh="http://schemas.microsoft.com/office/word/2020/wordml/sdtdatahash" xmlns:w16sdtfl="http://schemas.microsoft.com/office/word/2024/wordml/sdtformatlock" xmlns:w16se="http://schemas.microsoft.com/office/word/2015/wordml/symex" xmlns:wpg="http://schemas.microsoft.com/office/word/2010/wordprocessingGroup" xmlns:wpi="http://schemas.microsoft.com/office/word/2010/wordprocessingInk" xmlns:wne="http://schemas.microsoft.com/office/word/2006/wordml" xmlns:wps="http://schemas.microsoft.com/office/word/2010/wordprocessingShape" mc:Ignorable="w14 w15 w16se w16cid w16 w16cex w16sdtdh w16sdtfl w16du wp14">
   <w:p>
     <w:pPr>
       <w:pStyle w:val="Cabealho"/>
@@ -9340,7 +9383,7 @@
 </file>
 
 <file path=word/header3.xml><?xml version="1.0" encoding="utf-8"?>
-<w:hdr xmlns:wpc="http://schemas.microsoft.com/office/word/2010/wordprocessingCanvas" xmlns:cx="http://schemas.microsoft.com/office/drawing/2014/chartex" xmlns:cx1="http://schemas.microsoft.com/office/drawing/2015/9/8/chartex" xmlns:cx2="http://schemas.microsoft.com/office/drawing/2015/10/21/chartex" xmlns:cx3="http://schemas.microsoft.com/office/drawing/2016/5/9/chartex" xmlns:cx4="http://schemas.microsoft.com/office/drawing/2016/5/10/chartex" xmlns:cx5="http://schemas.microsoft.com/office/drawing/2016/5/11/chartex" xmlns:cx6="http://schemas.microsoft.com/office/drawing/2016/5/12/chartex" xmlns:cx7="http://schemas.microsoft.com/office/drawing/2016/5/13/chartex" xmlns:cx8="http://schemas.microsoft.com/office/drawing/2016/5/14/chartex" xmlns:mc="http://schemas.openxmlformats.org/markup-compatibility/2006" xmlns:aink="http://schemas.microsoft.com/office/drawing/2016/ink" xmlns:am3d="http://schemas.microsoft.com/office/drawing/2017/model3d" xmlns:o="urn:schemas-microsoft-com:office:office" xmlns:oel="http://schemas.microsoft.com/office/2019/extlst" xmlns:r="http://schemas.openxmlformats.org/officeDocument/2006/relationships" xmlns:m="http://schemas.openxmlformats.org/officeDocument/2006/math" xmlns:v="urn:schemas-microsoft-com:vml" xmlns:wp14="http://schemas.microsoft.com/office/word/2010/wordprocessingDrawing" xmlns:wp="http://schemas.openxmlformats.org/drawingml/2006/wordprocessingDrawing" xmlns:w10="urn:schemas-microsoft-com:office:word" xmlns:w="http://schemas.openxmlformats.org/wordprocessingml/2006/main" xmlns:w14="http://schemas.microsoft.com/office/word/2010/wordml" xmlns:w15="http://schemas.microsoft.com/office/word/2012/wordml" xmlns:w16cei="http://schemas.microsoft.com/office/word/2026/wordml/cei" xmlns:w16cex="http://schemas.microsoft.com/office/word/2018/wordml/cex" xmlns:w16cid="http://schemas.microsoft.com/office/word/2016/wordml/cid" xmlns:w16="http://schemas.microsoft.com/office/word/2018/wordml" xmlns:w16du="http://schemas.microsoft.com/office/word/2023/wordml/word16du" xmlns:w16sdtdh="http://schemas.microsoft.com/office/word/2020/wordml/sdtdatahash" xmlns:w16sdtfl="http://schemas.microsoft.com/office/word/2024/wordml/sdtformatlock" xmlns:w16se="http://schemas.microsoft.com/office/word/2015/wordml/symex" xmlns:wpg="http://schemas.microsoft.com/office/word/2010/wordprocessingGroup" xmlns:wpi="http://schemas.microsoft.com/office/word/2010/wordprocessingInk" xmlns:wne="http://schemas.microsoft.com/office/word/2006/wordml" xmlns:wps="http://schemas.microsoft.com/office/word/2010/wordprocessingShape" mc:Ignorable="w14 w15 w16se w16cid w16 w16cex w16sdtdh w16sdtfl w16du wp14">
+<w:hdr xmlns:wpc="http://schemas.microsoft.com/office/word/2010/wordprocessingCanvas" xmlns:cx="http://schemas.microsoft.com/office/drawing/2014/chartex" xmlns:cx1="http://schemas.microsoft.com/office/drawing/2015/9/8/chartex" xmlns:cx2="http://schemas.microsoft.com/office/drawing/2015/10/21/chartex" xmlns:cx3="http://schemas.microsoft.com/office/drawing/2016/5/9/chartex" xmlns:cx4="http://schemas.microsoft.com/office/drawing/2016/5/10/chartex" xmlns:cx5="http://schemas.microsoft.com/office/drawing/2016/5/11/chartex" xmlns:cx6="http://schemas.microsoft.com/office/drawing/2016/5/12/chartex" xmlns:cx7="http://schemas.microsoft.com/office/drawing/2016/5/13/chartex" xmlns:cx8="http://schemas.microsoft.com/office/drawing/2016/5/14/chartex" xmlns:mc="http://schemas.openxmlformats.org/markup-compatibility/2006" xmlns:aink="http://schemas.microsoft.com/office/drawing/2016/ink" xmlns:am3d="http://schemas.microsoft.com/office/drawing/2017/model3d" xmlns:o="urn:schemas-microsoft-com:office:office" xmlns:oel="http://schemas.microsoft.com/office/2019/extlst" xmlns:r="http://schemas.openxmlformats.org/officeDocument/2006/relationships" xmlns:m="http://schemas.openxmlformats.org/officeDocument/2006/math" xmlns:v="urn:schemas-microsoft-com:vml" xmlns:wp14="http://schemas.microsoft.com/office/word/2010/wordprocessingDrawing" xmlns:wp="http://schemas.openxmlformats.org/drawingml/2006/wordprocessingDrawing" xmlns:w10="urn:schemas-microsoft-com:office:word" xmlns:w="http://schemas.openxmlformats.org/wordprocessingml/2006/main" xmlns:w14="http://schemas.microsoft.com/office/word/2010/wordml" xmlns:w15="http://schemas.microsoft.com/office/word/2012/wordml" xmlns:w16cex="http://schemas.microsoft.com/office/word/2018/wordml/cex" xmlns:w16cid="http://schemas.microsoft.com/office/word/2016/wordml/cid" xmlns:w16="http://schemas.microsoft.com/office/word/2018/wordml" xmlns:w16du="http://schemas.microsoft.com/office/word/2023/wordml/word16du" xmlns:w16sdtdh="http://schemas.microsoft.com/office/word/2020/wordml/sdtdatahash" xmlns:w16sdtfl="http://schemas.microsoft.com/office/word/2024/wordml/sdtformatlock" xmlns:w16se="http://schemas.microsoft.com/office/word/2015/wordml/symex" xmlns:wpg="http://schemas.microsoft.com/office/word/2010/wordprocessingGroup" xmlns:wpi="http://schemas.microsoft.com/office/word/2010/wordprocessingInk" xmlns:wne="http://schemas.microsoft.com/office/word/2006/wordml" xmlns:wps="http://schemas.microsoft.com/office/word/2010/wordprocessingShape" mc:Ignorable="w14 w15 w16se w16cid w16 w16cex w16sdtdh w16sdtfl w16du wp14">
   <w:sdt>
     <w:sdtPr>
       <w:id w:val="877209390"/>
@@ -9429,7 +9472,7 @@
 </file>
 
 <file path=word/numbering.xml><?xml version="1.0" encoding="utf-8"?>
-<w:numbering xmlns:wpc="http://schemas.microsoft.com/office/word/2010/wordprocessingCanvas" xmlns:cx="http://schemas.microsoft.com/office/drawing/2014/chartex" xmlns:cx1="http://schemas.microsoft.com/office/drawing/2015/9/8/chartex" xmlns:cx2="http://schemas.microsoft.com/office/drawing/2015/10/21/chartex" xmlns:cx3="http://schemas.microsoft.com/office/drawing/2016/5/9/chartex" xmlns:cx4="http://schemas.microsoft.com/office/drawing/2016/5/10/chartex" xmlns:cx5="http://schemas.microsoft.com/office/drawing/2016/5/11/chartex" xmlns:cx6="http://schemas.microsoft.com/office/drawing/2016/5/12/chartex" xmlns:cx7="http://schemas.microsoft.com/office/drawing/2016/5/13/chartex" xmlns:cx8="http://schemas.microsoft.com/office/drawing/2016/5/14/chartex" xmlns:mc="http://schemas.openxmlformats.org/markup-compatibility/2006" xmlns:aink="http://schemas.microsoft.com/office/drawing/2016/ink" xmlns:am3d="http://schemas.microsoft.com/office/drawing/2017/model3d" xmlns:o="urn:schemas-microsoft-com:office:office" xmlns:oel="http://schemas.microsoft.com/office/2019/extlst" xmlns:r="http://schemas.openxmlformats.org/officeDocument/2006/relationships" xmlns:m="http://schemas.openxmlformats.org/officeDocument/2006/math" xmlns:v="urn:schemas-microsoft-com:vml" xmlns:wp14="http://schemas.microsoft.com/office/word/2010/wordprocessingDrawing" xmlns:wp="http://schemas.openxmlformats.org/drawingml/2006/wordprocessingDrawing" xmlns:w10="urn:schemas-microsoft-com:office:word" xmlns:w="http://schemas.openxmlformats.org/wordprocessingml/2006/main" xmlns:w14="http://schemas.microsoft.com/office/word/2010/wordml" xmlns:w15="http://schemas.microsoft.com/office/word/2012/wordml" xmlns:w16cei="http://schemas.microsoft.com/office/word/2026/wordml/cei" xmlns:w16cex="http://schemas.microsoft.com/office/word/2018/wordml/cex" xmlns:w16cid="http://schemas.microsoft.com/office/word/2016/wordml/cid" xmlns:w16="http://schemas.microsoft.com/office/word/2018/wordml" xmlns:w16du="http://schemas.microsoft.com/office/word/2023/wordml/word16du" xmlns:w16sdtdh="http://schemas.microsoft.com/office/word/2020/wordml/sdtdatahash" xmlns:w16sdtfl="http://schemas.microsoft.com/office/word/2024/wordml/sdtformatlock" xmlns:w16se="http://schemas.microsoft.com/office/word/2015/wordml/symex" xmlns:wpg="http://schemas.microsoft.com/office/word/2010/wordprocessingGroup" xmlns:wpi="http://schemas.microsoft.com/office/word/2010/wordprocessingInk" xmlns:wne="http://schemas.microsoft.com/office/word/2006/wordml" xmlns:wps="http://schemas.microsoft.com/office/word/2010/wordprocessingShape" mc:Ignorable="w14 w15 w16se w16cid w16 w16cex w16sdtdh w16sdtfl w16du wp14">
+<w:numbering xmlns:wpc="http://schemas.microsoft.com/office/word/2010/wordprocessingCanvas" xmlns:cx="http://schemas.microsoft.com/office/drawing/2014/chartex" xmlns:cx1="http://schemas.microsoft.com/office/drawing/2015/9/8/chartex" xmlns:cx2="http://schemas.microsoft.com/office/drawing/2015/10/21/chartex" xmlns:cx3="http://schemas.microsoft.com/office/drawing/2016/5/9/chartex" xmlns:cx4="http://schemas.microsoft.com/office/drawing/2016/5/10/chartex" xmlns:cx5="http://schemas.microsoft.com/office/drawing/2016/5/11/chartex" xmlns:cx6="http://schemas.microsoft.com/office/drawing/2016/5/12/chartex" xmlns:cx7="http://schemas.microsoft.com/office/drawing/2016/5/13/chartex" xmlns:cx8="http://schemas.microsoft.com/office/drawing/2016/5/14/chartex" xmlns:mc="http://schemas.openxmlformats.org/markup-compatibility/2006" xmlns:aink="http://schemas.microsoft.com/office/drawing/2016/ink" xmlns:am3d="http://schemas.microsoft.com/office/drawing/2017/model3d" xmlns:o="urn:schemas-microsoft-com:office:office" xmlns:oel="http://schemas.microsoft.com/office/2019/extlst" xmlns:r="http://schemas.openxmlformats.org/officeDocument/2006/relationships" xmlns:m="http://schemas.openxmlformats.org/officeDocument/2006/math" xmlns:v="urn:schemas-microsoft-com:vml" xmlns:wp14="http://schemas.microsoft.com/office/word/2010/wordprocessingDrawing" xmlns:wp="http://schemas.openxmlformats.org/drawingml/2006/wordprocessingDrawing" xmlns:w10="urn:schemas-microsoft-com:office:word" xmlns:w="http://schemas.openxmlformats.org/wordprocessingml/2006/main" xmlns:w14="http://schemas.microsoft.com/office/word/2010/wordml" xmlns:w15="http://schemas.microsoft.com/office/word/2012/wordml" xmlns:w16cex="http://schemas.microsoft.com/office/word/2018/wordml/cex" xmlns:w16cid="http://schemas.microsoft.com/office/word/2016/wordml/cid" xmlns:w16="http://schemas.microsoft.com/office/word/2018/wordml" xmlns:w16du="http://schemas.microsoft.com/office/word/2023/wordml/word16du" xmlns:w16sdtdh="http://schemas.microsoft.com/office/word/2020/wordml/sdtdatahash" xmlns:w16sdtfl="http://schemas.microsoft.com/office/word/2024/wordml/sdtformatlock" xmlns:w16se="http://schemas.microsoft.com/office/word/2015/wordml/symex" xmlns:wpg="http://schemas.microsoft.com/office/word/2010/wordprocessingGroup" xmlns:wpi="http://schemas.microsoft.com/office/word/2010/wordprocessingInk" xmlns:wne="http://schemas.microsoft.com/office/word/2006/wordml" xmlns:wps="http://schemas.microsoft.com/office/word/2010/wordprocessingShape" mc:Ignorable="w14 w15 w16se w16cid w16 w16cex w16sdtdh w16sdtfl w16du wp14">
   <w:abstractNum w:abstractNumId="0" w15:restartNumberingAfterBreak="0">
     <w:nsid w:val="0353467D"/>
     <w:multiLevelType w:val="multilevel"/>
@@ -14604,6 +14647,7 @@
   <w:style w:type="character" w:default="1" w:styleId="Fontepargpadro">
     <w:name w:val="Default Paragraph Font"/>
     <w:uiPriority w:val="1"/>
+    <w:semiHidden/>
     <w:unhideWhenUsed/>
   </w:style>
   <w:style w:type="table" w:default="1" w:styleId="Tabelanormal">

</xml_diff>